<commit_message>
striked some lines in plan as done
</commit_message>
<xml_diff>
--- a/Daniel Broz - Ranking Large Language Models’ Knowledge in 26 Academic Fields - Timeline plan.docx
+++ b/Daniel Broz - Ranking Large Language Models’ Knowledge in 26 Academic Fields - Timeline plan.docx
@@ -107,7 +107,7 @@
       <w:pPr>
         <w:numPr>
           <w:ilvl w:val="0"/>
-          <w:numId w:val="16"/>
+          <w:numId w:val="8"/>
         </w:numPr>
         <w:spacing w:after="0" w:before="240" w:line="276" w:lineRule="auto"/>
         <w:ind w:left="720" w:hanging="360"/>
@@ -129,7 +129,7 @@
       <w:pPr>
         <w:numPr>
           <w:ilvl w:val="0"/>
-          <w:numId w:val="16"/>
+          <w:numId w:val="8"/>
         </w:numPr>
         <w:spacing w:after="0" w:before="0" w:line="276" w:lineRule="auto"/>
         <w:ind w:left="720" w:hanging="360"/>
@@ -152,19 +152,21 @@
         <w:pStyle w:val="Heading5"/>
         <w:numPr>
           <w:ilvl w:val="0"/>
-          <w:numId w:val="16"/>
+          <w:numId w:val="8"/>
         </w:numPr>
         <w:spacing w:after="240" w:line="276" w:lineRule="auto"/>
         <w:ind w:left="720" w:hanging="360"/>
         <w:rPr>
           <w:b w:val="0"/>
-        </w:rPr>
-      </w:pPr>
-      <w:bookmarkStart w:colFirst="0" w:colLast="0" w:name="_8fh9abjb2hs9" w:id="0"/>
+          <w:strike w:val="1"/>
+        </w:rPr>
+      </w:pPr>
+      <w:bookmarkStart w:colFirst="0" w:colLast="0" w:name="_ciwuotxyvm7" w:id="0"/>
       <w:bookmarkEnd w:id="0"/>
       <w:r>
         <w:rPr>
           <w:b w:val="0"/>
+          <w:strike w:val="1"/>
           <w:rtl w:val="0"/>
         </w:rPr>
         <w:t xml:space="preserve">Complete preliminary IRB/ARB requirements.</w:t>
@@ -191,7 +193,7 @@
       <w:pPr>
         <w:numPr>
           <w:ilvl w:val="0"/>
-          <w:numId w:val="15"/>
+          <w:numId w:val="7"/>
         </w:numPr>
         <w:spacing w:after="0" w:before="240" w:line="276" w:lineRule="auto"/>
         <w:ind w:left="720" w:hanging="360"/>
@@ -211,7 +213,7 @@
       <w:pPr>
         <w:numPr>
           <w:ilvl w:val="0"/>
-          <w:numId w:val="15"/>
+          <w:numId w:val="7"/>
         </w:numPr>
         <w:spacing w:after="0" w:before="0" w:line="276" w:lineRule="auto"/>
         <w:ind w:left="720" w:hanging="360"/>
@@ -231,7 +233,7 @@
       <w:pPr>
         <w:numPr>
           <w:ilvl w:val="0"/>
-          <w:numId w:val="15"/>
+          <w:numId w:val="7"/>
         </w:numPr>
         <w:spacing w:after="240" w:before="0" w:line="276" w:lineRule="auto"/>
         <w:ind w:left="720" w:hanging="360"/>
@@ -268,7 +270,7 @@
       <w:pPr>
         <w:numPr>
           <w:ilvl w:val="0"/>
-          <w:numId w:val="13"/>
+          <w:numId w:val="5"/>
         </w:numPr>
         <w:spacing w:after="0" w:before="240" w:line="276" w:lineRule="auto"/>
         <w:ind w:left="720" w:hanging="360"/>
@@ -288,7 +290,7 @@
       <w:pPr>
         <w:numPr>
           <w:ilvl w:val="0"/>
-          <w:numId w:val="13"/>
+          <w:numId w:val="5"/>
         </w:numPr>
         <w:spacing w:after="0" w:before="0" w:line="276" w:lineRule="auto"/>
         <w:ind w:left="720" w:hanging="360"/>
@@ -308,7 +310,7 @@
       <w:pPr>
         <w:numPr>
           <w:ilvl w:val="0"/>
-          <w:numId w:val="13"/>
+          <w:numId w:val="5"/>
         </w:numPr>
         <w:spacing w:after="240" w:before="0" w:line="276" w:lineRule="auto"/>
         <w:ind w:left="720" w:hanging="360"/>
@@ -345,7 +347,7 @@
       <w:pPr>
         <w:numPr>
           <w:ilvl w:val="0"/>
-          <w:numId w:val="26"/>
+          <w:numId w:val="19"/>
         </w:numPr>
         <w:spacing w:after="0" w:before="240" w:line="276" w:lineRule="auto"/>
         <w:ind w:left="720" w:hanging="360"/>
@@ -365,7 +367,7 @@
       <w:pPr>
         <w:numPr>
           <w:ilvl w:val="0"/>
-          <w:numId w:val="26"/>
+          <w:numId w:val="19"/>
         </w:numPr>
         <w:spacing w:after="0" w:before="0" w:line="276" w:lineRule="auto"/>
         <w:ind w:left="720" w:hanging="360"/>
@@ -385,7 +387,7 @@
       <w:pPr>
         <w:numPr>
           <w:ilvl w:val="0"/>
-          <w:numId w:val="26"/>
+          <w:numId w:val="19"/>
         </w:numPr>
         <w:spacing w:after="240" w:before="0" w:line="276" w:lineRule="auto"/>
         <w:ind w:left="720" w:hanging="360"/>
@@ -537,7 +539,7 @@
           <w:szCs w:val="34"/>
         </w:rPr>
       </w:pPr>
-      <w:bookmarkStart w:colFirst="0" w:colLast="0" w:name="_51ftgjrw8i75" w:id="1"/>
+      <w:bookmarkStart w:colFirst="0" w:colLast="0" w:name="_i9ddh45rojmw" w:id="1"/>
       <w:bookmarkEnd w:id="1"/>
       <w:r>
         <w:rPr>
@@ -596,7 +598,7 @@
           <w:szCs w:val="26"/>
         </w:rPr>
       </w:pPr>
-      <w:bookmarkStart w:colFirst="0" w:colLast="0" w:name="_3zdafag0i215" w:id="2"/>
+      <w:bookmarkStart w:colFirst="0" w:colLast="0" w:name="_wih3fb5yi3t0" w:id="2"/>
       <w:bookmarkEnd w:id="2"/>
       <w:r>
         <w:rPr>
@@ -614,194 +616,208 @@
         <w:rPr>
           <w:rFonts w:ascii="Arial" w:cs="Arial" w:eastAsia="Arial" w:hAnsi="Arial"/>
           <w:b w:val="1"/>
+        </w:rPr>
+      </w:pPr>
+      <w:r>
+        <w:rPr>
+          <w:rFonts w:ascii="Arial" w:cs="Arial" w:eastAsia="Arial" w:hAnsi="Arial"/>
+          <w:b w:val="1"/>
+          <w:rtl w:val="0"/>
+        </w:rPr>
+        <w:t xml:space="preserve">Tasks</w:t>
+      </w:r>
+    </w:p>
+    <w:p>
+      <w:pPr>
+        <w:numPr>
+          <w:ilvl w:val="0"/>
+          <w:numId w:val="6"/>
+        </w:numPr>
+        <w:spacing w:after="0" w:before="240" w:line="276" w:lineRule="auto"/>
+        <w:ind w:left="720" w:hanging="360"/>
+        <w:rPr>
+          <w:rFonts w:ascii="Arial" w:cs="Arial" w:eastAsia="Arial" w:hAnsi="Arial"/>
           <w:strike w:val="1"/>
         </w:rPr>
       </w:pPr>
       <w:r>
         <w:rPr>
           <w:rFonts w:ascii="Arial" w:cs="Arial" w:eastAsia="Arial" w:hAnsi="Arial"/>
+          <w:strike w:val="1"/>
+          <w:rtl w:val="0"/>
+        </w:rPr>
+        <w:t xml:space="preserve">Confirm ARB approval (or finalize any remaining details).</w:t>
+      </w:r>
+    </w:p>
+    <w:p>
+      <w:pPr>
+        <w:numPr>
+          <w:ilvl w:val="0"/>
+          <w:numId w:val="6"/>
+        </w:numPr>
+        <w:spacing w:after="0" w:before="0" w:line="276" w:lineRule="auto"/>
+        <w:ind w:left="720" w:hanging="360"/>
+        <w:rPr>
+          <w:rFonts w:ascii="Arial" w:cs="Arial" w:eastAsia="Arial" w:hAnsi="Arial"/>
+          <w:strike w:val="1"/>
+        </w:rPr>
+      </w:pPr>
+      <w:r>
+        <w:rPr>
+          <w:rFonts w:ascii="Arial" w:cs="Arial" w:eastAsia="Arial" w:hAnsi="Arial"/>
+          <w:strike w:val="1"/>
+          <w:rtl w:val="0"/>
+        </w:rPr>
+        <w:t xml:space="preserve">Create a dissertation draft template with proper formatting.</w:t>
+      </w:r>
+    </w:p>
+    <w:p>
+      <w:pPr>
+        <w:numPr>
+          <w:ilvl w:val="0"/>
+          <w:numId w:val="6"/>
+        </w:numPr>
+        <w:spacing w:after="0" w:before="0" w:line="276" w:lineRule="auto"/>
+        <w:ind w:left="720" w:hanging="360"/>
+        <w:rPr>
+          <w:rFonts w:ascii="Arial" w:cs="Arial" w:eastAsia="Arial" w:hAnsi="Arial"/>
+          <w:strike w:val="1"/>
+        </w:rPr>
+      </w:pPr>
+      <w:r>
+        <w:rPr>
+          <w:rFonts w:ascii="Arial" w:cs="Arial" w:eastAsia="Arial" w:hAnsi="Arial"/>
+          <w:strike w:val="1"/>
+          <w:rtl w:val="0"/>
+        </w:rPr>
+        <w:t xml:space="preserve">Begin Chapter 1: Introduction.</w:t>
+      </w:r>
+    </w:p>
+    <w:p>
+      <w:pPr>
+        <w:numPr>
+          <w:ilvl w:val="0"/>
+          <w:numId w:val="6"/>
+        </w:numPr>
+        <w:spacing w:after="0" w:before="0" w:line="276" w:lineRule="auto"/>
+        <w:ind w:left="720" w:hanging="360"/>
+        <w:rPr>
+          <w:rFonts w:ascii="Arial" w:cs="Arial" w:eastAsia="Arial" w:hAnsi="Arial"/>
+          <w:strike w:val="1"/>
+        </w:rPr>
+      </w:pPr>
+      <w:r>
+        <w:rPr>
+          <w:rFonts w:ascii="Arial" w:cs="Arial" w:eastAsia="Arial" w:hAnsi="Arial"/>
+          <w:strike w:val="1"/>
+          <w:rtl w:val="0"/>
+        </w:rPr>
+        <w:t xml:space="preserve">Refine the Problem Statement, Purpose, and Significance (aligns with your ARB form).</w:t>
+      </w:r>
+    </w:p>
+    <w:p>
+      <w:pPr>
+        <w:spacing w:after="240" w:before="240" w:line="276" w:lineRule="auto"/>
+        <w:rPr>
+          <w:rFonts w:ascii="Arial" w:cs="Arial" w:eastAsia="Arial" w:hAnsi="Arial"/>
           <w:b w:val="1"/>
+        </w:rPr>
+      </w:pPr>
+      <w:r>
+        <w:rPr>
+          <w:rFonts w:ascii="Arial" w:cs="Arial" w:eastAsia="Arial" w:hAnsi="Arial"/>
+          <w:b w:val="1"/>
+          <w:rtl w:val="0"/>
+        </w:rPr>
+        <w:t xml:space="preserve">Milestones</w:t>
+      </w:r>
+    </w:p>
+    <w:p>
+      <w:pPr>
+        <w:numPr>
+          <w:ilvl w:val="0"/>
+          <w:numId w:val="13"/>
+        </w:numPr>
+        <w:spacing w:after="0" w:before="240" w:line="276" w:lineRule="auto"/>
+        <w:ind w:left="720" w:hanging="360"/>
+        <w:rPr>
+          <w:rFonts w:ascii="Arial" w:cs="Arial" w:eastAsia="Arial" w:hAnsi="Arial"/>
           <w:strike w:val="1"/>
-          <w:rtl w:val="0"/>
-        </w:rPr>
-        <w:t xml:space="preserve">Tasks</w:t>
-      </w:r>
-    </w:p>
-    <w:p>
-      <w:pPr>
-        <w:numPr>
-          <w:ilvl w:val="0"/>
-          <w:numId w:val="14"/>
-        </w:numPr>
-        <w:spacing w:after="0" w:before="240" w:line="276" w:lineRule="auto"/>
-        <w:ind w:left="720" w:hanging="360"/>
-        <w:rPr>
-          <w:rFonts w:ascii="Arial" w:cs="Arial" w:eastAsia="Arial" w:hAnsi="Arial"/>
-        </w:rPr>
-      </w:pPr>
-      <w:r>
-        <w:rPr>
-          <w:rFonts w:ascii="Arial" w:cs="Arial" w:eastAsia="Arial" w:hAnsi="Arial"/>
-          <w:rtl w:val="0"/>
-        </w:rPr>
-        <w:t xml:space="preserve">Confirm ARB approval (or finalize any remaining details).</w:t>
-      </w:r>
-    </w:p>
-    <w:p>
-      <w:pPr>
-        <w:numPr>
-          <w:ilvl w:val="0"/>
-          <w:numId w:val="14"/>
-        </w:numPr>
-        <w:spacing w:after="0" w:before="0" w:line="276" w:lineRule="auto"/>
-        <w:ind w:left="720" w:hanging="360"/>
-        <w:rPr>
-          <w:rFonts w:ascii="Arial" w:cs="Arial" w:eastAsia="Arial" w:hAnsi="Arial"/>
-        </w:rPr>
-      </w:pPr>
-      <w:r>
-        <w:rPr>
-          <w:rFonts w:ascii="Arial" w:cs="Arial" w:eastAsia="Arial" w:hAnsi="Arial"/>
-          <w:rtl w:val="0"/>
-        </w:rPr>
-        <w:t xml:space="preserve">Create a dissertation draft template with proper formatting.</w:t>
-      </w:r>
-    </w:p>
-    <w:p>
-      <w:pPr>
-        <w:numPr>
-          <w:ilvl w:val="0"/>
-          <w:numId w:val="14"/>
-        </w:numPr>
-        <w:spacing w:after="0" w:before="0" w:line="276" w:lineRule="auto"/>
-        <w:ind w:left="720" w:hanging="360"/>
-        <w:rPr>
-          <w:rFonts w:ascii="Arial" w:cs="Arial" w:eastAsia="Arial" w:hAnsi="Arial"/>
-        </w:rPr>
-      </w:pPr>
-      <w:r>
-        <w:rPr>
-          <w:rFonts w:ascii="Arial" w:cs="Arial" w:eastAsia="Arial" w:hAnsi="Arial"/>
-          <w:rtl w:val="0"/>
-        </w:rPr>
-        <w:t xml:space="preserve">Begin Chapter 1: Introduction.</w:t>
-      </w:r>
-    </w:p>
-    <w:p>
-      <w:pPr>
-        <w:numPr>
-          <w:ilvl w:val="0"/>
-          <w:numId w:val="14"/>
-        </w:numPr>
-        <w:spacing w:after="0" w:before="0" w:line="276" w:lineRule="auto"/>
-        <w:ind w:left="720" w:hanging="360"/>
+        </w:rPr>
+      </w:pPr>
+      <w:r>
         <w:rPr>
           <w:rFonts w:ascii="Arial" w:cs="Arial" w:eastAsia="Arial" w:hAnsi="Arial"/>
           <w:strike w:val="1"/>
-        </w:rPr>
-      </w:pPr>
-      <w:r>
+          <w:rtl w:val="0"/>
+        </w:rPr>
+        <w:t xml:space="preserve">ARB was officially approved.</w:t>
+      </w:r>
+    </w:p>
+    <w:p>
+      <w:pPr>
+        <w:spacing w:after="240" w:before="240" w:line="276" w:lineRule="auto"/>
+        <w:rPr>
+          <w:rFonts w:ascii="Arial" w:cs="Arial" w:eastAsia="Arial" w:hAnsi="Arial"/>
+          <w:b w:val="1"/>
+        </w:rPr>
+      </w:pPr>
+      <w:r>
+        <w:rPr>
+          <w:rFonts w:ascii="Arial" w:cs="Arial" w:eastAsia="Arial" w:hAnsi="Arial"/>
+          <w:b w:val="1"/>
+          <w:rtl w:val="0"/>
+        </w:rPr>
+        <w:t xml:space="preserve">Notes</w:t>
+      </w:r>
+    </w:p>
+    <w:p>
+      <w:pPr>
+        <w:numPr>
+          <w:ilvl w:val="0"/>
+          <w:numId w:val="38"/>
+        </w:numPr>
+        <w:spacing w:after="240" w:before="240" w:line="276" w:lineRule="auto"/>
+        <w:ind w:left="720" w:hanging="360"/>
         <w:rPr>
           <w:rFonts w:ascii="Arial" w:cs="Arial" w:eastAsia="Arial" w:hAnsi="Arial"/>
           <w:strike w:val="1"/>
-          <w:rtl w:val="0"/>
-        </w:rPr>
-        <w:t xml:space="preserve">Refine the Problem Statement, Purpose, and Significance (aligns with your ARB form).</w:t>
-      </w:r>
-    </w:p>
-    <w:p>
-      <w:pPr>
+        </w:rPr>
+      </w:pPr>
+      <w:r>
+        <w:rPr>
+          <w:rFonts w:ascii="Arial" w:cs="Arial" w:eastAsia="Arial" w:hAnsi="Arial"/>
+          <w:strike w:val="1"/>
+          <w:rtl w:val="0"/>
+        </w:rPr>
+        <w:t xml:space="preserve">Align tasks with your initial Phase One goal of collecting domain materials.</w:t>
+      </w:r>
+    </w:p>
+    <w:p>
+      <w:pPr>
+        <w:numPr>
+          <w:ilvl w:val="0"/>
+          <w:numId w:val="38"/>
+        </w:numPr>
         <w:spacing w:after="240" w:before="240" w:line="276" w:lineRule="auto"/>
-        <w:rPr>
-          <w:rFonts w:ascii="Arial" w:cs="Arial" w:eastAsia="Arial" w:hAnsi="Arial"/>
-          <w:b w:val="1"/>
-        </w:rPr>
-      </w:pPr>
-      <w:r>
-        <w:rPr>
-          <w:rFonts w:ascii="Arial" w:cs="Arial" w:eastAsia="Arial" w:hAnsi="Arial"/>
-          <w:b w:val="1"/>
-          <w:rtl w:val="0"/>
-        </w:rPr>
-        <w:t xml:space="preserve">Milestones</w:t>
-      </w:r>
-    </w:p>
-    <w:p>
-      <w:pPr>
-        <w:numPr>
-          <w:ilvl w:val="0"/>
-          <w:numId w:val="20"/>
-        </w:numPr>
-        <w:spacing w:after="0" w:before="240" w:line="276" w:lineRule="auto"/>
-        <w:ind w:left="720" w:hanging="360"/>
-        <w:rPr>
-          <w:rFonts w:ascii="Arial" w:cs="Arial" w:eastAsia="Arial" w:hAnsi="Arial"/>
-        </w:rPr>
-      </w:pPr>
-      <w:r>
-        <w:rPr>
-          <w:rFonts w:ascii="Arial" w:cs="Arial" w:eastAsia="Arial" w:hAnsi="Arial"/>
-          <w:rtl w:val="0"/>
-        </w:rPr>
-        <w:t xml:space="preserve">ARB was officially approved.</w:t>
-      </w:r>
-    </w:p>
-    <w:p>
-      <w:pPr>
-        <w:spacing w:after="240" w:before="240" w:line="276" w:lineRule="auto"/>
-        <w:rPr>
-          <w:rFonts w:ascii="Arial" w:cs="Arial" w:eastAsia="Arial" w:hAnsi="Arial"/>
-          <w:b w:val="1"/>
-        </w:rPr>
-      </w:pPr>
-      <w:r>
-        <w:rPr>
-          <w:rFonts w:ascii="Arial" w:cs="Arial" w:eastAsia="Arial" w:hAnsi="Arial"/>
-          <w:b w:val="1"/>
-          <w:rtl w:val="0"/>
-        </w:rPr>
-        <w:t xml:space="preserve">Notes</w:t>
-      </w:r>
-    </w:p>
-    <w:p>
-      <w:pPr>
-        <w:numPr>
-          <w:ilvl w:val="0"/>
-          <w:numId w:val="9"/>
-        </w:numPr>
-        <w:spacing w:after="240" w:before="240" w:line="276" w:lineRule="auto"/>
-        <w:ind w:left="720" w:hanging="360"/>
-        <w:rPr>
-          <w:rFonts w:ascii="Arial" w:cs="Arial" w:eastAsia="Arial" w:hAnsi="Arial"/>
-        </w:rPr>
-      </w:pPr>
-      <w:r>
-        <w:rPr>
-          <w:rFonts w:ascii="Arial" w:cs="Arial" w:eastAsia="Arial" w:hAnsi="Arial"/>
-          <w:rtl w:val="0"/>
-        </w:rPr>
-        <w:t xml:space="preserve">Align tasks with your initial Phase One goal of collecting domain materials.</w:t>
-      </w:r>
-    </w:p>
-    <w:p>
-      <w:pPr>
-        <w:numPr>
-          <w:ilvl w:val="0"/>
-          <w:numId w:val="9"/>
-        </w:numPr>
-        <w:spacing w:after="240" w:before="240" w:line="276" w:lineRule="auto"/>
-        <w:ind w:left="720" w:hanging="360"/>
-        <w:rPr>
-          <w:rFonts w:ascii="Arial" w:cs="Arial" w:eastAsia="Arial" w:hAnsi="Arial"/>
-          <w:u w:val="none"/>
-        </w:rPr>
-      </w:pPr>
-      <w:r>
-        <w:rPr>
-          <w:rFonts w:ascii="Arial" w:cs="Arial" w:eastAsia="Arial" w:hAnsi="Arial"/>
+        <w:ind w:left="720" w:hanging="360"/>
+        <w:rPr>
+          <w:rFonts w:ascii="Arial" w:cs="Arial" w:eastAsia="Arial" w:hAnsi="Arial"/>
+          <w:strike w:val="1"/>
+        </w:rPr>
+      </w:pPr>
+      <w:r>
+        <w:rPr>
+          <w:rFonts w:ascii="Arial" w:cs="Arial" w:eastAsia="Arial" w:hAnsi="Arial"/>
+          <w:strike w:val="1"/>
           <w:rtl w:val="0"/>
         </w:rPr>
         <w:t xml:space="preserve">Redefining research questions as requested by ARB</w:t>
+      </w:r>
+      <w:r>
+        <w:rPr>
+          <w:rtl w:val="0"/>
+        </w:rPr>
       </w:r>
     </w:p>
     <w:p>
@@ -836,7 +852,7 @@
           <w:szCs w:val="26"/>
         </w:rPr>
       </w:pPr>
-      <w:bookmarkStart w:colFirst="0" w:colLast="0" w:name="_w8wmlgr7ut6k" w:id="3"/>
+      <w:bookmarkStart w:colFirst="0" w:colLast="0" w:name="_thaih2jkmte6" w:id="3"/>
       <w:bookmarkEnd w:id="3"/>
       <w:r>
         <w:rPr>
@@ -869,7 +885,7 @@
       <w:pPr>
         <w:numPr>
           <w:ilvl w:val="0"/>
-          <w:numId w:val="37"/>
+          <w:numId w:val="31"/>
         </w:numPr>
         <w:spacing w:after="0" w:before="240" w:line="276" w:lineRule="auto"/>
         <w:ind w:left="720" w:hanging="360"/>
@@ -889,7 +905,7 @@
       <w:pPr>
         <w:numPr>
           <w:ilvl w:val="0"/>
-          <w:numId w:val="37"/>
+          <w:numId w:val="31"/>
         </w:numPr>
         <w:spacing w:after="0" w:before="0" w:line="276" w:lineRule="auto"/>
         <w:ind w:left="720" w:hanging="360"/>
@@ -911,7 +927,7 @@
       <w:pPr>
         <w:numPr>
           <w:ilvl w:val="0"/>
-          <w:numId w:val="37"/>
+          <w:numId w:val="31"/>
         </w:numPr>
         <w:spacing w:after="0" w:before="0" w:line="276" w:lineRule="auto"/>
         <w:ind w:left="720" w:hanging="360"/>
@@ -933,7 +949,7 @@
       <w:pPr>
         <w:numPr>
           <w:ilvl w:val="0"/>
-          <w:numId w:val="37"/>
+          <w:numId w:val="31"/>
         </w:numPr>
         <w:spacing w:after="240" w:before="0" w:line="276" w:lineRule="auto"/>
         <w:ind w:left="720" w:hanging="360"/>
@@ -972,17 +988,19 @@
       <w:pPr>
         <w:numPr>
           <w:ilvl w:val="0"/>
-          <w:numId w:val="6"/>
+          <w:numId w:val="35"/>
         </w:numPr>
         <w:spacing w:after="0" w:before="240" w:line="276" w:lineRule="auto"/>
         <w:ind w:left="720" w:hanging="360"/>
         <w:rPr>
           <w:rFonts w:ascii="Arial" w:cs="Arial" w:eastAsia="Arial" w:hAnsi="Arial"/>
-        </w:rPr>
-      </w:pPr>
-      <w:r>
-        <w:rPr>
-          <w:rFonts w:ascii="Arial" w:cs="Arial" w:eastAsia="Arial" w:hAnsi="Arial"/>
+          <w:strike w:val="1"/>
+        </w:rPr>
+      </w:pPr>
+      <w:r>
+        <w:rPr>
+          <w:rFonts w:ascii="Arial" w:cs="Arial" w:eastAsia="Arial" w:hAnsi="Arial"/>
+          <w:strike w:val="1"/>
           <w:rtl w:val="0"/>
         </w:rPr>
         <w:t xml:space="preserve">Chapter 1 updated draft.</w:t>
@@ -992,17 +1010,19 @@
       <w:pPr>
         <w:numPr>
           <w:ilvl w:val="0"/>
-          <w:numId w:val="6"/>
+          <w:numId w:val="35"/>
         </w:numPr>
         <w:spacing w:after="240" w:before="0" w:line="276" w:lineRule="auto"/>
         <w:ind w:left="720" w:hanging="360"/>
         <w:rPr>
           <w:rFonts w:ascii="Arial" w:cs="Arial" w:eastAsia="Arial" w:hAnsi="Arial"/>
-        </w:rPr>
-      </w:pPr>
-      <w:r>
-        <w:rPr>
-          <w:rFonts w:ascii="Arial" w:cs="Arial" w:eastAsia="Arial" w:hAnsi="Arial"/>
+          <w:strike w:val="1"/>
+        </w:rPr>
+      </w:pPr>
+      <w:r>
+        <w:rPr>
+          <w:rFonts w:ascii="Arial" w:cs="Arial" w:eastAsia="Arial" w:hAnsi="Arial"/>
+          <w:strike w:val="1"/>
           <w:rtl w:val="0"/>
         </w:rPr>
         <w:t xml:space="preserve">The initial set of curated abstracts across at least half of the fields.</w:t>
@@ -1040,7 +1060,7 @@
           <w:szCs w:val="26"/>
         </w:rPr>
       </w:pPr>
-      <w:bookmarkStart w:colFirst="0" w:colLast="0" w:name="_jobb6g93mbsr" w:id="4"/>
+      <w:bookmarkStart w:colFirst="0" w:colLast="0" w:name="_m67c9ugthtm1" w:id="4"/>
       <w:bookmarkEnd w:id="4"/>
       <w:r>
         <w:rPr>
@@ -1073,7 +1093,7 @@
       <w:pPr>
         <w:numPr>
           <w:ilvl w:val="0"/>
-          <w:numId w:val="32"/>
+          <w:numId w:val="26"/>
         </w:numPr>
         <w:spacing w:after="0" w:before="240" w:line="276" w:lineRule="auto"/>
         <w:ind w:left="720" w:hanging="360"/>
@@ -1093,7 +1113,7 @@
       <w:pPr>
         <w:numPr>
           <w:ilvl w:val="0"/>
-          <w:numId w:val="32"/>
+          <w:numId w:val="26"/>
         </w:numPr>
         <w:spacing w:after="0" w:before="0" w:line="276" w:lineRule="auto"/>
         <w:ind w:left="720" w:hanging="360"/>
@@ -1113,7 +1133,7 @@
       <w:pPr>
         <w:numPr>
           <w:ilvl w:val="0"/>
-          <w:numId w:val="32"/>
+          <w:numId w:val="26"/>
         </w:numPr>
         <w:spacing w:after="0" w:before="0" w:line="276" w:lineRule="auto"/>
         <w:ind w:left="720" w:hanging="360"/>
@@ -1133,7 +1153,7 @@
       <w:pPr>
         <w:numPr>
           <w:ilvl w:val="0"/>
-          <w:numId w:val="32"/>
+          <w:numId w:val="26"/>
         </w:numPr>
         <w:spacing w:after="240" w:before="0" w:line="276" w:lineRule="auto"/>
         <w:ind w:left="720" w:hanging="360"/>
@@ -1170,7 +1190,7 @@
       <w:pPr>
         <w:numPr>
           <w:ilvl w:val="0"/>
-          <w:numId w:val="7"/>
+          <w:numId w:val="36"/>
         </w:numPr>
         <w:spacing w:after="0" w:before="240" w:line="276" w:lineRule="auto"/>
         <w:ind w:left="720" w:hanging="360"/>
@@ -1190,7 +1210,7 @@
       <w:pPr>
         <w:numPr>
           <w:ilvl w:val="0"/>
-          <w:numId w:val="7"/>
+          <w:numId w:val="36"/>
         </w:numPr>
         <w:spacing w:after="240" w:before="0" w:line="276" w:lineRule="auto"/>
         <w:ind w:left="720" w:hanging="360"/>
@@ -1238,7 +1258,7 @@
           <w:szCs w:val="26"/>
         </w:rPr>
       </w:pPr>
-      <w:bookmarkStart w:colFirst="0" w:colLast="0" w:name="_2f43m830i5fv" w:id="5"/>
+      <w:bookmarkStart w:colFirst="0" w:colLast="0" w:name="_msm4wl58p2rt" w:id="5"/>
       <w:bookmarkEnd w:id="5"/>
       <w:r>
         <w:rPr>
@@ -1271,7 +1291,7 @@
       <w:pPr>
         <w:numPr>
           <w:ilvl w:val="0"/>
-          <w:numId w:val="25"/>
+          <w:numId w:val="18"/>
         </w:numPr>
         <w:spacing w:after="0" w:before="240" w:line="276" w:lineRule="auto"/>
         <w:ind w:left="720" w:hanging="360"/>
@@ -1291,7 +1311,7 @@
       <w:pPr>
         <w:numPr>
           <w:ilvl w:val="0"/>
-          <w:numId w:val="25"/>
+          <w:numId w:val="18"/>
         </w:numPr>
         <w:spacing w:after="0" w:before="0" w:line="276" w:lineRule="auto"/>
         <w:ind w:left="720" w:hanging="360"/>
@@ -1311,7 +1331,7 @@
       <w:pPr>
         <w:numPr>
           <w:ilvl w:val="0"/>
-          <w:numId w:val="25"/>
+          <w:numId w:val="18"/>
         </w:numPr>
         <w:spacing w:after="240" w:before="0" w:line="276" w:lineRule="auto"/>
         <w:ind w:left="720" w:hanging="360"/>
@@ -1348,7 +1368,7 @@
       <w:pPr>
         <w:numPr>
           <w:ilvl w:val="0"/>
-          <w:numId w:val="27"/>
+          <w:numId w:val="20"/>
         </w:numPr>
         <w:spacing w:after="0" w:before="240" w:line="276" w:lineRule="auto"/>
         <w:ind w:left="720" w:hanging="360"/>
@@ -1368,7 +1388,7 @@
       <w:pPr>
         <w:numPr>
           <w:ilvl w:val="0"/>
-          <w:numId w:val="27"/>
+          <w:numId w:val="20"/>
         </w:numPr>
         <w:spacing w:after="240" w:before="0" w:line="276" w:lineRule="auto"/>
         <w:ind w:left="720" w:hanging="360"/>
@@ -1416,7 +1436,7 @@
           <w:szCs w:val="26"/>
         </w:rPr>
       </w:pPr>
-      <w:bookmarkStart w:colFirst="0" w:colLast="0" w:name="_ymr5zp2m2tku" w:id="6"/>
+      <w:bookmarkStart w:colFirst="0" w:colLast="0" w:name="_991a50sw8fqj" w:id="6"/>
       <w:bookmarkEnd w:id="6"/>
       <w:r>
         <w:rPr>
@@ -1449,7 +1469,7 @@
       <w:pPr>
         <w:numPr>
           <w:ilvl w:val="0"/>
-          <w:numId w:val="28"/>
+          <w:numId w:val="21"/>
         </w:numPr>
         <w:spacing w:after="0" w:before="240" w:line="276" w:lineRule="auto"/>
         <w:ind w:left="720" w:hanging="360"/>
@@ -1469,7 +1489,7 @@
       <w:pPr>
         <w:numPr>
           <w:ilvl w:val="0"/>
-          <w:numId w:val="28"/>
+          <w:numId w:val="21"/>
         </w:numPr>
         <w:spacing w:after="0" w:before="0" w:line="276" w:lineRule="auto"/>
         <w:ind w:left="720" w:hanging="360"/>
@@ -1489,7 +1509,7 @@
       <w:pPr>
         <w:numPr>
           <w:ilvl w:val="0"/>
-          <w:numId w:val="28"/>
+          <w:numId w:val="21"/>
         </w:numPr>
         <w:spacing w:after="0" w:before="0" w:line="276" w:lineRule="auto"/>
         <w:ind w:left="720" w:hanging="360"/>
@@ -1509,7 +1529,7 @@
       <w:pPr>
         <w:numPr>
           <w:ilvl w:val="0"/>
-          <w:numId w:val="28"/>
+          <w:numId w:val="21"/>
         </w:numPr>
         <w:spacing w:after="240" w:before="0" w:line="276" w:lineRule="auto"/>
         <w:ind w:left="720" w:hanging="360"/>
@@ -1546,7 +1566,7 @@
       <w:pPr>
         <w:numPr>
           <w:ilvl w:val="0"/>
-          <w:numId w:val="17"/>
+          <w:numId w:val="9"/>
         </w:numPr>
         <w:spacing w:after="0" w:before="240" w:line="276" w:lineRule="auto"/>
         <w:ind w:left="720" w:hanging="360"/>
@@ -1566,7 +1586,7 @@
       <w:pPr>
         <w:numPr>
           <w:ilvl w:val="0"/>
-          <w:numId w:val="17"/>
+          <w:numId w:val="9"/>
         </w:numPr>
         <w:spacing w:after="240" w:before="0" w:line="276" w:lineRule="auto"/>
         <w:ind w:left="720" w:hanging="360"/>
@@ -1614,7 +1634,7 @@
           <w:szCs w:val="26"/>
         </w:rPr>
       </w:pPr>
-      <w:bookmarkStart w:colFirst="0" w:colLast="0" w:name="_m58k1o900y" w:id="7"/>
+      <w:bookmarkStart w:colFirst="0" w:colLast="0" w:name="_db70a1ebr3vo" w:id="7"/>
       <w:bookmarkEnd w:id="7"/>
       <w:r>
         <w:rPr>
@@ -1647,7 +1667,7 @@
       <w:pPr>
         <w:numPr>
           <w:ilvl w:val="0"/>
-          <w:numId w:val="22"/>
+          <w:numId w:val="15"/>
         </w:numPr>
         <w:spacing w:after="0" w:before="240" w:line="276" w:lineRule="auto"/>
         <w:ind w:left="720" w:hanging="360"/>
@@ -1667,7 +1687,7 @@
       <w:pPr>
         <w:numPr>
           <w:ilvl w:val="0"/>
-          <w:numId w:val="22"/>
+          <w:numId w:val="15"/>
         </w:numPr>
         <w:spacing w:after="0" w:before="0" w:line="276" w:lineRule="auto"/>
         <w:ind w:left="720" w:hanging="360"/>
@@ -1687,7 +1707,7 @@
       <w:pPr>
         <w:numPr>
           <w:ilvl w:val="0"/>
-          <w:numId w:val="22"/>
+          <w:numId w:val="15"/>
         </w:numPr>
         <w:spacing w:after="0" w:before="0" w:line="276" w:lineRule="auto"/>
         <w:ind w:left="720" w:hanging="360"/>
@@ -1707,7 +1727,7 @@
       <w:pPr>
         <w:numPr>
           <w:ilvl w:val="0"/>
-          <w:numId w:val="22"/>
+          <w:numId w:val="15"/>
         </w:numPr>
         <w:spacing w:after="240" w:before="0" w:line="276" w:lineRule="auto"/>
         <w:ind w:left="720" w:hanging="360"/>
@@ -1744,7 +1764,7 @@
       <w:pPr>
         <w:numPr>
           <w:ilvl w:val="0"/>
-          <w:numId w:val="30"/>
+          <w:numId w:val="24"/>
         </w:numPr>
         <w:spacing w:after="0" w:before="240" w:line="276" w:lineRule="auto"/>
         <w:ind w:left="720" w:hanging="360"/>
@@ -1764,7 +1784,7 @@
       <w:pPr>
         <w:numPr>
           <w:ilvl w:val="0"/>
-          <w:numId w:val="30"/>
+          <w:numId w:val="24"/>
         </w:numPr>
         <w:spacing w:after="240" w:before="0" w:line="276" w:lineRule="auto"/>
         <w:ind w:left="720" w:hanging="360"/>
@@ -1812,7 +1832,7 @@
           <w:szCs w:val="26"/>
         </w:rPr>
       </w:pPr>
-      <w:bookmarkStart w:colFirst="0" w:colLast="0" w:name="_gs7hjzcxezln" w:id="8"/>
+      <w:bookmarkStart w:colFirst="0" w:colLast="0" w:name="_23zvtck94p1y" w:id="8"/>
       <w:bookmarkEnd w:id="8"/>
       <w:r>
         <w:rPr>
@@ -1845,7 +1865,7 @@
       <w:pPr>
         <w:numPr>
           <w:ilvl w:val="0"/>
-          <w:numId w:val="12"/>
+          <w:numId w:val="4"/>
         </w:numPr>
         <w:spacing w:after="0" w:before="240" w:line="276" w:lineRule="auto"/>
         <w:ind w:left="720" w:hanging="360"/>
@@ -1865,7 +1885,7 @@
       <w:pPr>
         <w:numPr>
           <w:ilvl w:val="0"/>
-          <w:numId w:val="12"/>
+          <w:numId w:val="4"/>
         </w:numPr>
         <w:spacing w:after="0" w:before="0" w:line="276" w:lineRule="auto"/>
         <w:ind w:left="720" w:hanging="360"/>
@@ -1885,7 +1905,7 @@
       <w:pPr>
         <w:numPr>
           <w:ilvl w:val="0"/>
-          <w:numId w:val="12"/>
+          <w:numId w:val="4"/>
         </w:numPr>
         <w:spacing w:after="0" w:before="0" w:line="276" w:lineRule="auto"/>
         <w:ind w:left="720" w:hanging="360"/>
@@ -1905,7 +1925,7 @@
       <w:pPr>
         <w:numPr>
           <w:ilvl w:val="0"/>
-          <w:numId w:val="12"/>
+          <w:numId w:val="4"/>
         </w:numPr>
         <w:spacing w:after="240" w:before="0" w:line="276" w:lineRule="auto"/>
         <w:ind w:left="720" w:hanging="360"/>
@@ -1942,7 +1962,7 @@
       <w:pPr>
         <w:numPr>
           <w:ilvl w:val="0"/>
-          <w:numId w:val="33"/>
+          <w:numId w:val="27"/>
         </w:numPr>
         <w:spacing w:after="0" w:before="240" w:line="276" w:lineRule="auto"/>
         <w:ind w:left="720" w:hanging="360"/>
@@ -1962,7 +1982,7 @@
       <w:pPr>
         <w:numPr>
           <w:ilvl w:val="0"/>
-          <w:numId w:val="33"/>
+          <w:numId w:val="27"/>
         </w:numPr>
         <w:spacing w:after="240" w:before="0" w:line="276" w:lineRule="auto"/>
         <w:ind w:left="720" w:hanging="360"/>
@@ -2010,7 +2030,7 @@
           <w:szCs w:val="26"/>
         </w:rPr>
       </w:pPr>
-      <w:bookmarkStart w:colFirst="0" w:colLast="0" w:name="_lb87vtmk2ypt" w:id="9"/>
+      <w:bookmarkStart w:colFirst="0" w:colLast="0" w:name="_ut2d38iacf7s" w:id="9"/>
       <w:bookmarkEnd w:id="9"/>
       <w:r>
         <w:rPr>
@@ -2043,7 +2063,7 @@
       <w:pPr>
         <w:numPr>
           <w:ilvl w:val="0"/>
-          <w:numId w:val="38"/>
+          <w:numId w:val="32"/>
         </w:numPr>
         <w:spacing w:after="0" w:before="240" w:line="276" w:lineRule="auto"/>
         <w:ind w:left="720" w:hanging="360"/>
@@ -2063,7 +2083,7 @@
       <w:pPr>
         <w:numPr>
           <w:ilvl w:val="0"/>
-          <w:numId w:val="38"/>
+          <w:numId w:val="32"/>
         </w:numPr>
         <w:spacing w:after="0" w:before="0" w:line="276" w:lineRule="auto"/>
         <w:ind w:left="720" w:hanging="360"/>
@@ -2083,7 +2103,7 @@
       <w:pPr>
         <w:numPr>
           <w:ilvl w:val="0"/>
-          <w:numId w:val="38"/>
+          <w:numId w:val="32"/>
         </w:numPr>
         <w:spacing w:after="240" w:before="0" w:line="276" w:lineRule="auto"/>
         <w:ind w:left="720" w:hanging="360"/>
@@ -2120,7 +2140,7 @@
       <w:pPr>
         <w:numPr>
           <w:ilvl w:val="0"/>
-          <w:numId w:val="4"/>
+          <w:numId w:val="33"/>
         </w:numPr>
         <w:spacing w:after="0" w:before="240" w:line="276" w:lineRule="auto"/>
         <w:ind w:left="720" w:hanging="360"/>
@@ -2140,7 +2160,7 @@
       <w:pPr>
         <w:numPr>
           <w:ilvl w:val="0"/>
-          <w:numId w:val="4"/>
+          <w:numId w:val="33"/>
         </w:numPr>
         <w:spacing w:after="240" w:before="0" w:line="276" w:lineRule="auto"/>
         <w:ind w:left="720" w:hanging="360"/>
@@ -2188,7 +2208,7 @@
           <w:szCs w:val="34"/>
         </w:rPr>
       </w:pPr>
-      <w:bookmarkStart w:colFirst="0" w:colLast="0" w:name="_ai6hon3me7km" w:id="10"/>
+      <w:bookmarkStart w:colFirst="0" w:colLast="0" w:name="_929wlh4xihfx" w:id="10"/>
       <w:bookmarkEnd w:id="10"/>
       <w:r>
         <w:rPr>
@@ -2213,7 +2233,7 @@
           <w:szCs w:val="26"/>
         </w:rPr>
       </w:pPr>
-      <w:bookmarkStart w:colFirst="0" w:colLast="0" w:name="_vxjzsxr8phf0" w:id="11"/>
+      <w:bookmarkStart w:colFirst="0" w:colLast="0" w:name="_5oz50isppcc1" w:id="11"/>
       <w:bookmarkEnd w:id="11"/>
       <w:r>
         <w:rPr>
@@ -2246,7 +2266,7 @@
       <w:pPr>
         <w:numPr>
           <w:ilvl w:val="0"/>
-          <w:numId w:val="10"/>
+          <w:numId w:val="2"/>
         </w:numPr>
         <w:spacing w:after="0" w:before="240" w:line="276" w:lineRule="auto"/>
         <w:ind w:left="720" w:hanging="360"/>
@@ -2266,7 +2286,7 @@
       <w:pPr>
         <w:numPr>
           <w:ilvl w:val="0"/>
-          <w:numId w:val="10"/>
+          <w:numId w:val="2"/>
         </w:numPr>
         <w:spacing w:after="0" w:before="0" w:line="276" w:lineRule="auto"/>
         <w:ind w:left="720" w:hanging="360"/>
@@ -2286,7 +2306,7 @@
       <w:pPr>
         <w:numPr>
           <w:ilvl w:val="0"/>
-          <w:numId w:val="10"/>
+          <w:numId w:val="2"/>
         </w:numPr>
         <w:spacing w:after="240" w:before="0" w:line="276" w:lineRule="auto"/>
         <w:ind w:left="720" w:hanging="360"/>
@@ -2323,7 +2343,7 @@
       <w:pPr>
         <w:numPr>
           <w:ilvl w:val="0"/>
-          <w:numId w:val="11"/>
+          <w:numId w:val="3"/>
         </w:numPr>
         <w:spacing w:after="0" w:before="240" w:line="276" w:lineRule="auto"/>
         <w:ind w:left="720" w:hanging="360"/>
@@ -2343,7 +2363,7 @@
       <w:pPr>
         <w:numPr>
           <w:ilvl w:val="0"/>
-          <w:numId w:val="11"/>
+          <w:numId w:val="3"/>
         </w:numPr>
         <w:spacing w:after="240" w:before="0" w:line="276" w:lineRule="auto"/>
         <w:ind w:left="720" w:hanging="360"/>
@@ -2391,7 +2411,7 @@
           <w:szCs w:val="26"/>
         </w:rPr>
       </w:pPr>
-      <w:bookmarkStart w:colFirst="0" w:colLast="0" w:name="_fqumlz3ovfsz" w:id="12"/>
+      <w:bookmarkStart w:colFirst="0" w:colLast="0" w:name="_7i6ummyf8h35" w:id="12"/>
       <w:bookmarkEnd w:id="12"/>
       <w:r>
         <w:rPr>
@@ -2424,7 +2444,7 @@
       <w:pPr>
         <w:numPr>
           <w:ilvl w:val="0"/>
-          <w:numId w:val="31"/>
+          <w:numId w:val="25"/>
         </w:numPr>
         <w:spacing w:after="0" w:before="240" w:line="276" w:lineRule="auto"/>
         <w:ind w:left="720" w:hanging="360"/>
@@ -2444,7 +2464,7 @@
       <w:pPr>
         <w:numPr>
           <w:ilvl w:val="0"/>
-          <w:numId w:val="31"/>
+          <w:numId w:val="25"/>
         </w:numPr>
         <w:spacing w:after="0" w:before="0" w:line="276" w:lineRule="auto"/>
         <w:ind w:left="720" w:hanging="360"/>
@@ -2464,7 +2484,7 @@
       <w:pPr>
         <w:numPr>
           <w:ilvl w:val="0"/>
-          <w:numId w:val="31"/>
+          <w:numId w:val="25"/>
         </w:numPr>
         <w:spacing w:after="240" w:before="0" w:line="276" w:lineRule="auto"/>
         <w:ind w:left="720" w:hanging="360"/>
@@ -2501,7 +2521,7 @@
       <w:pPr>
         <w:numPr>
           <w:ilvl w:val="0"/>
-          <w:numId w:val="3"/>
+          <w:numId w:val="23"/>
         </w:numPr>
         <w:spacing w:after="0" w:before="240" w:line="276" w:lineRule="auto"/>
         <w:ind w:left="720" w:hanging="360"/>
@@ -2521,7 +2541,7 @@
       <w:pPr>
         <w:numPr>
           <w:ilvl w:val="0"/>
-          <w:numId w:val="3"/>
+          <w:numId w:val="23"/>
         </w:numPr>
         <w:spacing w:after="240" w:before="0" w:line="276" w:lineRule="auto"/>
         <w:ind w:left="720" w:hanging="360"/>
@@ -2569,7 +2589,7 @@
           <w:szCs w:val="34"/>
         </w:rPr>
       </w:pPr>
-      <w:bookmarkStart w:colFirst="0" w:colLast="0" w:name="_43u1jxf7bmsh" w:id="13"/>
+      <w:bookmarkStart w:colFirst="0" w:colLast="0" w:name="_cqp2m85tpyz8" w:id="13"/>
       <w:bookmarkEnd w:id="13"/>
       <w:r>
         <w:rPr>
@@ -2594,7 +2614,7 @@
           <w:szCs w:val="26"/>
         </w:rPr>
       </w:pPr>
-      <w:bookmarkStart w:colFirst="0" w:colLast="0" w:name="_q74m3xt5frxe" w:id="14"/>
+      <w:bookmarkStart w:colFirst="0" w:colLast="0" w:name="_kxv6qa7vs3z9" w:id="14"/>
       <w:bookmarkEnd w:id="14"/>
       <w:r>
         <w:rPr>
@@ -2627,7 +2647,7 @@
       <w:pPr>
         <w:numPr>
           <w:ilvl w:val="0"/>
-          <w:numId w:val="23"/>
+          <w:numId w:val="16"/>
         </w:numPr>
         <w:spacing w:after="0" w:before="240" w:line="276" w:lineRule="auto"/>
         <w:ind w:left="720" w:hanging="360"/>
@@ -2647,7 +2667,7 @@
       <w:pPr>
         <w:numPr>
           <w:ilvl w:val="0"/>
-          <w:numId w:val="23"/>
+          <w:numId w:val="16"/>
         </w:numPr>
         <w:spacing w:after="0" w:before="0" w:line="276" w:lineRule="auto"/>
         <w:ind w:left="720" w:hanging="360"/>
@@ -2667,7 +2687,7 @@
       <w:pPr>
         <w:numPr>
           <w:ilvl w:val="0"/>
-          <w:numId w:val="23"/>
+          <w:numId w:val="16"/>
         </w:numPr>
         <w:spacing w:after="240" w:before="0" w:line="276" w:lineRule="auto"/>
         <w:ind w:left="720" w:hanging="360"/>
@@ -2704,7 +2724,7 @@
       <w:pPr>
         <w:numPr>
           <w:ilvl w:val="0"/>
-          <w:numId w:val="29"/>
+          <w:numId w:val="22"/>
         </w:numPr>
         <w:spacing w:after="0" w:before="240" w:line="276" w:lineRule="auto"/>
         <w:ind w:left="720" w:hanging="360"/>
@@ -2724,7 +2744,7 @@
       <w:pPr>
         <w:numPr>
           <w:ilvl w:val="0"/>
-          <w:numId w:val="29"/>
+          <w:numId w:val="22"/>
         </w:numPr>
         <w:spacing w:after="240" w:before="0" w:line="276" w:lineRule="auto"/>
         <w:ind w:left="720" w:hanging="360"/>
@@ -2772,7 +2792,7 @@
           <w:szCs w:val="26"/>
         </w:rPr>
       </w:pPr>
-      <w:bookmarkStart w:colFirst="0" w:colLast="0" w:name="_4wt232ievyhm" w:id="15"/>
+      <w:bookmarkStart w:colFirst="0" w:colLast="0" w:name="_j6n7aqruu1qq" w:id="15"/>
       <w:bookmarkEnd w:id="15"/>
       <w:r>
         <w:rPr>
@@ -2805,7 +2825,7 @@
       <w:pPr>
         <w:numPr>
           <w:ilvl w:val="0"/>
-          <w:numId w:val="2"/>
+          <w:numId w:val="12"/>
         </w:numPr>
         <w:spacing w:after="0" w:before="240" w:line="276" w:lineRule="auto"/>
         <w:ind w:left="720" w:hanging="360"/>
@@ -2825,7 +2845,7 @@
       <w:pPr>
         <w:numPr>
           <w:ilvl w:val="0"/>
-          <w:numId w:val="2"/>
+          <w:numId w:val="12"/>
         </w:numPr>
         <w:spacing w:after="0" w:before="0" w:line="276" w:lineRule="auto"/>
         <w:ind w:left="720" w:hanging="360"/>
@@ -2845,7 +2865,7 @@
       <w:pPr>
         <w:numPr>
           <w:ilvl w:val="0"/>
-          <w:numId w:val="2"/>
+          <w:numId w:val="12"/>
         </w:numPr>
         <w:spacing w:after="240" w:before="0" w:line="276" w:lineRule="auto"/>
         <w:ind w:left="720" w:hanging="360"/>
@@ -2882,7 +2902,7 @@
       <w:pPr>
         <w:numPr>
           <w:ilvl w:val="0"/>
-          <w:numId w:val="35"/>
+          <w:numId w:val="29"/>
         </w:numPr>
         <w:spacing w:after="0" w:before="240" w:line="276" w:lineRule="auto"/>
         <w:ind w:left="720" w:hanging="360"/>
@@ -2902,7 +2922,7 @@
       <w:pPr>
         <w:numPr>
           <w:ilvl w:val="0"/>
-          <w:numId w:val="35"/>
+          <w:numId w:val="29"/>
         </w:numPr>
         <w:spacing w:after="240" w:before="0" w:line="276" w:lineRule="auto"/>
         <w:ind w:left="720" w:hanging="360"/>
@@ -2950,7 +2970,7 @@
           <w:szCs w:val="26"/>
         </w:rPr>
       </w:pPr>
-      <w:bookmarkStart w:colFirst="0" w:colLast="0" w:name="_eh6bdxdwxhc" w:id="16"/>
+      <w:bookmarkStart w:colFirst="0" w:colLast="0" w:name="_8m32plflnhsu" w:id="16"/>
       <w:bookmarkEnd w:id="16"/>
       <w:r>
         <w:rPr>
@@ -3100,7 +3120,7 @@
       <w:pPr>
         <w:numPr>
           <w:ilvl w:val="0"/>
-          <w:numId w:val="8"/>
+          <w:numId w:val="37"/>
         </w:numPr>
         <w:spacing w:after="0" w:before="240" w:line="276" w:lineRule="auto"/>
         <w:ind w:left="720" w:hanging="360"/>
@@ -3120,7 +3140,7 @@
       <w:pPr>
         <w:numPr>
           <w:ilvl w:val="0"/>
-          <w:numId w:val="8"/>
+          <w:numId w:val="37"/>
         </w:numPr>
         <w:spacing w:after="240" w:before="0" w:line="276" w:lineRule="auto"/>
         <w:ind w:left="720" w:hanging="360"/>
@@ -3168,7 +3188,7 @@
           <w:szCs w:val="34"/>
         </w:rPr>
       </w:pPr>
-      <w:bookmarkStart w:colFirst="0" w:colLast="0" w:name="_3g5wrm9pzw5b" w:id="17"/>
+      <w:bookmarkStart w:colFirst="0" w:colLast="0" w:name="_f78j72cl01x" w:id="17"/>
       <w:bookmarkEnd w:id="17"/>
       <w:r>
         <w:rPr>
@@ -3193,7 +3213,7 @@
           <w:szCs w:val="26"/>
         </w:rPr>
       </w:pPr>
-      <w:bookmarkStart w:colFirst="0" w:colLast="0" w:name="_pskbcltp5k7l" w:id="18"/>
+      <w:bookmarkStart w:colFirst="0" w:colLast="0" w:name="_15fjky7mo7s3" w:id="18"/>
       <w:bookmarkEnd w:id="18"/>
       <w:r>
         <w:rPr>
@@ -3226,7 +3246,7 @@
       <w:pPr>
         <w:numPr>
           <w:ilvl w:val="0"/>
-          <w:numId w:val="5"/>
+          <w:numId w:val="34"/>
         </w:numPr>
         <w:spacing w:after="0" w:before="240" w:line="276" w:lineRule="auto"/>
         <w:ind w:left="720" w:hanging="360"/>
@@ -3246,7 +3266,7 @@
       <w:pPr>
         <w:numPr>
           <w:ilvl w:val="0"/>
-          <w:numId w:val="5"/>
+          <w:numId w:val="34"/>
         </w:numPr>
         <w:spacing w:after="0" w:before="0" w:line="276" w:lineRule="auto"/>
         <w:ind w:left="720" w:hanging="360"/>
@@ -3266,7 +3286,7 @@
       <w:pPr>
         <w:numPr>
           <w:ilvl w:val="0"/>
-          <w:numId w:val="5"/>
+          <w:numId w:val="34"/>
         </w:numPr>
         <w:spacing w:after="240" w:before="0" w:line="276" w:lineRule="auto"/>
         <w:ind w:left="720" w:hanging="360"/>
@@ -3303,7 +3323,7 @@
       <w:pPr>
         <w:numPr>
           <w:ilvl w:val="0"/>
-          <w:numId w:val="18"/>
+          <w:numId w:val="10"/>
         </w:numPr>
         <w:spacing w:after="0" w:before="240" w:line="276" w:lineRule="auto"/>
         <w:ind w:left="720" w:hanging="360"/>
@@ -3323,7 +3343,7 @@
       <w:pPr>
         <w:numPr>
           <w:ilvl w:val="0"/>
-          <w:numId w:val="18"/>
+          <w:numId w:val="10"/>
         </w:numPr>
         <w:spacing w:after="240" w:before="0" w:line="276" w:lineRule="auto"/>
         <w:ind w:left="720" w:hanging="360"/>
@@ -3371,7 +3391,7 @@
           <w:szCs w:val="26"/>
         </w:rPr>
       </w:pPr>
-      <w:bookmarkStart w:colFirst="0" w:colLast="0" w:name="_qvnsrz7s9ggm" w:id="19"/>
+      <w:bookmarkStart w:colFirst="0" w:colLast="0" w:name="_32lx80acmb8z" w:id="19"/>
       <w:bookmarkEnd w:id="19"/>
       <w:r>
         <w:rPr>
@@ -3404,7 +3424,7 @@
       <w:pPr>
         <w:numPr>
           <w:ilvl w:val="0"/>
-          <w:numId w:val="36"/>
+          <w:numId w:val="30"/>
         </w:numPr>
         <w:spacing w:after="0" w:before="240" w:line="276" w:lineRule="auto"/>
         <w:ind w:left="720" w:hanging="360"/>
@@ -3424,7 +3444,7 @@
       <w:pPr>
         <w:numPr>
           <w:ilvl w:val="0"/>
-          <w:numId w:val="36"/>
+          <w:numId w:val="30"/>
         </w:numPr>
         <w:spacing w:after="0" w:before="0" w:line="276" w:lineRule="auto"/>
         <w:ind w:left="720" w:hanging="360"/>
@@ -3444,7 +3464,7 @@
       <w:pPr>
         <w:numPr>
           <w:ilvl w:val="0"/>
-          <w:numId w:val="36"/>
+          <w:numId w:val="30"/>
         </w:numPr>
         <w:spacing w:after="240" w:before="0" w:line="276" w:lineRule="auto"/>
         <w:ind w:left="720" w:hanging="360"/>
@@ -3481,7 +3501,7 @@
       <w:pPr>
         <w:numPr>
           <w:ilvl w:val="0"/>
-          <w:numId w:val="19"/>
+          <w:numId w:val="11"/>
         </w:numPr>
         <w:spacing w:after="0" w:before="240" w:line="276" w:lineRule="auto"/>
         <w:ind w:left="720" w:hanging="360"/>
@@ -3501,7 +3521,7 @@
       <w:pPr>
         <w:numPr>
           <w:ilvl w:val="0"/>
-          <w:numId w:val="19"/>
+          <w:numId w:val="11"/>
         </w:numPr>
         <w:spacing w:after="240" w:before="0" w:line="276" w:lineRule="auto"/>
         <w:ind w:left="720" w:hanging="360"/>
@@ -3549,7 +3569,7 @@
           <w:szCs w:val="26"/>
         </w:rPr>
       </w:pPr>
-      <w:bookmarkStart w:colFirst="0" w:colLast="0" w:name="_1of3po773ng2" w:id="20"/>
+      <w:bookmarkStart w:colFirst="0" w:colLast="0" w:name="_kjgvmhybket0" w:id="20"/>
       <w:bookmarkEnd w:id="20"/>
       <w:r>
         <w:rPr>
@@ -3582,7 +3602,7 @@
       <w:pPr>
         <w:numPr>
           <w:ilvl w:val="0"/>
-          <w:numId w:val="34"/>
+          <w:numId w:val="28"/>
         </w:numPr>
         <w:spacing w:after="0" w:before="240" w:line="276" w:lineRule="auto"/>
         <w:ind w:left="720" w:hanging="360"/>
@@ -3602,7 +3622,7 @@
       <w:pPr>
         <w:numPr>
           <w:ilvl w:val="0"/>
-          <w:numId w:val="34"/>
+          <w:numId w:val="28"/>
         </w:numPr>
         <w:spacing w:after="0" w:before="0" w:line="276" w:lineRule="auto"/>
         <w:ind w:left="720" w:hanging="360"/>
@@ -3622,7 +3642,7 @@
       <w:pPr>
         <w:numPr>
           <w:ilvl w:val="0"/>
-          <w:numId w:val="34"/>
+          <w:numId w:val="28"/>
         </w:numPr>
         <w:spacing w:after="0" w:before="0" w:line="276" w:lineRule="auto"/>
         <w:ind w:left="720" w:hanging="360"/>
@@ -3642,7 +3662,7 @@
       <w:pPr>
         <w:numPr>
           <w:ilvl w:val="0"/>
-          <w:numId w:val="34"/>
+          <w:numId w:val="28"/>
         </w:numPr>
         <w:spacing w:after="240" w:before="0" w:line="276" w:lineRule="auto"/>
         <w:ind w:left="720" w:hanging="360"/>
@@ -3679,7 +3699,7 @@
       <w:pPr>
         <w:numPr>
           <w:ilvl w:val="0"/>
-          <w:numId w:val="24"/>
+          <w:numId w:val="17"/>
         </w:numPr>
         <w:spacing w:after="0" w:before="240" w:line="276" w:lineRule="auto"/>
         <w:ind w:left="720" w:hanging="360"/>
@@ -3699,7 +3719,7 @@
       <w:pPr>
         <w:numPr>
           <w:ilvl w:val="0"/>
-          <w:numId w:val="24"/>
+          <w:numId w:val="17"/>
         </w:numPr>
         <w:spacing w:after="240" w:before="0" w:line="276" w:lineRule="auto"/>
         <w:ind w:left="720" w:hanging="360"/>
@@ -3748,7 +3768,7 @@
           <w:szCs w:val="34"/>
         </w:rPr>
       </w:pPr>
-      <w:bookmarkStart w:colFirst="0" w:colLast="0" w:name="_r8yog6epcgss" w:id="21"/>
+      <w:bookmarkStart w:colFirst="0" w:colLast="0" w:name="_78pfttaj8mu7" w:id="21"/>
       <w:bookmarkEnd w:id="21"/>
       <w:r>
         <w:rPr>
@@ -3764,7 +3784,7 @@
       <w:pPr>
         <w:numPr>
           <w:ilvl w:val="0"/>
-          <w:numId w:val="21"/>
+          <w:numId w:val="14"/>
         </w:numPr>
         <w:spacing w:after="0" w:before="240" w:line="276" w:lineRule="auto"/>
         <w:ind w:left="720" w:hanging="360"/>
@@ -3793,7 +3813,7 @@
       <w:pPr>
         <w:numPr>
           <w:ilvl w:val="0"/>
-          <w:numId w:val="21"/>
+          <w:numId w:val="14"/>
         </w:numPr>
         <w:spacing w:after="0" w:before="0" w:line="276" w:lineRule="auto"/>
         <w:ind w:left="720" w:hanging="360"/>
@@ -3822,7 +3842,7 @@
       <w:pPr>
         <w:numPr>
           <w:ilvl w:val="0"/>
-          <w:numId w:val="21"/>
+          <w:numId w:val="14"/>
         </w:numPr>
         <w:spacing w:after="0" w:before="0" w:line="276" w:lineRule="auto"/>
         <w:ind w:left="720" w:hanging="360"/>
@@ -3851,7 +3871,7 @@
       <w:pPr>
         <w:numPr>
           <w:ilvl w:val="0"/>
-          <w:numId w:val="21"/>
+          <w:numId w:val="14"/>
         </w:numPr>
         <w:spacing w:after="0" w:before="0" w:line="276" w:lineRule="auto"/>
         <w:ind w:left="720" w:hanging="360"/>
@@ -3880,7 +3900,7 @@
       <w:pPr>
         <w:numPr>
           <w:ilvl w:val="0"/>
-          <w:numId w:val="21"/>
+          <w:numId w:val="14"/>
         </w:numPr>
         <w:spacing w:after="240" w:before="0" w:line="276" w:lineRule="auto"/>
         <w:ind w:left="720" w:hanging="360"/>
@@ -3943,12 +3963,12 @@
             <wp:anchor allowOverlap="1" behindDoc="0" distB="0" distT="0" distL="114300" distR="114300" hidden="0" layoutInCell="1" locked="0" relativeHeight="0" simplePos="0">
               <wp:simplePos x="0" y="0"/>
               <wp:positionH relativeFrom="column">
-                <wp:posOffset>-634999</wp:posOffset>
+                <wp:posOffset>-647698</wp:posOffset>
               </wp:positionH>
               <wp:positionV relativeFrom="paragraph">
-                <wp:posOffset>114300</wp:posOffset>
+                <wp:posOffset>101600</wp:posOffset>
               </wp:positionV>
-              <wp:extent cx="8147274" cy="50800"/>
+              <wp:extent cx="8172674" cy="76200"/>
               <wp:effectExtent b="0" l="0" r="0" t="0"/>
               <wp:wrapNone/>
               <wp:docPr id="1" name=""/>
@@ -3989,12 +4009,12 @@
             <wp:anchor allowOverlap="1" behindDoc="0" distB="0" distT="0" distL="114300" distR="114300" hidden="0" layoutInCell="1" locked="0" relativeHeight="0" simplePos="0">
               <wp:simplePos x="0" y="0"/>
               <wp:positionH relativeFrom="column">
-                <wp:posOffset>-634999</wp:posOffset>
+                <wp:posOffset>-647698</wp:posOffset>
               </wp:positionH>
               <wp:positionV relativeFrom="paragraph">
-                <wp:posOffset>114300</wp:posOffset>
+                <wp:posOffset>101600</wp:posOffset>
               </wp:positionV>
-              <wp:extent cx="8147274" cy="50800"/>
+              <wp:extent cx="8172674" cy="76200"/>
               <wp:effectExtent b="0" l="0" r="0" t="0"/>
               <wp:wrapNone/>
               <wp:docPr id="1" name="image2.png"/>
@@ -4015,7 +4035,7 @@
                     <pic:spPr>
                       <a:xfrm>
                         <a:off x="0" y="0"/>
-                        <a:ext cx="8147274" cy="50800"/>
+                        <a:ext cx="8172674" cy="76200"/>
                       </a:xfrm>
                       <a:prstGeom prst="rect"/>
                       <a:ln/>
@@ -4233,10 +4253,10 @@
         <wp:anchor allowOverlap="1" behindDoc="0" distB="0" distT="0" distL="114300" distR="114300" hidden="0" layoutInCell="1" locked="0" relativeHeight="0" simplePos="0">
           <wp:simplePos x="0" y="0"/>
           <wp:positionH relativeFrom="column">
-            <wp:posOffset>-467358</wp:posOffset>
+            <wp:posOffset>-467357</wp:posOffset>
           </wp:positionH>
           <wp:positionV relativeFrom="paragraph">
-            <wp:posOffset>-457197</wp:posOffset>
+            <wp:posOffset>-457196</wp:posOffset>
           </wp:positionV>
           <wp:extent cx="6858000" cy="1043940"/>
           <wp:effectExtent b="0" l="0" r="0" t="0"/>
@@ -8671,7 +8691,7 @@
         <w:rFonts w:ascii="Calibri" w:cs="Calibri" w:eastAsia="Calibri" w:hAnsi="Calibri"/>
         <w:sz w:val="22"/>
         <w:szCs w:val="22"/>
-        <w:lang w:val="en-US"/>
+        <w:lang w:val="en"/>
       </w:rPr>
     </w:rPrDefault>
     <w:pPrDefault>
@@ -8680,11 +8700,19 @@
       </w:pPr>
     </w:pPrDefault>
   </w:docDefaults>
+  <w:style w:type="table" w:styleId="TableNormal" w:default="1">
+    <w:name w:val="TableNormal"/>
+    <w:tblPr>
+      <w:tblCellMar>
+        <w:top w:w="100.0" w:type="dxa"/>
+        <w:left w:w="100.0" w:type="dxa"/>
+        <w:bottom w:w="100.0" w:type="dxa"/>
+        <w:right w:w="100.0" w:type="dxa"/>
+      </w:tblCellMar>
+    </w:tblPr>
+  </w:style>
   <w:style w:type="paragraph" w:styleId="Normal" w:default="1">
     <w:name w:val="normal"/>
-  </w:style>
-  <w:style w:type="table" w:styleId="TableNormal" w:default="1">
-    <w:name w:val="Table Normal"/>
   </w:style>
   <w:style w:type="paragraph" w:styleId="Heading1">
     <w:name w:val="heading 1"/>

</xml_diff>

<commit_message>
Update dissertation timeline plan
</commit_message>
<xml_diff>
--- a/Daniel Broz - Ranking Large Language Models’ Knowledge in 26 Academic Fields - Timeline plan.docx
+++ b/Daniel Broz - Ranking Large Language Models’ Knowledge in 26 Academic Fields - Timeline plan.docx
@@ -24,6 +24,7 @@
         <w:rPr>
           <w:rFonts w:ascii="Play" w:cs="Play" w:eastAsia="Play" w:hAnsi="Play"/>
           <w:b w:val="1"/>
+          <w:bCs w:val="1"/>
           <w:sz w:val="24"/>
           <w:szCs w:val="24"/>
         </w:rPr>
@@ -41,6 +42,7 @@
         <w:rPr>
           <w:rFonts w:ascii="Play" w:cs="Play" w:eastAsia="Play" w:hAnsi="Play"/>
           <w:b w:val="1"/>
+          <w:bCs w:val="1"/>
           <w:sz w:val="24"/>
           <w:szCs w:val="24"/>
         </w:rPr>
@@ -49,6 +51,7 @@
         <w:rPr>
           <w:rFonts w:ascii="Play" w:cs="Play" w:eastAsia="Play" w:hAnsi="Play"/>
           <w:b w:val="1"/>
+          <w:bCs w:val="1"/>
           <w:sz w:val="24"/>
           <w:szCs w:val="24"/>
           <w:rtl w:val="0"/>
@@ -63,12 +66,14 @@
         <w:rPr>
           <w:rFonts w:ascii="Arial" w:cs="Arial" w:eastAsia="Arial" w:hAnsi="Arial"/>
           <w:b w:val="1"/>
+          <w:bCs w:val="1"/>
         </w:rPr>
       </w:pPr>
       <w:r>
         <w:rPr>
           <w:rFonts w:ascii="Arial" w:cs="Arial" w:eastAsia="Arial" w:hAnsi="Arial"/>
           <w:b w:val="1"/>
+          <w:bCs w:val="1"/>
           <w:sz w:val="32"/>
           <w:szCs w:val="32"/>
           <w:rtl w:val="0"/>
@@ -79,6 +84,7 @@
         <w:rPr>
           <w:rFonts w:ascii="Arial" w:cs="Arial" w:eastAsia="Arial" w:hAnsi="Arial"/>
           <w:b w:val="1"/>
+          <w:bCs w:val="1"/>
           <w:rtl w:val="0"/>
         </w:rPr>
         <w:br w:type="textWrapping"/>
@@ -90,6 +96,7 @@
         <w:rPr>
           <w:rFonts w:ascii="Arial" w:cs="Arial" w:eastAsia="Arial" w:hAnsi="Arial"/>
           <w:b w:val="1"/>
+          <w:bCs w:val="1"/>
           <w:strike w:val="1"/>
         </w:rPr>
       </w:pPr>
@@ -97,6 +104,7 @@
         <w:rPr>
           <w:rFonts w:ascii="Arial" w:cs="Arial" w:eastAsia="Arial" w:hAnsi="Arial"/>
           <w:b w:val="1"/>
+          <w:bCs w:val="1"/>
           <w:strike w:val="1"/>
           <w:rtl w:val="0"/>
         </w:rPr>
@@ -107,7 +115,7 @@
       <w:pPr>
         <w:numPr>
           <w:ilvl w:val="0"/>
-          <w:numId w:val="8"/>
+          <w:numId w:val="37"/>
         </w:numPr>
         <w:spacing w:after="0" w:before="240" w:line="276" w:lineRule="auto"/>
         <w:ind w:left="720" w:hanging="360"/>
@@ -129,7 +137,7 @@
       <w:pPr>
         <w:numPr>
           <w:ilvl w:val="0"/>
-          <w:numId w:val="8"/>
+          <w:numId w:val="37"/>
         </w:numPr>
         <w:spacing w:after="0" w:before="0" w:line="276" w:lineRule="auto"/>
         <w:ind w:left="720" w:hanging="360"/>
@@ -152,20 +160,22 @@
         <w:pStyle w:val="Heading5"/>
         <w:numPr>
           <w:ilvl w:val="0"/>
-          <w:numId w:val="8"/>
+          <w:numId w:val="37"/>
         </w:numPr>
         <w:spacing w:after="240" w:line="276" w:lineRule="auto"/>
         <w:ind w:left="720" w:hanging="360"/>
         <w:rPr>
           <w:b w:val="0"/>
-          <w:strike w:val="1"/>
-        </w:rPr>
-      </w:pPr>
-      <w:bookmarkStart w:colFirst="0" w:colLast="0" w:name="_ciwuotxyvm7" w:id="0"/>
+          <w:bCs w:val="0"/>
+          <w:strike w:val="1"/>
+        </w:rPr>
+      </w:pPr>
+      <w:bookmarkStart w:colFirst="0" w:colLast="0" w:name="_55c2m07khr9t" w:id="0"/>
       <w:bookmarkEnd w:id="0"/>
       <w:r>
         <w:rPr>
           <w:b w:val="0"/>
+          <w:bCs w:val="0"/>
           <w:strike w:val="1"/>
           <w:rtl w:val="0"/>
         </w:rPr>
@@ -178,12 +188,16 @@
         <w:rPr>
           <w:rFonts w:ascii="Arial" w:cs="Arial" w:eastAsia="Arial" w:hAnsi="Arial"/>
           <w:b w:val="1"/>
+          <w:bCs w:val="1"/>
+          <w:strike w:val="1"/>
         </w:rPr>
       </w:pPr>
       <w:r>
         <w:rPr>
           <w:rFonts w:ascii="Arial" w:cs="Arial" w:eastAsia="Arial" w:hAnsi="Arial"/>
           <w:b w:val="1"/>
+          <w:bCs w:val="1"/>
+          <w:strike w:val="1"/>
           <w:rtl w:val="0"/>
         </w:rPr>
         <w:t xml:space="preserve">Phase Two (Months 4–6): Model Selection and Baseline Evaluations</w:t>
@@ -193,17 +207,19 @@
       <w:pPr>
         <w:numPr>
           <w:ilvl w:val="0"/>
-          <w:numId w:val="7"/>
+          <w:numId w:val="36"/>
         </w:numPr>
         <w:spacing w:after="0" w:before="240" w:line="276" w:lineRule="auto"/>
         <w:ind w:left="720" w:hanging="360"/>
         <w:rPr>
           <w:rFonts w:ascii="Arial" w:cs="Arial" w:eastAsia="Arial" w:hAnsi="Arial"/>
-        </w:rPr>
-      </w:pPr>
-      <w:r>
-        <w:rPr>
-          <w:rFonts w:ascii="Arial" w:cs="Arial" w:eastAsia="Arial" w:hAnsi="Arial"/>
+          <w:strike w:val="1"/>
+        </w:rPr>
+      </w:pPr>
+      <w:r>
+        <w:rPr>
+          <w:rFonts w:ascii="Arial" w:cs="Arial" w:eastAsia="Arial" w:hAnsi="Arial"/>
+          <w:strike w:val="1"/>
           <w:rtl w:val="0"/>
         </w:rPr>
         <w:t xml:space="preserve">Finalize the choice of LLMs for evaluation.</w:t>
@@ -213,17 +229,19 @@
       <w:pPr>
         <w:numPr>
           <w:ilvl w:val="0"/>
-          <w:numId w:val="7"/>
+          <w:numId w:val="36"/>
         </w:numPr>
         <w:spacing w:after="0" w:before="0" w:line="276" w:lineRule="auto"/>
         <w:ind w:left="720" w:hanging="360"/>
         <w:rPr>
           <w:rFonts w:ascii="Arial" w:cs="Arial" w:eastAsia="Arial" w:hAnsi="Arial"/>
-        </w:rPr>
-      </w:pPr>
-      <w:r>
-        <w:rPr>
-          <w:rFonts w:ascii="Arial" w:cs="Arial" w:eastAsia="Arial" w:hAnsi="Arial"/>
+          <w:strike w:val="1"/>
+        </w:rPr>
+      </w:pPr>
+      <w:r>
+        <w:rPr>
+          <w:rFonts w:ascii="Arial" w:cs="Arial" w:eastAsia="Arial" w:hAnsi="Arial"/>
+          <w:strike w:val="1"/>
           <w:rtl w:val="0"/>
         </w:rPr>
         <w:t xml:space="preserve">Conduct initial retrieval-augmented tests and grade results.</w:t>
@@ -233,17 +251,19 @@
       <w:pPr>
         <w:numPr>
           <w:ilvl w:val="0"/>
-          <w:numId w:val="7"/>
+          <w:numId w:val="36"/>
         </w:numPr>
         <w:spacing w:after="240" w:before="0" w:line="276" w:lineRule="auto"/>
         <w:ind w:left="720" w:hanging="360"/>
         <w:rPr>
           <w:rFonts w:ascii="Arial" w:cs="Arial" w:eastAsia="Arial" w:hAnsi="Arial"/>
-        </w:rPr>
-      </w:pPr>
-      <w:r>
-        <w:rPr>
-          <w:rFonts w:ascii="Arial" w:cs="Arial" w:eastAsia="Arial" w:hAnsi="Arial"/>
+          <w:strike w:val="1"/>
+        </w:rPr>
+      </w:pPr>
+      <w:r>
+        <w:rPr>
+          <w:rFonts w:ascii="Arial" w:cs="Arial" w:eastAsia="Arial" w:hAnsi="Arial"/>
+          <w:strike w:val="1"/>
           <w:rtl w:val="0"/>
         </w:rPr>
         <w:t xml:space="preserve">Refine rubrics for accuracy, analysis depth, coherence, and adaptability.</w:t>
@@ -255,12 +275,16 @@
         <w:rPr>
           <w:rFonts w:ascii="Arial" w:cs="Arial" w:eastAsia="Arial" w:hAnsi="Arial"/>
           <w:b w:val="1"/>
+          <w:bCs w:val="1"/>
+          <w:strike w:val="1"/>
         </w:rPr>
       </w:pPr>
       <w:r>
         <w:rPr>
           <w:rFonts w:ascii="Arial" w:cs="Arial" w:eastAsia="Arial" w:hAnsi="Arial"/>
           <w:b w:val="1"/>
+          <w:bCs w:val="1"/>
+          <w:strike w:val="1"/>
           <w:rtl w:val="0"/>
         </w:rPr>
         <w:t xml:space="preserve">Phase Three (Months 7–9): Detailed Statistical and Qualitative Analyses</w:t>
@@ -270,17 +294,19 @@
       <w:pPr>
         <w:numPr>
           <w:ilvl w:val="0"/>
-          <w:numId w:val="5"/>
+          <w:numId w:val="34"/>
         </w:numPr>
         <w:spacing w:after="0" w:before="240" w:line="276" w:lineRule="auto"/>
         <w:ind w:left="720" w:hanging="360"/>
         <w:rPr>
           <w:rFonts w:ascii="Arial" w:cs="Arial" w:eastAsia="Arial" w:hAnsi="Arial"/>
-        </w:rPr>
-      </w:pPr>
-      <w:r>
-        <w:rPr>
-          <w:rFonts w:ascii="Arial" w:cs="Arial" w:eastAsia="Arial" w:hAnsi="Arial"/>
+          <w:strike w:val="1"/>
+        </w:rPr>
+      </w:pPr>
+      <w:r>
+        <w:rPr>
+          <w:rFonts w:ascii="Arial" w:cs="Arial" w:eastAsia="Arial" w:hAnsi="Arial"/>
+          <w:strike w:val="1"/>
           <w:rtl w:val="0"/>
         </w:rPr>
         <w:t xml:space="preserve">Perform inter-rater reliability checks, ANOVA, and confidence intervals.</w:t>
@@ -290,17 +316,19 @@
       <w:pPr>
         <w:numPr>
           <w:ilvl w:val="0"/>
-          <w:numId w:val="5"/>
+          <w:numId w:val="34"/>
         </w:numPr>
         <w:spacing w:after="0" w:before="0" w:line="276" w:lineRule="auto"/>
         <w:ind w:left="720" w:hanging="360"/>
         <w:rPr>
           <w:rFonts w:ascii="Arial" w:cs="Arial" w:eastAsia="Arial" w:hAnsi="Arial"/>
-        </w:rPr>
-      </w:pPr>
-      <w:r>
-        <w:rPr>
-          <w:rFonts w:ascii="Arial" w:cs="Arial" w:eastAsia="Arial" w:hAnsi="Arial"/>
+          <w:strike w:val="1"/>
+        </w:rPr>
+      </w:pPr>
+      <w:r>
+        <w:rPr>
+          <w:rFonts w:ascii="Arial" w:cs="Arial" w:eastAsia="Arial" w:hAnsi="Arial"/>
+          <w:strike w:val="1"/>
           <w:rtl w:val="0"/>
         </w:rPr>
         <w:t xml:space="preserve">Gather expert feedback in at least three specialized domains.</w:t>
@@ -310,17 +338,19 @@
       <w:pPr>
         <w:numPr>
           <w:ilvl w:val="0"/>
-          <w:numId w:val="5"/>
+          <w:numId w:val="34"/>
         </w:numPr>
         <w:spacing w:after="240" w:before="0" w:line="276" w:lineRule="auto"/>
         <w:ind w:left="720" w:hanging="360"/>
         <w:rPr>
           <w:rFonts w:ascii="Arial" w:cs="Arial" w:eastAsia="Arial" w:hAnsi="Arial"/>
-        </w:rPr>
-      </w:pPr>
-      <w:r>
-        <w:rPr>
-          <w:rFonts w:ascii="Arial" w:cs="Arial" w:eastAsia="Arial" w:hAnsi="Arial"/>
+          <w:strike w:val="1"/>
+        </w:rPr>
+      </w:pPr>
+      <w:r>
+        <w:rPr>
+          <w:rFonts w:ascii="Arial" w:cs="Arial" w:eastAsia="Arial" w:hAnsi="Arial"/>
+          <w:strike w:val="1"/>
           <w:rtl w:val="0"/>
         </w:rPr>
         <w:t xml:space="preserve">Compare the strengths/weaknesses of each LLM across the 26 fields.</w:t>
@@ -332,12 +362,14 @@
         <w:rPr>
           <w:rFonts w:ascii="Arial" w:cs="Arial" w:eastAsia="Arial" w:hAnsi="Arial"/>
           <w:b w:val="1"/>
+          <w:bCs w:val="1"/>
         </w:rPr>
       </w:pPr>
       <w:r>
         <w:rPr>
           <w:rFonts w:ascii="Arial" w:cs="Arial" w:eastAsia="Arial" w:hAnsi="Arial"/>
           <w:b w:val="1"/>
+          <w:bCs w:val="1"/>
           <w:rtl w:val="0"/>
         </w:rPr>
         <w:t xml:space="preserve">Phase Four (Months 10–12): Write-Up, Dissemination, and Final Defense</w:t>
@@ -347,7 +379,7 @@
       <w:pPr>
         <w:numPr>
           <w:ilvl w:val="0"/>
-          <w:numId w:val="19"/>
+          <w:numId w:val="11"/>
         </w:numPr>
         <w:spacing w:after="0" w:before="240" w:line="276" w:lineRule="auto"/>
         <w:ind w:left="720" w:hanging="360"/>
@@ -367,7 +399,7 @@
       <w:pPr>
         <w:numPr>
           <w:ilvl w:val="0"/>
-          <w:numId w:val="19"/>
+          <w:numId w:val="11"/>
         </w:numPr>
         <w:spacing w:after="0" w:before="0" w:line="276" w:lineRule="auto"/>
         <w:ind w:left="720" w:hanging="360"/>
@@ -387,7 +419,7 @@
       <w:pPr>
         <w:numPr>
           <w:ilvl w:val="0"/>
-          <w:numId w:val="19"/>
+          <w:numId w:val="11"/>
         </w:numPr>
         <w:spacing w:after="240" w:before="0" w:line="276" w:lineRule="auto"/>
         <w:ind w:left="720" w:hanging="360"/>
@@ -539,7 +571,7 @@
           <w:szCs w:val="34"/>
         </w:rPr>
       </w:pPr>
-      <w:bookmarkStart w:colFirst="0" w:colLast="0" w:name="_i9ddh45rojmw" w:id="1"/>
+      <w:bookmarkStart w:colFirst="0" w:colLast="0" w:name="_vv2xcknnfqlr" w:id="1"/>
       <w:bookmarkEnd w:id="1"/>
       <w:r>
         <w:rPr>
@@ -598,7 +630,7 @@
           <w:szCs w:val="26"/>
         </w:rPr>
       </w:pPr>
-      <w:bookmarkStart w:colFirst="0" w:colLast="0" w:name="_wih3fb5yi3t0" w:id="2"/>
+      <w:bookmarkStart w:colFirst="0" w:colLast="0" w:name="_n1jncmw3q2kn" w:id="2"/>
       <w:bookmarkEnd w:id="2"/>
       <w:r>
         <w:rPr>
@@ -616,12 +648,14 @@
         <w:rPr>
           <w:rFonts w:ascii="Arial" w:cs="Arial" w:eastAsia="Arial" w:hAnsi="Arial"/>
           <w:b w:val="1"/>
+          <w:bCs w:val="1"/>
         </w:rPr>
       </w:pPr>
       <w:r>
         <w:rPr>
           <w:rFonts w:ascii="Arial" w:cs="Arial" w:eastAsia="Arial" w:hAnsi="Arial"/>
           <w:b w:val="1"/>
+          <w:bCs w:val="1"/>
           <w:rtl w:val="0"/>
         </w:rPr>
         <w:t xml:space="preserve">Tasks</w:t>
@@ -631,7 +665,7 @@
       <w:pPr>
         <w:numPr>
           <w:ilvl w:val="0"/>
-          <w:numId w:val="6"/>
+          <w:numId w:val="35"/>
         </w:numPr>
         <w:spacing w:after="0" w:before="240" w:line="276" w:lineRule="auto"/>
         <w:ind w:left="720" w:hanging="360"/>
@@ -653,7 +687,7 @@
       <w:pPr>
         <w:numPr>
           <w:ilvl w:val="0"/>
-          <w:numId w:val="6"/>
+          <w:numId w:val="35"/>
         </w:numPr>
         <w:spacing w:after="0" w:before="0" w:line="276" w:lineRule="auto"/>
         <w:ind w:left="720" w:hanging="360"/>
@@ -675,7 +709,7 @@
       <w:pPr>
         <w:numPr>
           <w:ilvl w:val="0"/>
-          <w:numId w:val="6"/>
+          <w:numId w:val="35"/>
         </w:numPr>
         <w:spacing w:after="0" w:before="0" w:line="276" w:lineRule="auto"/>
         <w:ind w:left="720" w:hanging="360"/>
@@ -697,7 +731,7 @@
       <w:pPr>
         <w:numPr>
           <w:ilvl w:val="0"/>
-          <w:numId w:val="6"/>
+          <w:numId w:val="35"/>
         </w:numPr>
         <w:spacing w:after="0" w:before="0" w:line="276" w:lineRule="auto"/>
         <w:ind w:left="720" w:hanging="360"/>
@@ -721,12 +755,14 @@
         <w:rPr>
           <w:rFonts w:ascii="Arial" w:cs="Arial" w:eastAsia="Arial" w:hAnsi="Arial"/>
           <w:b w:val="1"/>
+          <w:bCs w:val="1"/>
         </w:rPr>
       </w:pPr>
       <w:r>
         <w:rPr>
           <w:rFonts w:ascii="Arial" w:cs="Arial" w:eastAsia="Arial" w:hAnsi="Arial"/>
           <w:b w:val="1"/>
+          <w:bCs w:val="1"/>
           <w:rtl w:val="0"/>
         </w:rPr>
         <w:t xml:space="preserve">Milestones</w:t>
@@ -736,7 +772,7 @@
       <w:pPr>
         <w:numPr>
           <w:ilvl w:val="0"/>
-          <w:numId w:val="13"/>
+          <w:numId w:val="5"/>
         </w:numPr>
         <w:spacing w:after="0" w:before="240" w:line="276" w:lineRule="auto"/>
         <w:ind w:left="720" w:hanging="360"/>
@@ -760,12 +796,14 @@
         <w:rPr>
           <w:rFonts w:ascii="Arial" w:cs="Arial" w:eastAsia="Arial" w:hAnsi="Arial"/>
           <w:b w:val="1"/>
+          <w:bCs w:val="1"/>
         </w:rPr>
       </w:pPr>
       <w:r>
         <w:rPr>
           <w:rFonts w:ascii="Arial" w:cs="Arial" w:eastAsia="Arial" w:hAnsi="Arial"/>
           <w:b w:val="1"/>
+          <w:bCs w:val="1"/>
           <w:rtl w:val="0"/>
         </w:rPr>
         <w:t xml:space="preserve">Notes</w:t>
@@ -775,7 +813,7 @@
       <w:pPr>
         <w:numPr>
           <w:ilvl w:val="0"/>
-          <w:numId w:val="38"/>
+          <w:numId w:val="32"/>
         </w:numPr>
         <w:spacing w:after="240" w:before="240" w:line="276" w:lineRule="auto"/>
         <w:ind w:left="720" w:hanging="360"/>
@@ -797,7 +835,7 @@
       <w:pPr>
         <w:numPr>
           <w:ilvl w:val="0"/>
-          <w:numId w:val="38"/>
+          <w:numId w:val="32"/>
         </w:numPr>
         <w:spacing w:after="240" w:before="240" w:line="276" w:lineRule="auto"/>
         <w:ind w:left="720" w:hanging="360"/>
@@ -813,11 +851,6 @@
           <w:rtl w:val="0"/>
         </w:rPr>
         <w:t xml:space="preserve">Redefining research questions as requested by ARB</w:t>
-      </w:r>
-      <w:r>
-        <w:rPr>
-          <w:rtl w:val="0"/>
-        </w:rPr>
       </w:r>
     </w:p>
     <w:p>
@@ -852,7 +885,7 @@
           <w:szCs w:val="26"/>
         </w:rPr>
       </w:pPr>
-      <w:bookmarkStart w:colFirst="0" w:colLast="0" w:name="_thaih2jkmte6" w:id="3"/>
+      <w:bookmarkStart w:colFirst="0" w:colLast="0" w:name="_woq50mfv93dq" w:id="3"/>
       <w:bookmarkEnd w:id="3"/>
       <w:r>
         <w:rPr>
@@ -870,12 +903,14 @@
         <w:rPr>
           <w:rFonts w:ascii="Arial" w:cs="Arial" w:eastAsia="Arial" w:hAnsi="Arial"/>
           <w:b w:val="1"/>
+          <w:bCs w:val="1"/>
         </w:rPr>
       </w:pPr>
       <w:r>
         <w:rPr>
           <w:rFonts w:ascii="Arial" w:cs="Arial" w:eastAsia="Arial" w:hAnsi="Arial"/>
           <w:b w:val="1"/>
+          <w:bCs w:val="1"/>
           <w:rtl w:val="0"/>
         </w:rPr>
         <w:t xml:space="preserve">Tasks</w:t>
@@ -885,7 +920,7 @@
       <w:pPr>
         <w:numPr>
           <w:ilvl w:val="0"/>
-          <w:numId w:val="31"/>
+          <w:numId w:val="25"/>
         </w:numPr>
         <w:spacing w:after="0" w:before="240" w:line="276" w:lineRule="auto"/>
         <w:ind w:left="720" w:hanging="360"/>
@@ -905,7 +940,7 @@
       <w:pPr>
         <w:numPr>
           <w:ilvl w:val="0"/>
-          <w:numId w:val="31"/>
+          <w:numId w:val="25"/>
         </w:numPr>
         <w:spacing w:after="0" w:before="0" w:line="276" w:lineRule="auto"/>
         <w:ind w:left="720" w:hanging="360"/>
@@ -927,7 +962,7 @@
       <w:pPr>
         <w:numPr>
           <w:ilvl w:val="0"/>
-          <w:numId w:val="31"/>
+          <w:numId w:val="25"/>
         </w:numPr>
         <w:spacing w:after="0" w:before="0" w:line="276" w:lineRule="auto"/>
         <w:ind w:left="720" w:hanging="360"/>
@@ -949,7 +984,7 @@
       <w:pPr>
         <w:numPr>
           <w:ilvl w:val="0"/>
-          <w:numId w:val="31"/>
+          <w:numId w:val="25"/>
         </w:numPr>
         <w:spacing w:after="240" w:before="0" w:line="276" w:lineRule="auto"/>
         <w:ind w:left="720" w:hanging="360"/>
@@ -973,12 +1008,14 @@
         <w:rPr>
           <w:rFonts w:ascii="Arial" w:cs="Arial" w:eastAsia="Arial" w:hAnsi="Arial"/>
           <w:b w:val="1"/>
+          <w:bCs w:val="1"/>
         </w:rPr>
       </w:pPr>
       <w:r>
         <w:rPr>
           <w:rFonts w:ascii="Arial" w:cs="Arial" w:eastAsia="Arial" w:hAnsi="Arial"/>
           <w:b w:val="1"/>
+          <w:bCs w:val="1"/>
           <w:rtl w:val="0"/>
         </w:rPr>
         <w:t xml:space="preserve">Milestones</w:t>
@@ -988,7 +1025,7 @@
       <w:pPr>
         <w:numPr>
           <w:ilvl w:val="0"/>
-          <w:numId w:val="35"/>
+          <w:numId w:val="29"/>
         </w:numPr>
         <w:spacing w:after="0" w:before="240" w:line="276" w:lineRule="auto"/>
         <w:ind w:left="720" w:hanging="360"/>
@@ -1010,7 +1047,7 @@
       <w:pPr>
         <w:numPr>
           <w:ilvl w:val="0"/>
-          <w:numId w:val="35"/>
+          <w:numId w:val="29"/>
         </w:numPr>
         <w:spacing w:after="240" w:before="0" w:line="276" w:lineRule="auto"/>
         <w:ind w:left="720" w:hanging="360"/>
@@ -1056,15 +1093,17 @@
         <w:ind w:left="1440" w:hanging="360"/>
         <w:rPr>
           <w:rFonts w:ascii="Arial" w:cs="Arial" w:eastAsia="Arial" w:hAnsi="Arial"/>
+          <w:strike w:val="1"/>
           <w:sz w:val="26"/>
           <w:szCs w:val="26"/>
         </w:rPr>
       </w:pPr>
-      <w:bookmarkStart w:colFirst="0" w:colLast="0" w:name="_m67c9ugthtm1" w:id="4"/>
+      <w:bookmarkStart w:colFirst="0" w:colLast="0" w:name="_87eoqs2f5us" w:id="4"/>
       <w:bookmarkEnd w:id="4"/>
       <w:r>
         <w:rPr>
           <w:rFonts w:ascii="Arial" w:cs="Arial" w:eastAsia="Arial" w:hAnsi="Arial"/>
+          <w:strike w:val="1"/>
           <w:sz w:val="26"/>
           <w:szCs w:val="26"/>
           <w:rtl w:val="0"/>
@@ -1078,12 +1117,16 @@
         <w:rPr>
           <w:rFonts w:ascii="Arial" w:cs="Arial" w:eastAsia="Arial" w:hAnsi="Arial"/>
           <w:b w:val="1"/>
+          <w:bCs w:val="1"/>
+          <w:strike w:val="1"/>
         </w:rPr>
       </w:pPr>
       <w:r>
         <w:rPr>
           <w:rFonts w:ascii="Arial" w:cs="Arial" w:eastAsia="Arial" w:hAnsi="Arial"/>
           <w:b w:val="1"/>
+          <w:bCs w:val="1"/>
+          <w:strike w:val="1"/>
           <w:rtl w:val="0"/>
         </w:rPr>
         <w:t xml:space="preserve">Tasks</w:t>
@@ -1093,17 +1136,19 @@
       <w:pPr>
         <w:numPr>
           <w:ilvl w:val="0"/>
-          <w:numId w:val="26"/>
+          <w:numId w:val="19"/>
         </w:numPr>
         <w:spacing w:after="0" w:before="240" w:line="276" w:lineRule="auto"/>
         <w:ind w:left="720" w:hanging="360"/>
         <w:rPr>
           <w:rFonts w:ascii="Arial" w:cs="Arial" w:eastAsia="Arial" w:hAnsi="Arial"/>
-        </w:rPr>
-      </w:pPr>
-      <w:r>
-        <w:rPr>
-          <w:rFonts w:ascii="Arial" w:cs="Arial" w:eastAsia="Arial" w:hAnsi="Arial"/>
+          <w:strike w:val="1"/>
+        </w:rPr>
+      </w:pPr>
+      <w:r>
+        <w:rPr>
+          <w:rFonts w:ascii="Arial" w:cs="Arial" w:eastAsia="Arial" w:hAnsi="Arial"/>
+          <w:strike w:val="1"/>
           <w:rtl w:val="0"/>
         </w:rPr>
         <w:t xml:space="preserve">Complete IRB submission and incorporate any final suggestions from the Chair.</w:t>
@@ -1113,17 +1158,19 @@
       <w:pPr>
         <w:numPr>
           <w:ilvl w:val="0"/>
-          <w:numId w:val="26"/>
+          <w:numId w:val="19"/>
         </w:numPr>
         <w:spacing w:after="0" w:before="0" w:line="276" w:lineRule="auto"/>
         <w:ind w:left="720" w:hanging="360"/>
         <w:rPr>
           <w:rFonts w:ascii="Arial" w:cs="Arial" w:eastAsia="Arial" w:hAnsi="Arial"/>
-        </w:rPr>
-      </w:pPr>
-      <w:r>
-        <w:rPr>
-          <w:rFonts w:ascii="Arial" w:cs="Arial" w:eastAsia="Arial" w:hAnsi="Arial"/>
+          <w:strike w:val="1"/>
+        </w:rPr>
+      </w:pPr>
+      <w:r>
+        <w:rPr>
+          <w:rFonts w:ascii="Arial" w:cs="Arial" w:eastAsia="Arial" w:hAnsi="Arial"/>
+          <w:strike w:val="1"/>
           <w:rtl w:val="0"/>
         </w:rPr>
         <w:t xml:space="preserve">Begin Chapter 2: Literature Review, synthesizing domain-specific knowledge from all 26 fields.</w:t>
@@ -1133,17 +1180,19 @@
       <w:pPr>
         <w:numPr>
           <w:ilvl w:val="0"/>
-          <w:numId w:val="26"/>
+          <w:numId w:val="19"/>
         </w:numPr>
         <w:spacing w:after="0" w:before="0" w:line="276" w:lineRule="auto"/>
         <w:ind w:left="720" w:hanging="360"/>
         <w:rPr>
           <w:rFonts w:ascii="Arial" w:cs="Arial" w:eastAsia="Arial" w:hAnsi="Arial"/>
-        </w:rPr>
-      </w:pPr>
-      <w:r>
-        <w:rPr>
-          <w:rFonts w:ascii="Arial" w:cs="Arial" w:eastAsia="Arial" w:hAnsi="Arial"/>
+          <w:strike w:val="1"/>
+        </w:rPr>
+      </w:pPr>
+      <w:r>
+        <w:rPr>
+          <w:rFonts w:ascii="Arial" w:cs="Arial" w:eastAsia="Arial" w:hAnsi="Arial"/>
+          <w:strike w:val="1"/>
           <w:rtl w:val="0"/>
         </w:rPr>
         <w:t xml:space="preserve">Identify potential “challenging” fields where subject-matter expert feedback will be crucial.</w:t>
@@ -1153,17 +1202,19 @@
       <w:pPr>
         <w:numPr>
           <w:ilvl w:val="0"/>
-          <w:numId w:val="26"/>
+          <w:numId w:val="19"/>
         </w:numPr>
         <w:spacing w:after="240" w:before="0" w:line="276" w:lineRule="auto"/>
         <w:ind w:left="720" w:hanging="360"/>
         <w:rPr>
           <w:rFonts w:ascii="Arial" w:cs="Arial" w:eastAsia="Arial" w:hAnsi="Arial"/>
-        </w:rPr>
-      </w:pPr>
-      <w:r>
-        <w:rPr>
-          <w:rFonts w:ascii="Arial" w:cs="Arial" w:eastAsia="Arial" w:hAnsi="Arial"/>
+          <w:strike w:val="1"/>
+        </w:rPr>
+      </w:pPr>
+      <w:r>
+        <w:rPr>
+          <w:rFonts w:ascii="Arial" w:cs="Arial" w:eastAsia="Arial" w:hAnsi="Arial"/>
+          <w:strike w:val="1"/>
           <w:rtl w:val="0"/>
         </w:rPr>
         <w:t xml:space="preserve">Draft or refine your conceptual framework sections (accuracy, coherence, adaptability, domain knowledge).</w:t>
@@ -1175,12 +1226,16 @@
         <w:rPr>
           <w:rFonts w:ascii="Arial" w:cs="Arial" w:eastAsia="Arial" w:hAnsi="Arial"/>
           <w:b w:val="1"/>
+          <w:bCs w:val="1"/>
+          <w:strike w:val="1"/>
         </w:rPr>
       </w:pPr>
       <w:r>
         <w:rPr>
           <w:rFonts w:ascii="Arial" w:cs="Arial" w:eastAsia="Arial" w:hAnsi="Arial"/>
           <w:b w:val="1"/>
+          <w:bCs w:val="1"/>
+          <w:strike w:val="1"/>
           <w:rtl w:val="0"/>
         </w:rPr>
         <w:t xml:space="preserve">Milestones</w:t>
@@ -1190,17 +1245,19 @@
       <w:pPr>
         <w:numPr>
           <w:ilvl w:val="0"/>
-          <w:numId w:val="36"/>
+          <w:numId w:val="30"/>
         </w:numPr>
         <w:spacing w:after="0" w:before="240" w:line="276" w:lineRule="auto"/>
         <w:ind w:left="720" w:hanging="360"/>
         <w:rPr>
           <w:rFonts w:ascii="Arial" w:cs="Arial" w:eastAsia="Arial" w:hAnsi="Arial"/>
-        </w:rPr>
-      </w:pPr>
-      <w:r>
-        <w:rPr>
-          <w:rFonts w:ascii="Arial" w:cs="Arial" w:eastAsia="Arial" w:hAnsi="Arial"/>
+          <w:strike w:val="1"/>
+        </w:rPr>
+      </w:pPr>
+      <w:r>
+        <w:rPr>
+          <w:rFonts w:ascii="Arial" w:cs="Arial" w:eastAsia="Arial" w:hAnsi="Arial"/>
+          <w:strike w:val="1"/>
           <w:rtl w:val="0"/>
         </w:rPr>
         <w:t xml:space="preserve">IRB submitted.</w:t>
@@ -1210,17 +1267,19 @@
       <w:pPr>
         <w:numPr>
           <w:ilvl w:val="0"/>
-          <w:numId w:val="36"/>
+          <w:numId w:val="30"/>
         </w:numPr>
         <w:spacing w:after="240" w:before="0" w:line="276" w:lineRule="auto"/>
         <w:ind w:left="720" w:hanging="360"/>
         <w:rPr>
           <w:rFonts w:ascii="Arial" w:cs="Arial" w:eastAsia="Arial" w:hAnsi="Arial"/>
-        </w:rPr>
-      </w:pPr>
-      <w:r>
-        <w:rPr>
-          <w:rFonts w:ascii="Arial" w:cs="Arial" w:eastAsia="Arial" w:hAnsi="Arial"/>
+          <w:strike w:val="1"/>
+        </w:rPr>
+      </w:pPr>
+      <w:r>
+        <w:rPr>
+          <w:rFonts w:ascii="Arial" w:cs="Arial" w:eastAsia="Arial" w:hAnsi="Arial"/>
+          <w:strike w:val="1"/>
           <w:rtl w:val="0"/>
         </w:rPr>
         <w:t xml:space="preserve">Chapter 2 outline (themes, subheadings for each domain) created.</w:t>
@@ -1232,6 +1291,7 @@
         <w:ind w:left="1440" w:hanging="360"/>
         <w:rPr>
           <w:rFonts w:ascii="Arial" w:cs="Arial" w:eastAsia="Arial" w:hAnsi="Arial"/>
+          <w:strike w:val="1"/>
         </w:rPr>
       </w:pPr>
       <w:r>
@@ -1254,15 +1314,17 @@
         <w:ind w:left="1440" w:hanging="360"/>
         <w:rPr>
           <w:rFonts w:ascii="Arial" w:cs="Arial" w:eastAsia="Arial" w:hAnsi="Arial"/>
+          <w:strike w:val="1"/>
           <w:sz w:val="26"/>
           <w:szCs w:val="26"/>
         </w:rPr>
       </w:pPr>
-      <w:bookmarkStart w:colFirst="0" w:colLast="0" w:name="_msm4wl58p2rt" w:id="5"/>
+      <w:bookmarkStart w:colFirst="0" w:colLast="0" w:name="_i5cqs98fccvj" w:id="5"/>
       <w:bookmarkEnd w:id="5"/>
       <w:r>
         <w:rPr>
           <w:rFonts w:ascii="Arial" w:cs="Arial" w:eastAsia="Arial" w:hAnsi="Arial"/>
+          <w:strike w:val="1"/>
           <w:sz w:val="26"/>
           <w:szCs w:val="26"/>
           <w:rtl w:val="0"/>
@@ -1276,12 +1338,16 @@
         <w:rPr>
           <w:rFonts w:ascii="Arial" w:cs="Arial" w:eastAsia="Arial" w:hAnsi="Arial"/>
           <w:b w:val="1"/>
+          <w:bCs w:val="1"/>
+          <w:strike w:val="1"/>
         </w:rPr>
       </w:pPr>
       <w:r>
         <w:rPr>
           <w:rFonts w:ascii="Arial" w:cs="Arial" w:eastAsia="Arial" w:hAnsi="Arial"/>
           <w:b w:val="1"/>
+          <w:bCs w:val="1"/>
+          <w:strike w:val="1"/>
           <w:rtl w:val="0"/>
         </w:rPr>
         <w:t xml:space="preserve">Tasks</w:t>
@@ -1291,17 +1357,19 @@
       <w:pPr>
         <w:numPr>
           <w:ilvl w:val="0"/>
-          <w:numId w:val="18"/>
+          <w:numId w:val="10"/>
         </w:numPr>
         <w:spacing w:after="0" w:before="240" w:line="276" w:lineRule="auto"/>
         <w:ind w:left="720" w:hanging="360"/>
         <w:rPr>
           <w:rFonts w:ascii="Arial" w:cs="Arial" w:eastAsia="Arial" w:hAnsi="Arial"/>
-        </w:rPr>
-      </w:pPr>
-      <w:r>
-        <w:rPr>
-          <w:rFonts w:ascii="Arial" w:cs="Arial" w:eastAsia="Arial" w:hAnsi="Arial"/>
+          <w:strike w:val="1"/>
+        </w:rPr>
+      </w:pPr>
+      <w:r>
+        <w:rPr>
+          <w:rFonts w:ascii="Arial" w:cs="Arial" w:eastAsia="Arial" w:hAnsi="Arial"/>
+          <w:strike w:val="1"/>
           <w:rtl w:val="0"/>
         </w:rPr>
         <w:t xml:space="preserve">Analyze each curated abstract systematically; produce at least one question per abstract via the low-parameter LLM (Phase One core activity).</w:t>
@@ -1311,17 +1379,19 @@
       <w:pPr>
         <w:numPr>
           <w:ilvl w:val="0"/>
-          <w:numId w:val="18"/>
+          <w:numId w:val="10"/>
         </w:numPr>
         <w:spacing w:after="0" w:before="0" w:line="276" w:lineRule="auto"/>
         <w:ind w:left="720" w:hanging="360"/>
         <w:rPr>
           <w:rFonts w:ascii="Arial" w:cs="Arial" w:eastAsia="Arial" w:hAnsi="Arial"/>
-        </w:rPr>
-      </w:pPr>
-      <w:r>
-        <w:rPr>
-          <w:rFonts w:ascii="Arial" w:cs="Arial" w:eastAsia="Arial" w:hAnsi="Arial"/>
+          <w:strike w:val="1"/>
+        </w:rPr>
+      </w:pPr>
+      <w:r>
+        <w:rPr>
+          <w:rFonts w:ascii="Arial" w:cs="Arial" w:eastAsia="Arial" w:hAnsi="Arial"/>
+          <w:strike w:val="1"/>
           <w:rtl w:val="0"/>
         </w:rPr>
         <w:t xml:space="preserve">Begin writing key sections of Chapter 2 with a deeper focus on domain knowledge.</w:t>
@@ -1331,17 +1401,19 @@
       <w:pPr>
         <w:numPr>
           <w:ilvl w:val="0"/>
-          <w:numId w:val="18"/>
+          <w:numId w:val="10"/>
         </w:numPr>
         <w:spacing w:after="240" w:before="0" w:line="276" w:lineRule="auto"/>
         <w:ind w:left="720" w:hanging="360"/>
         <w:rPr>
           <w:rFonts w:ascii="Arial" w:cs="Arial" w:eastAsia="Arial" w:hAnsi="Arial"/>
-        </w:rPr>
-      </w:pPr>
-      <w:r>
-        <w:rPr>
-          <w:rFonts w:ascii="Arial" w:cs="Arial" w:eastAsia="Arial" w:hAnsi="Arial"/>
+          <w:strike w:val="1"/>
+        </w:rPr>
+      </w:pPr>
+      <w:r>
+        <w:rPr>
+          <w:rFonts w:ascii="Arial" w:cs="Arial" w:eastAsia="Arial" w:hAnsi="Arial"/>
+          <w:strike w:val="1"/>
           <w:rtl w:val="0"/>
         </w:rPr>
         <w:t xml:space="preserve">Continue meeting with the Chair for feedback.</w:t>
@@ -1353,12 +1425,16 @@
         <w:rPr>
           <w:rFonts w:ascii="Arial" w:cs="Arial" w:eastAsia="Arial" w:hAnsi="Arial"/>
           <w:b w:val="1"/>
+          <w:bCs w:val="1"/>
+          <w:strike w:val="1"/>
         </w:rPr>
       </w:pPr>
       <w:r>
         <w:rPr>
           <w:rFonts w:ascii="Arial" w:cs="Arial" w:eastAsia="Arial" w:hAnsi="Arial"/>
           <w:b w:val="1"/>
+          <w:bCs w:val="1"/>
+          <w:strike w:val="1"/>
           <w:rtl w:val="0"/>
         </w:rPr>
         <w:t xml:space="preserve">Milestones</w:t>
@@ -1368,17 +1444,19 @@
       <w:pPr>
         <w:numPr>
           <w:ilvl w:val="0"/>
-          <w:numId w:val="20"/>
+          <w:numId w:val="13"/>
         </w:numPr>
         <w:spacing w:after="0" w:before="240" w:line="276" w:lineRule="auto"/>
         <w:ind w:left="720" w:hanging="360"/>
         <w:rPr>
           <w:rFonts w:ascii="Arial" w:cs="Arial" w:eastAsia="Arial" w:hAnsi="Arial"/>
-        </w:rPr>
-      </w:pPr>
-      <w:r>
-        <w:rPr>
-          <w:rFonts w:ascii="Arial" w:cs="Arial" w:eastAsia="Arial" w:hAnsi="Arial"/>
+          <w:strike w:val="1"/>
+        </w:rPr>
+      </w:pPr>
+      <w:r>
+        <w:rPr>
+          <w:rFonts w:ascii="Arial" w:cs="Arial" w:eastAsia="Arial" w:hAnsi="Arial"/>
+          <w:strike w:val="1"/>
           <w:rtl w:val="0"/>
         </w:rPr>
         <w:t xml:space="preserve">Completed a set of domain-specific questions in multiple fields.</w:t>
@@ -1388,17 +1466,19 @@
       <w:pPr>
         <w:numPr>
           <w:ilvl w:val="0"/>
-          <w:numId w:val="20"/>
+          <w:numId w:val="13"/>
         </w:numPr>
         <w:spacing w:after="240" w:before="0" w:line="276" w:lineRule="auto"/>
         <w:ind w:left="720" w:hanging="360"/>
         <w:rPr>
           <w:rFonts w:ascii="Arial" w:cs="Arial" w:eastAsia="Arial" w:hAnsi="Arial"/>
-        </w:rPr>
-      </w:pPr>
-      <w:r>
-        <w:rPr>
-          <w:rFonts w:ascii="Arial" w:cs="Arial" w:eastAsia="Arial" w:hAnsi="Arial"/>
+          <w:strike w:val="1"/>
+        </w:rPr>
+      </w:pPr>
+      <w:r>
+        <w:rPr>
+          <w:rFonts w:ascii="Arial" w:cs="Arial" w:eastAsia="Arial" w:hAnsi="Arial"/>
+          <w:strike w:val="1"/>
           <w:rtl w:val="0"/>
         </w:rPr>
         <w:t xml:space="preserve">Draft segments in Chapter 2 for each significant domain theme.</w:t>
@@ -1410,6 +1490,7 @@
         <w:ind w:left="1440" w:hanging="360"/>
         <w:rPr>
           <w:rFonts w:ascii="Arial" w:cs="Arial" w:eastAsia="Arial" w:hAnsi="Arial"/>
+          <w:strike w:val="1"/>
         </w:rPr>
       </w:pPr>
       <w:r>
@@ -1432,15 +1513,17 @@
         <w:ind w:left="1440" w:hanging="360"/>
         <w:rPr>
           <w:rFonts w:ascii="Arial" w:cs="Arial" w:eastAsia="Arial" w:hAnsi="Arial"/>
+          <w:strike w:val="1"/>
           <w:sz w:val="26"/>
           <w:szCs w:val="26"/>
         </w:rPr>
       </w:pPr>
-      <w:bookmarkStart w:colFirst="0" w:colLast="0" w:name="_991a50sw8fqj" w:id="6"/>
+      <w:bookmarkStart w:colFirst="0" w:colLast="0" w:name="_fft388z660in" w:id="6"/>
       <w:bookmarkEnd w:id="6"/>
       <w:r>
         <w:rPr>
           <w:rFonts w:ascii="Arial" w:cs="Arial" w:eastAsia="Arial" w:hAnsi="Arial"/>
+          <w:strike w:val="1"/>
           <w:sz w:val="26"/>
           <w:szCs w:val="26"/>
           <w:rtl w:val="0"/>
@@ -1454,12 +1537,16 @@
         <w:rPr>
           <w:rFonts w:ascii="Arial" w:cs="Arial" w:eastAsia="Arial" w:hAnsi="Arial"/>
           <w:b w:val="1"/>
+          <w:bCs w:val="1"/>
+          <w:strike w:val="1"/>
         </w:rPr>
       </w:pPr>
       <w:r>
         <w:rPr>
           <w:rFonts w:ascii="Arial" w:cs="Arial" w:eastAsia="Arial" w:hAnsi="Arial"/>
           <w:b w:val="1"/>
+          <w:bCs w:val="1"/>
+          <w:strike w:val="1"/>
           <w:rtl w:val="0"/>
         </w:rPr>
         <w:t xml:space="preserve">Tasks</w:t>
@@ -1469,17 +1556,19 @@
       <w:pPr>
         <w:numPr>
           <w:ilvl w:val="0"/>
-          <w:numId w:val="21"/>
+          <w:numId w:val="14"/>
         </w:numPr>
         <w:spacing w:after="0" w:before="240" w:line="276" w:lineRule="auto"/>
         <w:ind w:left="720" w:hanging="360"/>
         <w:rPr>
           <w:rFonts w:ascii="Arial" w:cs="Arial" w:eastAsia="Arial" w:hAnsi="Arial"/>
-        </w:rPr>
-      </w:pPr>
-      <w:r>
-        <w:rPr>
-          <w:rFonts w:ascii="Arial" w:cs="Arial" w:eastAsia="Arial" w:hAnsi="Arial"/>
+          <w:strike w:val="1"/>
+        </w:rPr>
+      </w:pPr>
+      <w:r>
+        <w:rPr>
+          <w:rFonts w:ascii="Arial" w:cs="Arial" w:eastAsia="Arial" w:hAnsi="Arial"/>
+          <w:strike w:val="1"/>
           <w:rtl w:val="0"/>
         </w:rPr>
         <w:t xml:space="preserve">Finalize the roster of LLMs to be tested.</w:t>
@@ -1489,17 +1578,19 @@
       <w:pPr>
         <w:numPr>
           <w:ilvl w:val="0"/>
-          <w:numId w:val="21"/>
+          <w:numId w:val="14"/>
         </w:numPr>
         <w:spacing w:after="0" w:before="0" w:line="276" w:lineRule="auto"/>
         <w:ind w:left="720" w:hanging="360"/>
         <w:rPr>
           <w:rFonts w:ascii="Arial" w:cs="Arial" w:eastAsia="Arial" w:hAnsi="Arial"/>
-        </w:rPr>
-      </w:pPr>
-      <w:r>
-        <w:rPr>
-          <w:rFonts w:ascii="Arial" w:cs="Arial" w:eastAsia="Arial" w:hAnsi="Arial"/>
+          <w:strike w:val="1"/>
+        </w:rPr>
+      </w:pPr>
+      <w:r>
+        <w:rPr>
+          <w:rFonts w:ascii="Arial" w:cs="Arial" w:eastAsia="Arial" w:hAnsi="Arial"/>
+          <w:strike w:val="1"/>
           <w:rtl w:val="0"/>
         </w:rPr>
         <w:t xml:space="preserve">Document the evaluation rubrics and pilot them in a small subset of domains.</w:t>
@@ -1509,17 +1600,19 @@
       <w:pPr>
         <w:numPr>
           <w:ilvl w:val="0"/>
-          <w:numId w:val="21"/>
+          <w:numId w:val="14"/>
         </w:numPr>
         <w:spacing w:after="0" w:before="0" w:line="276" w:lineRule="auto"/>
         <w:ind w:left="720" w:hanging="360"/>
         <w:rPr>
           <w:rFonts w:ascii="Arial" w:cs="Arial" w:eastAsia="Arial" w:hAnsi="Arial"/>
-        </w:rPr>
-      </w:pPr>
-      <w:r>
-        <w:rPr>
-          <w:rFonts w:ascii="Arial" w:cs="Arial" w:eastAsia="Arial" w:hAnsi="Arial"/>
+          <w:strike w:val="1"/>
+        </w:rPr>
+      </w:pPr>
+      <w:r>
+        <w:rPr>
+          <w:rFonts w:ascii="Arial" w:cs="Arial" w:eastAsia="Arial" w:hAnsi="Arial"/>
+          <w:strike w:val="1"/>
           <w:rtl w:val="0"/>
         </w:rPr>
         <w:t xml:space="preserve">If IRB feedback is back, address any requested revisions.</w:t>
@@ -1529,17 +1622,19 @@
       <w:pPr>
         <w:numPr>
           <w:ilvl w:val="0"/>
-          <w:numId w:val="21"/>
+          <w:numId w:val="14"/>
         </w:numPr>
         <w:spacing w:after="240" w:before="0" w:line="276" w:lineRule="auto"/>
         <w:ind w:left="720" w:hanging="360"/>
         <w:rPr>
           <w:rFonts w:ascii="Arial" w:cs="Arial" w:eastAsia="Arial" w:hAnsi="Arial"/>
-        </w:rPr>
-      </w:pPr>
-      <w:r>
-        <w:rPr>
-          <w:rFonts w:ascii="Arial" w:cs="Arial" w:eastAsia="Arial" w:hAnsi="Arial"/>
+          <w:strike w:val="1"/>
+        </w:rPr>
+      </w:pPr>
+      <w:r>
+        <w:rPr>
+          <w:rFonts w:ascii="Arial" w:cs="Arial" w:eastAsia="Arial" w:hAnsi="Arial"/>
+          <w:strike w:val="1"/>
           <w:rtl w:val="0"/>
         </w:rPr>
         <w:t xml:space="preserve">Start writing about your methodology (Chapter 3) to capture the planned LLM comparison approach.</w:t>
@@ -1551,12 +1646,16 @@
         <w:rPr>
           <w:rFonts w:ascii="Arial" w:cs="Arial" w:eastAsia="Arial" w:hAnsi="Arial"/>
           <w:b w:val="1"/>
+          <w:bCs w:val="1"/>
+          <w:strike w:val="1"/>
         </w:rPr>
       </w:pPr>
       <w:r>
         <w:rPr>
           <w:rFonts w:ascii="Arial" w:cs="Arial" w:eastAsia="Arial" w:hAnsi="Arial"/>
           <w:b w:val="1"/>
+          <w:bCs w:val="1"/>
+          <w:strike w:val="1"/>
           <w:rtl w:val="0"/>
         </w:rPr>
         <w:t xml:space="preserve">Milestones</w:t>
@@ -1566,17 +1665,19 @@
       <w:pPr>
         <w:numPr>
           <w:ilvl w:val="0"/>
-          <w:numId w:val="9"/>
+          <w:numId w:val="38"/>
         </w:numPr>
         <w:spacing w:after="0" w:before="240" w:line="276" w:lineRule="auto"/>
         <w:ind w:left="720" w:hanging="360"/>
         <w:rPr>
           <w:rFonts w:ascii="Arial" w:cs="Arial" w:eastAsia="Arial" w:hAnsi="Arial"/>
-        </w:rPr>
-      </w:pPr>
-      <w:r>
-        <w:rPr>
-          <w:rFonts w:ascii="Arial" w:cs="Arial" w:eastAsia="Arial" w:hAnsi="Arial"/>
+          <w:strike w:val="1"/>
+        </w:rPr>
+      </w:pPr>
+      <w:r>
+        <w:rPr>
+          <w:rFonts w:ascii="Arial" w:cs="Arial" w:eastAsia="Arial" w:hAnsi="Arial"/>
+          <w:strike w:val="1"/>
           <w:rtl w:val="0"/>
         </w:rPr>
         <w:t xml:space="preserve">IRB approval in hand (if revisions are needed).</w:t>
@@ -1586,17 +1687,19 @@
       <w:pPr>
         <w:numPr>
           <w:ilvl w:val="0"/>
-          <w:numId w:val="9"/>
+          <w:numId w:val="38"/>
         </w:numPr>
         <w:spacing w:after="240" w:before="0" w:line="276" w:lineRule="auto"/>
         <w:ind w:left="720" w:hanging="360"/>
         <w:rPr>
           <w:rFonts w:ascii="Arial" w:cs="Arial" w:eastAsia="Arial" w:hAnsi="Arial"/>
-        </w:rPr>
-      </w:pPr>
-      <w:r>
-        <w:rPr>
-          <w:rFonts w:ascii="Arial" w:cs="Arial" w:eastAsia="Arial" w:hAnsi="Arial"/>
+          <w:strike w:val="1"/>
+        </w:rPr>
+      </w:pPr>
+      <w:r>
+        <w:rPr>
+          <w:rFonts w:ascii="Arial" w:cs="Arial" w:eastAsia="Arial" w:hAnsi="Arial"/>
+          <w:strike w:val="1"/>
           <w:rtl w:val="0"/>
         </w:rPr>
         <w:t xml:space="preserve">Shortlist of LLMs, rubrics, and pilot test results in 1–3 domains.</w:t>
@@ -1608,6 +1711,7 @@
         <w:ind w:left="1440" w:hanging="360"/>
         <w:rPr>
           <w:rFonts w:ascii="Arial" w:cs="Arial" w:eastAsia="Arial" w:hAnsi="Arial"/>
+          <w:strike w:val="1"/>
         </w:rPr>
       </w:pPr>
       <w:r>
@@ -1630,15 +1734,17 @@
         <w:ind w:left="1440" w:hanging="360"/>
         <w:rPr>
           <w:rFonts w:ascii="Arial" w:cs="Arial" w:eastAsia="Arial" w:hAnsi="Arial"/>
+          <w:strike w:val="1"/>
           <w:sz w:val="26"/>
           <w:szCs w:val="26"/>
         </w:rPr>
       </w:pPr>
-      <w:bookmarkStart w:colFirst="0" w:colLast="0" w:name="_db70a1ebr3vo" w:id="7"/>
+      <w:bookmarkStart w:colFirst="0" w:colLast="0" w:name="_wketta5hzhoi" w:id="7"/>
       <w:bookmarkEnd w:id="7"/>
       <w:r>
         <w:rPr>
           <w:rFonts w:ascii="Arial" w:cs="Arial" w:eastAsia="Arial" w:hAnsi="Arial"/>
+          <w:strike w:val="1"/>
           <w:sz w:val="26"/>
           <w:szCs w:val="26"/>
           <w:rtl w:val="0"/>
@@ -1652,12 +1758,16 @@
         <w:rPr>
           <w:rFonts w:ascii="Arial" w:cs="Arial" w:eastAsia="Arial" w:hAnsi="Arial"/>
           <w:b w:val="1"/>
+          <w:bCs w:val="1"/>
+          <w:strike w:val="1"/>
         </w:rPr>
       </w:pPr>
       <w:r>
         <w:rPr>
           <w:rFonts w:ascii="Arial" w:cs="Arial" w:eastAsia="Arial" w:hAnsi="Arial"/>
           <w:b w:val="1"/>
+          <w:bCs w:val="1"/>
+          <w:strike w:val="1"/>
           <w:rtl w:val="0"/>
         </w:rPr>
         <w:t xml:space="preserve">Tasks</w:t>
@@ -1667,17 +1777,19 @@
       <w:pPr>
         <w:numPr>
           <w:ilvl w:val="0"/>
-          <w:numId w:val="15"/>
+          <w:numId w:val="7"/>
         </w:numPr>
         <w:spacing w:after="0" w:before="240" w:line="276" w:lineRule="auto"/>
         <w:ind w:left="720" w:hanging="360"/>
         <w:rPr>
           <w:rFonts w:ascii="Arial" w:cs="Arial" w:eastAsia="Arial" w:hAnsi="Arial"/>
-        </w:rPr>
-      </w:pPr>
-      <w:r>
-        <w:rPr>
-          <w:rFonts w:ascii="Arial" w:cs="Arial" w:eastAsia="Arial" w:hAnsi="Arial"/>
+          <w:strike w:val="1"/>
+        </w:rPr>
+      </w:pPr>
+      <w:r>
+        <w:rPr>
+          <w:rFonts w:ascii="Arial" w:cs="Arial" w:eastAsia="Arial" w:hAnsi="Arial"/>
+          <w:strike w:val="1"/>
           <w:rtl w:val="0"/>
         </w:rPr>
         <w:t xml:space="preserve">Evaluate LLMs with the curated domain-specific questions.</w:t>
@@ -1687,17 +1799,19 @@
       <w:pPr>
         <w:numPr>
           <w:ilvl w:val="0"/>
-          <w:numId w:val="15"/>
+          <w:numId w:val="7"/>
         </w:numPr>
         <w:spacing w:after="0" w:before="0" w:line="276" w:lineRule="auto"/>
         <w:ind w:left="720" w:hanging="360"/>
         <w:rPr>
           <w:rFonts w:ascii="Arial" w:cs="Arial" w:eastAsia="Arial" w:hAnsi="Arial"/>
-        </w:rPr>
-      </w:pPr>
-      <w:r>
-        <w:rPr>
-          <w:rFonts w:ascii="Arial" w:cs="Arial" w:eastAsia="Arial" w:hAnsi="Arial"/>
+          <w:strike w:val="1"/>
+        </w:rPr>
+      </w:pPr>
+      <w:r>
+        <w:rPr>
+          <w:rFonts w:ascii="Arial" w:cs="Arial" w:eastAsia="Arial" w:hAnsi="Arial"/>
+          <w:strike w:val="1"/>
           <w:rtl w:val="0"/>
         </w:rPr>
         <w:t xml:space="preserve">Collect quantitative/qualitative data on correctness, depth of analysis, and clarity.</w:t>
@@ -1707,17 +1821,19 @@
       <w:pPr>
         <w:numPr>
           <w:ilvl w:val="0"/>
-          <w:numId w:val="15"/>
+          <w:numId w:val="7"/>
         </w:numPr>
         <w:spacing w:after="0" w:before="0" w:line="276" w:lineRule="auto"/>
         <w:ind w:left="720" w:hanging="360"/>
         <w:rPr>
           <w:rFonts w:ascii="Arial" w:cs="Arial" w:eastAsia="Arial" w:hAnsi="Arial"/>
-        </w:rPr>
-      </w:pPr>
-      <w:r>
-        <w:rPr>
-          <w:rFonts w:ascii="Arial" w:cs="Arial" w:eastAsia="Arial" w:hAnsi="Arial"/>
+          <w:strike w:val="1"/>
+        </w:rPr>
+      </w:pPr>
+      <w:r>
+        <w:rPr>
+          <w:rFonts w:ascii="Arial" w:cs="Arial" w:eastAsia="Arial" w:hAnsi="Arial"/>
+          <w:strike w:val="1"/>
           <w:rtl w:val="0"/>
         </w:rPr>
         <w:t xml:space="preserve">Draft the “Methods” section fully (Chapter 3).</w:t>
@@ -1727,17 +1843,19 @@
       <w:pPr>
         <w:numPr>
           <w:ilvl w:val="0"/>
-          <w:numId w:val="15"/>
+          <w:numId w:val="7"/>
         </w:numPr>
         <w:spacing w:after="240" w:before="0" w:line="276" w:lineRule="auto"/>
         <w:ind w:left="720" w:hanging="360"/>
         <w:rPr>
           <w:rFonts w:ascii="Arial" w:cs="Arial" w:eastAsia="Arial" w:hAnsi="Arial"/>
-        </w:rPr>
-      </w:pPr>
-      <w:r>
-        <w:rPr>
-          <w:rFonts w:ascii="Arial" w:cs="Arial" w:eastAsia="Arial" w:hAnsi="Arial"/>
+          <w:strike w:val="1"/>
+        </w:rPr>
+      </w:pPr>
+      <w:r>
+        <w:rPr>
+          <w:rFonts w:ascii="Arial" w:cs="Arial" w:eastAsia="Arial" w:hAnsi="Arial"/>
+          <w:strike w:val="1"/>
           <w:rtl w:val="0"/>
         </w:rPr>
         <w:t xml:space="preserve">Continuously refine the pilot approach based on any IRB constraints.</w:t>
@@ -1749,12 +1867,16 @@
         <w:rPr>
           <w:rFonts w:ascii="Arial" w:cs="Arial" w:eastAsia="Arial" w:hAnsi="Arial"/>
           <w:b w:val="1"/>
+          <w:bCs w:val="1"/>
+          <w:strike w:val="1"/>
         </w:rPr>
       </w:pPr>
       <w:r>
         <w:rPr>
           <w:rFonts w:ascii="Arial" w:cs="Arial" w:eastAsia="Arial" w:hAnsi="Arial"/>
           <w:b w:val="1"/>
+          <w:bCs w:val="1"/>
+          <w:strike w:val="1"/>
           <w:rtl w:val="0"/>
         </w:rPr>
         <w:t xml:space="preserve">Milestones</w:t>
@@ -1764,17 +1886,19 @@
       <w:pPr>
         <w:numPr>
           <w:ilvl w:val="0"/>
-          <w:numId w:val="24"/>
+          <w:numId w:val="17"/>
         </w:numPr>
         <w:spacing w:after="0" w:before="240" w:line="276" w:lineRule="auto"/>
         <w:ind w:left="720" w:hanging="360"/>
         <w:rPr>
           <w:rFonts w:ascii="Arial" w:cs="Arial" w:eastAsia="Arial" w:hAnsi="Arial"/>
-        </w:rPr>
-      </w:pPr>
-      <w:r>
-        <w:rPr>
-          <w:rFonts w:ascii="Arial" w:cs="Arial" w:eastAsia="Arial" w:hAnsi="Arial"/>
+          <w:strike w:val="1"/>
+        </w:rPr>
+      </w:pPr>
+      <w:r>
+        <w:rPr>
+          <w:rFonts w:ascii="Arial" w:cs="Arial" w:eastAsia="Arial" w:hAnsi="Arial"/>
+          <w:strike w:val="1"/>
           <w:rtl w:val="0"/>
         </w:rPr>
         <w:t xml:space="preserve">Completion of baseline scoring in a few domains.</w:t>
@@ -1784,17 +1908,19 @@
       <w:pPr>
         <w:numPr>
           <w:ilvl w:val="0"/>
-          <w:numId w:val="24"/>
+          <w:numId w:val="17"/>
         </w:numPr>
         <w:spacing w:after="240" w:before="0" w:line="276" w:lineRule="auto"/>
         <w:ind w:left="720" w:hanging="360"/>
         <w:rPr>
           <w:rFonts w:ascii="Arial" w:cs="Arial" w:eastAsia="Arial" w:hAnsi="Arial"/>
-        </w:rPr>
-      </w:pPr>
-      <w:r>
-        <w:rPr>
-          <w:rFonts w:ascii="Arial" w:cs="Arial" w:eastAsia="Arial" w:hAnsi="Arial"/>
+          <w:strike w:val="1"/>
+        </w:rPr>
+      </w:pPr>
+      <w:r>
+        <w:rPr>
+          <w:rFonts w:ascii="Arial" w:cs="Arial" w:eastAsia="Arial" w:hAnsi="Arial"/>
+          <w:strike w:val="1"/>
           <w:rtl w:val="0"/>
         </w:rPr>
         <w:t xml:space="preserve">Chapter 3 first draft (experiment setup, data gathering plan, reliability checks).</w:t>
@@ -1806,6 +1932,7 @@
         <w:ind w:left="1440" w:hanging="360"/>
         <w:rPr>
           <w:rFonts w:ascii="Arial" w:cs="Arial" w:eastAsia="Arial" w:hAnsi="Arial"/>
+          <w:strike w:val="1"/>
         </w:rPr>
       </w:pPr>
       <w:r>
@@ -1828,15 +1955,17 @@
         <w:ind w:left="1440" w:hanging="360"/>
         <w:rPr>
           <w:rFonts w:ascii="Arial" w:cs="Arial" w:eastAsia="Arial" w:hAnsi="Arial"/>
+          <w:strike w:val="1"/>
           <w:sz w:val="26"/>
           <w:szCs w:val="26"/>
         </w:rPr>
       </w:pPr>
-      <w:bookmarkStart w:colFirst="0" w:colLast="0" w:name="_23zvtck94p1y" w:id="8"/>
+      <w:bookmarkStart w:colFirst="0" w:colLast="0" w:name="_pxvmftbbfv9g" w:id="8"/>
       <w:bookmarkEnd w:id="8"/>
       <w:r>
         <w:rPr>
           <w:rFonts w:ascii="Arial" w:cs="Arial" w:eastAsia="Arial" w:hAnsi="Arial"/>
+          <w:strike w:val="1"/>
           <w:sz w:val="26"/>
           <w:szCs w:val="26"/>
           <w:rtl w:val="0"/>
@@ -1850,12 +1979,16 @@
         <w:rPr>
           <w:rFonts w:ascii="Arial" w:cs="Arial" w:eastAsia="Arial" w:hAnsi="Arial"/>
           <w:b w:val="1"/>
+          <w:bCs w:val="1"/>
+          <w:strike w:val="1"/>
         </w:rPr>
       </w:pPr>
       <w:r>
         <w:rPr>
           <w:rFonts w:ascii="Arial" w:cs="Arial" w:eastAsia="Arial" w:hAnsi="Arial"/>
           <w:b w:val="1"/>
+          <w:bCs w:val="1"/>
+          <w:strike w:val="1"/>
           <w:rtl w:val="0"/>
         </w:rPr>
         <w:t xml:space="preserve">Tasks</w:t>
@@ -1865,17 +1998,19 @@
       <w:pPr>
         <w:numPr>
           <w:ilvl w:val="0"/>
-          <w:numId w:val="4"/>
+          <w:numId w:val="33"/>
         </w:numPr>
         <w:spacing w:after="0" w:before="240" w:line="276" w:lineRule="auto"/>
         <w:ind w:left="720" w:hanging="360"/>
         <w:rPr>
           <w:rFonts w:ascii="Arial" w:cs="Arial" w:eastAsia="Arial" w:hAnsi="Arial"/>
-        </w:rPr>
-      </w:pPr>
-      <w:r>
-        <w:rPr>
-          <w:rFonts w:ascii="Arial" w:cs="Arial" w:eastAsia="Arial" w:hAnsi="Arial"/>
+          <w:strike w:val="1"/>
+        </w:rPr>
+      </w:pPr>
+      <w:r>
+        <w:rPr>
+          <w:rFonts w:ascii="Arial" w:cs="Arial" w:eastAsia="Arial" w:hAnsi="Arial"/>
+          <w:strike w:val="1"/>
           <w:rtl w:val="0"/>
         </w:rPr>
         <w:t xml:space="preserve">Continue refining Chapter 2.</w:t>
@@ -1885,17 +2020,19 @@
       <w:pPr>
         <w:numPr>
           <w:ilvl w:val="0"/>
-          <w:numId w:val="4"/>
+          <w:numId w:val="33"/>
         </w:numPr>
         <w:spacing w:after="0" w:before="0" w:line="276" w:lineRule="auto"/>
         <w:ind w:left="720" w:hanging="360"/>
         <w:rPr>
           <w:rFonts w:ascii="Arial" w:cs="Arial" w:eastAsia="Arial" w:hAnsi="Arial"/>
-        </w:rPr>
-      </w:pPr>
-      <w:r>
-        <w:rPr>
-          <w:rFonts w:ascii="Arial" w:cs="Arial" w:eastAsia="Arial" w:hAnsi="Arial"/>
+          <w:strike w:val="1"/>
+        </w:rPr>
+      </w:pPr>
+      <w:r>
+        <w:rPr>
+          <w:rFonts w:ascii="Arial" w:cs="Arial" w:eastAsia="Arial" w:hAnsi="Arial"/>
+          <w:strike w:val="1"/>
           <w:rtl w:val="0"/>
         </w:rPr>
         <w:t xml:space="preserve">Start verifying the approach to inter-rater reliability, ANOVA, and confidence interval calculations.</w:t>
@@ -1905,17 +2042,19 @@
       <w:pPr>
         <w:numPr>
           <w:ilvl w:val="0"/>
-          <w:numId w:val="4"/>
+          <w:numId w:val="33"/>
         </w:numPr>
         <w:spacing w:after="0" w:before="0" w:line="276" w:lineRule="auto"/>
         <w:ind w:left="720" w:hanging="360"/>
         <w:rPr>
           <w:rFonts w:ascii="Arial" w:cs="Arial" w:eastAsia="Arial" w:hAnsi="Arial"/>
-        </w:rPr>
-      </w:pPr>
-      <w:r>
-        <w:rPr>
-          <w:rFonts w:ascii="Arial" w:cs="Arial" w:eastAsia="Arial" w:hAnsi="Arial"/>
+          <w:strike w:val="1"/>
+        </w:rPr>
+      </w:pPr>
+      <w:r>
+        <w:rPr>
+          <w:rFonts w:ascii="Arial" w:cs="Arial" w:eastAsia="Arial" w:hAnsi="Arial"/>
+          <w:strike w:val="1"/>
           <w:rtl w:val="0"/>
         </w:rPr>
         <w:t xml:space="preserve">Ensure data collection and annotation processes are consistent.</w:t>
@@ -1925,17 +2064,19 @@
       <w:pPr>
         <w:numPr>
           <w:ilvl w:val="0"/>
-          <w:numId w:val="4"/>
+          <w:numId w:val="33"/>
         </w:numPr>
         <w:spacing w:after="240" w:before="0" w:line="276" w:lineRule="auto"/>
         <w:ind w:left="720" w:hanging="360"/>
         <w:rPr>
           <w:rFonts w:ascii="Arial" w:cs="Arial" w:eastAsia="Arial" w:hAnsi="Arial"/>
-        </w:rPr>
-      </w:pPr>
-      <w:r>
-        <w:rPr>
-          <w:rFonts w:ascii="Arial" w:cs="Arial" w:eastAsia="Arial" w:hAnsi="Arial"/>
+          <w:strike w:val="1"/>
+        </w:rPr>
+      </w:pPr>
+      <w:r>
+        <w:rPr>
+          <w:rFonts w:ascii="Arial" w:cs="Arial" w:eastAsia="Arial" w:hAnsi="Arial"/>
+          <w:strike w:val="1"/>
           <w:rtl w:val="0"/>
         </w:rPr>
         <w:t xml:space="preserve">Check with subject-matter experts for initial feedback in at least one domain.</w:t>
@@ -1947,12 +2088,16 @@
         <w:rPr>
           <w:rFonts w:ascii="Arial" w:cs="Arial" w:eastAsia="Arial" w:hAnsi="Arial"/>
           <w:b w:val="1"/>
+          <w:bCs w:val="1"/>
+          <w:strike w:val="1"/>
         </w:rPr>
       </w:pPr>
       <w:r>
         <w:rPr>
           <w:rFonts w:ascii="Arial" w:cs="Arial" w:eastAsia="Arial" w:hAnsi="Arial"/>
           <w:b w:val="1"/>
+          <w:bCs w:val="1"/>
+          <w:strike w:val="1"/>
           <w:rtl w:val="0"/>
         </w:rPr>
         <w:t xml:space="preserve">Milestones</w:t>
@@ -1962,17 +2107,19 @@
       <w:pPr>
         <w:numPr>
           <w:ilvl w:val="0"/>
-          <w:numId w:val="27"/>
+          <w:numId w:val="20"/>
         </w:numPr>
         <w:spacing w:after="0" w:before="240" w:line="276" w:lineRule="auto"/>
         <w:ind w:left="720" w:hanging="360"/>
         <w:rPr>
           <w:rFonts w:ascii="Arial" w:cs="Arial" w:eastAsia="Arial" w:hAnsi="Arial"/>
-        </w:rPr>
-      </w:pPr>
-      <w:r>
-        <w:rPr>
-          <w:rFonts w:ascii="Arial" w:cs="Arial" w:eastAsia="Arial" w:hAnsi="Arial"/>
+          <w:strike w:val="1"/>
+        </w:rPr>
+      </w:pPr>
+      <w:r>
+        <w:rPr>
+          <w:rFonts w:ascii="Arial" w:cs="Arial" w:eastAsia="Arial" w:hAnsi="Arial"/>
+          <w:strike w:val="1"/>
           <w:rtl w:val="0"/>
         </w:rPr>
         <w:t xml:space="preserve">Substantial progress in Chapter 2 so that it aligns with the newly emerging methodology.</w:t>
@@ -1982,17 +2129,19 @@
       <w:pPr>
         <w:numPr>
           <w:ilvl w:val="0"/>
-          <w:numId w:val="27"/>
+          <w:numId w:val="20"/>
         </w:numPr>
         <w:spacing w:after="240" w:before="0" w:line="276" w:lineRule="auto"/>
         <w:ind w:left="720" w:hanging="360"/>
         <w:rPr>
           <w:rFonts w:ascii="Arial" w:cs="Arial" w:eastAsia="Arial" w:hAnsi="Arial"/>
-        </w:rPr>
-      </w:pPr>
-      <w:r>
-        <w:rPr>
-          <w:rFonts w:ascii="Arial" w:cs="Arial" w:eastAsia="Arial" w:hAnsi="Arial"/>
+          <w:strike w:val="1"/>
+        </w:rPr>
+      </w:pPr>
+      <w:r>
+        <w:rPr>
+          <w:rFonts w:ascii="Arial" w:cs="Arial" w:eastAsia="Arial" w:hAnsi="Arial"/>
+          <w:strike w:val="1"/>
           <w:rtl w:val="0"/>
         </w:rPr>
         <w:t xml:space="preserve">Defined a statistical approach for your final Phase Three analyses.</w:t>
@@ -2004,6 +2153,7 @@
         <w:ind w:left="1440" w:hanging="360"/>
         <w:rPr>
           <w:rFonts w:ascii="Arial" w:cs="Arial" w:eastAsia="Arial" w:hAnsi="Arial"/>
+          <w:strike w:val="1"/>
         </w:rPr>
       </w:pPr>
       <w:r>
@@ -2026,15 +2176,17 @@
         <w:ind w:left="1440" w:hanging="360"/>
         <w:rPr>
           <w:rFonts w:ascii="Arial" w:cs="Arial" w:eastAsia="Arial" w:hAnsi="Arial"/>
+          <w:strike w:val="1"/>
           <w:sz w:val="26"/>
           <w:szCs w:val="26"/>
         </w:rPr>
       </w:pPr>
-      <w:bookmarkStart w:colFirst="0" w:colLast="0" w:name="_ut2d38iacf7s" w:id="9"/>
+      <w:bookmarkStart w:colFirst="0" w:colLast="0" w:name="_79l1wxfdf0k7" w:id="9"/>
       <w:bookmarkEnd w:id="9"/>
       <w:r>
         <w:rPr>
           <w:rFonts w:ascii="Arial" w:cs="Arial" w:eastAsia="Arial" w:hAnsi="Arial"/>
+          <w:strike w:val="1"/>
           <w:sz w:val="26"/>
           <w:szCs w:val="26"/>
           <w:rtl w:val="0"/>
@@ -2048,12 +2200,16 @@
         <w:rPr>
           <w:rFonts w:ascii="Arial" w:cs="Arial" w:eastAsia="Arial" w:hAnsi="Arial"/>
           <w:b w:val="1"/>
+          <w:bCs w:val="1"/>
+          <w:strike w:val="1"/>
         </w:rPr>
       </w:pPr>
       <w:r>
         <w:rPr>
           <w:rFonts w:ascii="Arial" w:cs="Arial" w:eastAsia="Arial" w:hAnsi="Arial"/>
           <w:b w:val="1"/>
+          <w:bCs w:val="1"/>
+          <w:strike w:val="1"/>
           <w:rtl w:val="0"/>
         </w:rPr>
         <w:t xml:space="preserve">Tasks</w:t>
@@ -2063,17 +2219,19 @@
       <w:pPr>
         <w:numPr>
           <w:ilvl w:val="0"/>
-          <w:numId w:val="32"/>
+          <w:numId w:val="26"/>
         </w:numPr>
         <w:spacing w:after="0" w:before="240" w:line="276" w:lineRule="auto"/>
         <w:ind w:left="720" w:hanging="360"/>
         <w:rPr>
           <w:rFonts w:ascii="Arial" w:cs="Arial" w:eastAsia="Arial" w:hAnsi="Arial"/>
-        </w:rPr>
-      </w:pPr>
-      <w:r>
-        <w:rPr>
-          <w:rFonts w:ascii="Arial" w:cs="Arial" w:eastAsia="Arial" w:hAnsi="Arial"/>
+          <w:strike w:val="1"/>
+        </w:rPr>
+      </w:pPr>
+      <w:r>
+        <w:rPr>
+          <w:rFonts w:ascii="Arial" w:cs="Arial" w:eastAsia="Arial" w:hAnsi="Arial"/>
+          <w:strike w:val="1"/>
           <w:rtl w:val="0"/>
         </w:rPr>
         <w:t xml:space="preserve">If your program uses semester deliverables, please submit updated Chapters 1 and 2, plus a partial Chapter 3, to the Chair or committee.</w:t>
@@ -2083,17 +2241,19 @@
       <w:pPr>
         <w:numPr>
           <w:ilvl w:val="0"/>
-          <w:numId w:val="32"/>
+          <w:numId w:val="26"/>
         </w:numPr>
         <w:spacing w:after="0" w:before="0" w:line="276" w:lineRule="auto"/>
         <w:ind w:left="720" w:hanging="360"/>
         <w:rPr>
           <w:rFonts w:ascii="Arial" w:cs="Arial" w:eastAsia="Arial" w:hAnsi="Arial"/>
-        </w:rPr>
-      </w:pPr>
-      <w:r>
-        <w:rPr>
-          <w:rFonts w:ascii="Arial" w:cs="Arial" w:eastAsia="Arial" w:hAnsi="Arial"/>
+          <w:strike w:val="1"/>
+        </w:rPr>
+      </w:pPr>
+      <w:r>
+        <w:rPr>
+          <w:rFonts w:ascii="Arial" w:cs="Arial" w:eastAsia="Arial" w:hAnsi="Arial"/>
+          <w:strike w:val="1"/>
           <w:rtl w:val="0"/>
         </w:rPr>
         <w:t xml:space="preserve">Revisit or finalize additional references (aiming for 50–60 total).</w:t>
@@ -2103,17 +2263,19 @@
       <w:pPr>
         <w:numPr>
           <w:ilvl w:val="0"/>
-          <w:numId w:val="32"/>
+          <w:numId w:val="26"/>
         </w:numPr>
         <w:spacing w:after="240" w:before="0" w:line="276" w:lineRule="auto"/>
         <w:ind w:left="720" w:hanging="360"/>
         <w:rPr>
           <w:rFonts w:ascii="Arial" w:cs="Arial" w:eastAsia="Arial" w:hAnsi="Arial"/>
-        </w:rPr>
-      </w:pPr>
-      <w:r>
-        <w:rPr>
-          <w:rFonts w:ascii="Arial" w:cs="Arial" w:eastAsia="Arial" w:hAnsi="Arial"/>
+          <w:strike w:val="1"/>
+        </w:rPr>
+      </w:pPr>
+      <w:r>
+        <w:rPr>
+          <w:rFonts w:ascii="Arial" w:cs="Arial" w:eastAsia="Arial" w:hAnsi="Arial"/>
+          <w:strike w:val="1"/>
           <w:rtl w:val="0"/>
         </w:rPr>
         <w:t xml:space="preserve">Refine any IRB or logistical updates.</w:t>
@@ -2125,12 +2287,16 @@
         <w:rPr>
           <w:rFonts w:ascii="Arial" w:cs="Arial" w:eastAsia="Arial" w:hAnsi="Arial"/>
           <w:b w:val="1"/>
+          <w:bCs w:val="1"/>
+          <w:strike w:val="1"/>
         </w:rPr>
       </w:pPr>
       <w:r>
         <w:rPr>
           <w:rFonts w:ascii="Arial" w:cs="Arial" w:eastAsia="Arial" w:hAnsi="Arial"/>
           <w:b w:val="1"/>
+          <w:bCs w:val="1"/>
+          <w:strike w:val="1"/>
           <w:rtl w:val="0"/>
         </w:rPr>
         <w:t xml:space="preserve">Milestones</w:t>
@@ -2140,17 +2306,19 @@
       <w:pPr>
         <w:numPr>
           <w:ilvl w:val="0"/>
-          <w:numId w:val="33"/>
+          <w:numId w:val="27"/>
         </w:numPr>
         <w:spacing w:after="0" w:before="240" w:line="276" w:lineRule="auto"/>
         <w:ind w:left="720" w:hanging="360"/>
         <w:rPr>
           <w:rFonts w:ascii="Arial" w:cs="Arial" w:eastAsia="Arial" w:hAnsi="Arial"/>
-        </w:rPr>
-      </w:pPr>
-      <w:r>
-        <w:rPr>
-          <w:rFonts w:ascii="Arial" w:cs="Arial" w:eastAsia="Arial" w:hAnsi="Arial"/>
+          <w:strike w:val="1"/>
+        </w:rPr>
+      </w:pPr>
+      <w:r>
+        <w:rPr>
+          <w:rFonts w:ascii="Arial" w:cs="Arial" w:eastAsia="Arial" w:hAnsi="Arial"/>
+          <w:strike w:val="1"/>
           <w:rtl w:val="0"/>
         </w:rPr>
         <w:t xml:space="preserve">Chair's acceptance of Chapters 1–2.</w:t>
@@ -2160,17 +2328,19 @@
       <w:pPr>
         <w:numPr>
           <w:ilvl w:val="0"/>
-          <w:numId w:val="33"/>
+          <w:numId w:val="27"/>
         </w:numPr>
         <w:spacing w:after="240" w:before="0" w:line="276" w:lineRule="auto"/>
         <w:ind w:left="720" w:hanging="360"/>
         <w:rPr>
           <w:rFonts w:ascii="Arial" w:cs="Arial" w:eastAsia="Arial" w:hAnsi="Arial"/>
-        </w:rPr>
-      </w:pPr>
-      <w:r>
-        <w:rPr>
-          <w:rFonts w:ascii="Arial" w:cs="Arial" w:eastAsia="Arial" w:hAnsi="Arial"/>
+          <w:strike w:val="1"/>
+        </w:rPr>
+      </w:pPr>
+      <w:r>
+        <w:rPr>
+          <w:rFonts w:ascii="Arial" w:cs="Arial" w:eastAsia="Arial" w:hAnsi="Arial"/>
+          <w:strike w:val="1"/>
           <w:rtl w:val="0"/>
         </w:rPr>
         <w:t xml:space="preserve">Confirmation that IRB protocols are stable and data collection is authorized.</w:t>
@@ -2182,6 +2352,7 @@
         <w:ind w:left="1440" w:hanging="360"/>
         <w:rPr>
           <w:rFonts w:ascii="Arial" w:cs="Arial" w:eastAsia="Arial" w:hAnsi="Arial"/>
+          <w:strike w:val="1"/>
         </w:rPr>
       </w:pPr>
       <w:r>
@@ -2204,15 +2375,17 @@
         <w:ind w:left="1440" w:hanging="360"/>
         <w:rPr>
           <w:rFonts w:ascii="Arial" w:cs="Arial" w:eastAsia="Arial" w:hAnsi="Arial"/>
+          <w:strike w:val="1"/>
           <w:sz w:val="34"/>
           <w:szCs w:val="34"/>
         </w:rPr>
       </w:pPr>
-      <w:bookmarkStart w:colFirst="0" w:colLast="0" w:name="_929wlh4xihfx" w:id="10"/>
+      <w:bookmarkStart w:colFirst="0" w:colLast="0" w:name="_ra8pwux4xnx5" w:id="10"/>
       <w:bookmarkEnd w:id="10"/>
       <w:r>
         <w:rPr>
           <w:rFonts w:ascii="Arial" w:cs="Arial" w:eastAsia="Arial" w:hAnsi="Arial"/>
+          <w:strike w:val="1"/>
           <w:sz w:val="34"/>
           <w:szCs w:val="34"/>
           <w:rtl w:val="0"/>
@@ -2229,15 +2402,17 @@
         <w:ind w:left="1440" w:hanging="360"/>
         <w:rPr>
           <w:rFonts w:ascii="Arial" w:cs="Arial" w:eastAsia="Arial" w:hAnsi="Arial"/>
+          <w:strike w:val="1"/>
           <w:sz w:val="26"/>
           <w:szCs w:val="26"/>
         </w:rPr>
       </w:pPr>
-      <w:bookmarkStart w:colFirst="0" w:colLast="0" w:name="_5oz50isppcc1" w:id="11"/>
+      <w:bookmarkStart w:colFirst="0" w:colLast="0" w:name="_84r6w86nasa" w:id="11"/>
       <w:bookmarkEnd w:id="11"/>
       <w:r>
         <w:rPr>
           <w:rFonts w:ascii="Arial" w:cs="Arial" w:eastAsia="Arial" w:hAnsi="Arial"/>
+          <w:strike w:val="1"/>
           <w:sz w:val="26"/>
           <w:szCs w:val="26"/>
           <w:rtl w:val="0"/>
@@ -2251,12 +2426,16 @@
         <w:rPr>
           <w:rFonts w:ascii="Arial" w:cs="Arial" w:eastAsia="Arial" w:hAnsi="Arial"/>
           <w:b w:val="1"/>
+          <w:bCs w:val="1"/>
+          <w:strike w:val="1"/>
         </w:rPr>
       </w:pPr>
       <w:r>
         <w:rPr>
           <w:rFonts w:ascii="Arial" w:cs="Arial" w:eastAsia="Arial" w:hAnsi="Arial"/>
           <w:b w:val="1"/>
+          <w:bCs w:val="1"/>
+          <w:strike w:val="1"/>
           <w:rtl w:val="0"/>
         </w:rPr>
         <w:t xml:space="preserve">Tasks</w:t>
@@ -2266,17 +2445,19 @@
       <w:pPr>
         <w:numPr>
           <w:ilvl w:val="0"/>
-          <w:numId w:val="2"/>
+          <w:numId w:val="12"/>
         </w:numPr>
         <w:spacing w:after="0" w:before="240" w:line="276" w:lineRule="auto"/>
         <w:ind w:left="720" w:hanging="360"/>
         <w:rPr>
           <w:rFonts w:ascii="Arial" w:cs="Arial" w:eastAsia="Arial" w:hAnsi="Arial"/>
-        </w:rPr>
-      </w:pPr>
-      <w:r>
-        <w:rPr>
-          <w:rFonts w:ascii="Arial" w:cs="Arial" w:eastAsia="Arial" w:hAnsi="Arial"/>
+          <w:strike w:val="1"/>
+        </w:rPr>
+      </w:pPr>
+      <w:r>
+        <w:rPr>
+          <w:rFonts w:ascii="Arial" w:cs="Arial" w:eastAsia="Arial" w:hAnsi="Arial"/>
+          <w:strike w:val="1"/>
           <w:rtl w:val="0"/>
         </w:rPr>
         <w:t xml:space="preserve">Execute the final set of evaluations across all 26 fields.</w:t>
@@ -2286,17 +2467,19 @@
       <w:pPr>
         <w:numPr>
           <w:ilvl w:val="0"/>
-          <w:numId w:val="2"/>
+          <w:numId w:val="12"/>
         </w:numPr>
         <w:spacing w:after="0" w:before="0" w:line="276" w:lineRule="auto"/>
         <w:ind w:left="720" w:hanging="360"/>
         <w:rPr>
           <w:rFonts w:ascii="Arial" w:cs="Arial" w:eastAsia="Arial" w:hAnsi="Arial"/>
-        </w:rPr>
-      </w:pPr>
-      <w:r>
-        <w:rPr>
-          <w:rFonts w:ascii="Arial" w:cs="Arial" w:eastAsia="Arial" w:hAnsi="Arial"/>
+          <w:strike w:val="1"/>
+        </w:rPr>
+      </w:pPr>
+      <w:r>
+        <w:rPr>
+          <w:rFonts w:ascii="Arial" w:cs="Arial" w:eastAsia="Arial" w:hAnsi="Arial"/>
+          <w:strike w:val="1"/>
           <w:rtl w:val="0"/>
         </w:rPr>
         <w:t xml:space="preserve">Collect detailed results (true/false/possibly true/possibly false).</w:t>
@@ -2306,17 +2489,19 @@
       <w:pPr>
         <w:numPr>
           <w:ilvl w:val="0"/>
-          <w:numId w:val="2"/>
+          <w:numId w:val="12"/>
         </w:numPr>
         <w:spacing w:after="240" w:before="0" w:line="276" w:lineRule="auto"/>
         <w:ind w:left="720" w:hanging="360"/>
         <w:rPr>
           <w:rFonts w:ascii="Arial" w:cs="Arial" w:eastAsia="Arial" w:hAnsi="Arial"/>
-        </w:rPr>
-      </w:pPr>
-      <w:r>
-        <w:rPr>
-          <w:rFonts w:ascii="Arial" w:cs="Arial" w:eastAsia="Arial" w:hAnsi="Arial"/>
+          <w:strike w:val="1"/>
+        </w:rPr>
+      </w:pPr>
+      <w:r>
+        <w:rPr>
+          <w:rFonts w:ascii="Arial" w:cs="Arial" w:eastAsia="Arial" w:hAnsi="Arial"/>
+          <w:strike w:val="1"/>
           <w:rtl w:val="0"/>
         </w:rPr>
         <w:t xml:space="preserve">Ensure thorough data logging for later statistical analysis.</w:t>
@@ -2328,12 +2513,16 @@
         <w:rPr>
           <w:rFonts w:ascii="Arial" w:cs="Arial" w:eastAsia="Arial" w:hAnsi="Arial"/>
           <w:b w:val="1"/>
+          <w:bCs w:val="1"/>
+          <w:strike w:val="1"/>
         </w:rPr>
       </w:pPr>
       <w:r>
         <w:rPr>
           <w:rFonts w:ascii="Arial" w:cs="Arial" w:eastAsia="Arial" w:hAnsi="Arial"/>
           <w:b w:val="1"/>
+          <w:bCs w:val="1"/>
+          <w:strike w:val="1"/>
           <w:rtl w:val="0"/>
         </w:rPr>
         <w:t xml:space="preserve">Milestones</w:t>
@@ -2343,17 +2532,19 @@
       <w:pPr>
         <w:numPr>
           <w:ilvl w:val="0"/>
-          <w:numId w:val="3"/>
+          <w:numId w:val="23"/>
         </w:numPr>
         <w:spacing w:after="0" w:before="240" w:line="276" w:lineRule="auto"/>
         <w:ind w:left="720" w:hanging="360"/>
         <w:rPr>
           <w:rFonts w:ascii="Arial" w:cs="Arial" w:eastAsia="Arial" w:hAnsi="Arial"/>
-        </w:rPr>
-      </w:pPr>
-      <w:r>
-        <w:rPr>
-          <w:rFonts w:ascii="Arial" w:cs="Arial" w:eastAsia="Arial" w:hAnsi="Arial"/>
+          <w:strike w:val="1"/>
+        </w:rPr>
+      </w:pPr>
+      <w:r>
+        <w:rPr>
+          <w:rFonts w:ascii="Arial" w:cs="Arial" w:eastAsia="Arial" w:hAnsi="Arial"/>
+          <w:strike w:val="1"/>
           <w:rtl w:val="0"/>
         </w:rPr>
         <w:t xml:space="preserve">Dataset of LLM responses with preliminary scoring.</w:t>
@@ -2363,17 +2554,19 @@
       <w:pPr>
         <w:numPr>
           <w:ilvl w:val="0"/>
-          <w:numId w:val="3"/>
+          <w:numId w:val="23"/>
         </w:numPr>
         <w:spacing w:after="240" w:before="0" w:line="276" w:lineRule="auto"/>
         <w:ind w:left="720" w:hanging="360"/>
         <w:rPr>
           <w:rFonts w:ascii="Arial" w:cs="Arial" w:eastAsia="Arial" w:hAnsi="Arial"/>
-        </w:rPr>
-      </w:pPr>
-      <w:r>
-        <w:rPr>
-          <w:rFonts w:ascii="Arial" w:cs="Arial" w:eastAsia="Arial" w:hAnsi="Arial"/>
+          <w:strike w:val="1"/>
+        </w:rPr>
+      </w:pPr>
+      <w:r>
+        <w:rPr>
+          <w:rFonts w:ascii="Arial" w:cs="Arial" w:eastAsia="Arial" w:hAnsi="Arial"/>
+          <w:strike w:val="1"/>
           <w:rtl w:val="0"/>
         </w:rPr>
         <w:t xml:space="preserve">Ongoing weekly Chair check-ins.</w:t>
@@ -2385,6 +2578,7 @@
         <w:ind w:left="1440" w:hanging="360"/>
         <w:rPr>
           <w:rFonts w:ascii="Arial" w:cs="Arial" w:eastAsia="Arial" w:hAnsi="Arial"/>
+          <w:strike w:val="1"/>
         </w:rPr>
       </w:pPr>
       <w:r>
@@ -2407,15 +2601,17 @@
         <w:ind w:left="1440" w:hanging="360"/>
         <w:rPr>
           <w:rFonts w:ascii="Arial" w:cs="Arial" w:eastAsia="Arial" w:hAnsi="Arial"/>
+          <w:strike w:val="1"/>
           <w:sz w:val="26"/>
           <w:szCs w:val="26"/>
         </w:rPr>
       </w:pPr>
-      <w:bookmarkStart w:colFirst="0" w:colLast="0" w:name="_7i6ummyf8h35" w:id="12"/>
+      <w:bookmarkStart w:colFirst="0" w:colLast="0" w:name="_xo9iy55sx9b7" w:id="12"/>
       <w:bookmarkEnd w:id="12"/>
       <w:r>
         <w:rPr>
           <w:rFonts w:ascii="Arial" w:cs="Arial" w:eastAsia="Arial" w:hAnsi="Arial"/>
+          <w:strike w:val="1"/>
           <w:sz w:val="26"/>
           <w:szCs w:val="26"/>
           <w:rtl w:val="0"/>
@@ -2429,12 +2625,16 @@
         <w:rPr>
           <w:rFonts w:ascii="Arial" w:cs="Arial" w:eastAsia="Arial" w:hAnsi="Arial"/>
           <w:b w:val="1"/>
+          <w:bCs w:val="1"/>
+          <w:strike w:val="1"/>
         </w:rPr>
       </w:pPr>
       <w:r>
         <w:rPr>
           <w:rFonts w:ascii="Arial" w:cs="Arial" w:eastAsia="Arial" w:hAnsi="Arial"/>
           <w:b w:val="1"/>
+          <w:bCs w:val="1"/>
+          <w:strike w:val="1"/>
           <w:rtl w:val="0"/>
         </w:rPr>
         <w:t xml:space="preserve">Tasks</w:t>
@@ -2444,17 +2644,19 @@
       <w:pPr>
         <w:numPr>
           <w:ilvl w:val="0"/>
-          <w:numId w:val="25"/>
+          <w:numId w:val="18"/>
         </w:numPr>
         <w:spacing w:after="0" w:before="240" w:line="276" w:lineRule="auto"/>
         <w:ind w:left="720" w:hanging="360"/>
         <w:rPr>
           <w:rFonts w:ascii="Arial" w:cs="Arial" w:eastAsia="Arial" w:hAnsi="Arial"/>
-        </w:rPr>
-      </w:pPr>
-      <w:r>
-        <w:rPr>
-          <w:rFonts w:ascii="Arial" w:cs="Arial" w:eastAsia="Arial" w:hAnsi="Arial"/>
+          <w:strike w:val="1"/>
+        </w:rPr>
+      </w:pPr>
+      <w:r>
+        <w:rPr>
+          <w:rFonts w:ascii="Arial" w:cs="Arial" w:eastAsia="Arial" w:hAnsi="Arial"/>
+          <w:strike w:val="1"/>
           <w:rtl w:val="0"/>
         </w:rPr>
         <w:t xml:space="preserve">Finalize methodology text (Chapter 3).</w:t>
@@ -2464,17 +2666,19 @@
       <w:pPr>
         <w:numPr>
           <w:ilvl w:val="0"/>
-          <w:numId w:val="25"/>
+          <w:numId w:val="18"/>
         </w:numPr>
         <w:spacing w:after="0" w:before="0" w:line="276" w:lineRule="auto"/>
         <w:ind w:left="720" w:hanging="360"/>
         <w:rPr>
           <w:rFonts w:ascii="Arial" w:cs="Arial" w:eastAsia="Arial" w:hAnsi="Arial"/>
-        </w:rPr>
-      </w:pPr>
-      <w:r>
-        <w:rPr>
-          <w:rFonts w:ascii="Arial" w:cs="Arial" w:eastAsia="Arial" w:hAnsi="Arial"/>
+          <w:strike w:val="1"/>
+        </w:rPr>
+      </w:pPr>
+      <w:r>
+        <w:rPr>
+          <w:rFonts w:ascii="Arial" w:cs="Arial" w:eastAsia="Arial" w:hAnsi="Arial"/>
+          <w:strike w:val="1"/>
           <w:rtl w:val="0"/>
         </w:rPr>
         <w:t xml:space="preserve">Begin drafting Chapter 4, focusing on raw results.</w:t>
@@ -2484,17 +2688,19 @@
       <w:pPr>
         <w:numPr>
           <w:ilvl w:val="0"/>
-          <w:numId w:val="25"/>
+          <w:numId w:val="18"/>
         </w:numPr>
         <w:spacing w:after="240" w:before="0" w:line="276" w:lineRule="auto"/>
         <w:ind w:left="720" w:hanging="360"/>
         <w:rPr>
           <w:rFonts w:ascii="Arial" w:cs="Arial" w:eastAsia="Arial" w:hAnsi="Arial"/>
-        </w:rPr>
-      </w:pPr>
-      <w:r>
-        <w:rPr>
-          <w:rFonts w:ascii="Arial" w:cs="Arial" w:eastAsia="Arial" w:hAnsi="Arial"/>
+          <w:strike w:val="1"/>
+        </w:rPr>
+      </w:pPr>
+      <w:r>
+        <w:rPr>
+          <w:rFonts w:ascii="Arial" w:cs="Arial" w:eastAsia="Arial" w:hAnsi="Arial"/>
+          <w:strike w:val="1"/>
           <w:rtl w:val="0"/>
         </w:rPr>
         <w:t xml:space="preserve">Prepare or conduct advanced reliability tests (Miller, 2024) to see if multiple scorers align.</w:t>
@@ -2506,12 +2712,16 @@
         <w:rPr>
           <w:rFonts w:ascii="Arial" w:cs="Arial" w:eastAsia="Arial" w:hAnsi="Arial"/>
           <w:b w:val="1"/>
+          <w:bCs w:val="1"/>
+          <w:strike w:val="1"/>
         </w:rPr>
       </w:pPr>
       <w:r>
         <w:rPr>
           <w:rFonts w:ascii="Arial" w:cs="Arial" w:eastAsia="Arial" w:hAnsi="Arial"/>
           <w:b w:val="1"/>
+          <w:bCs w:val="1"/>
+          <w:strike w:val="1"/>
           <w:rtl w:val="0"/>
         </w:rPr>
         <w:t xml:space="preserve">Milestones</w:t>
@@ -2521,17 +2731,19 @@
       <w:pPr>
         <w:numPr>
           <w:ilvl w:val="0"/>
-          <w:numId w:val="23"/>
+          <w:numId w:val="16"/>
         </w:numPr>
         <w:spacing w:after="0" w:before="240" w:line="276" w:lineRule="auto"/>
         <w:ind w:left="720" w:hanging="360"/>
         <w:rPr>
           <w:rFonts w:ascii="Arial" w:cs="Arial" w:eastAsia="Arial" w:hAnsi="Arial"/>
-        </w:rPr>
-      </w:pPr>
-      <w:r>
-        <w:rPr>
-          <w:rFonts w:ascii="Arial" w:cs="Arial" w:eastAsia="Arial" w:hAnsi="Arial"/>
+          <w:strike w:val="1"/>
+        </w:rPr>
+      </w:pPr>
+      <w:r>
+        <w:rPr>
+          <w:rFonts w:ascii="Arial" w:cs="Arial" w:eastAsia="Arial" w:hAnsi="Arial"/>
+          <w:strike w:val="1"/>
           <w:rtl w:val="0"/>
         </w:rPr>
         <w:t xml:space="preserve">Draft of Chapter 4 with initial results.</w:t>
@@ -2541,17 +2753,19 @@
       <w:pPr>
         <w:numPr>
           <w:ilvl w:val="0"/>
-          <w:numId w:val="23"/>
+          <w:numId w:val="16"/>
         </w:numPr>
         <w:spacing w:after="240" w:before="0" w:line="276" w:lineRule="auto"/>
         <w:ind w:left="720" w:hanging="360"/>
         <w:rPr>
           <w:rFonts w:ascii="Arial" w:cs="Arial" w:eastAsia="Arial" w:hAnsi="Arial"/>
-        </w:rPr>
-      </w:pPr>
-      <w:r>
-        <w:rPr>
-          <w:rFonts w:ascii="Arial" w:cs="Arial" w:eastAsia="Arial" w:hAnsi="Arial"/>
+          <w:strike w:val="1"/>
+        </w:rPr>
+      </w:pPr>
+      <w:r>
+        <w:rPr>
+          <w:rFonts w:ascii="Arial" w:cs="Arial" w:eastAsia="Arial" w:hAnsi="Arial"/>
+          <w:strike w:val="1"/>
           <w:rtl w:val="0"/>
         </w:rPr>
         <w:t xml:space="preserve">Full dataset ready for statistical Phase Three.</w:t>
@@ -2563,6 +2777,7 @@
         <w:ind w:left="1440" w:hanging="360"/>
         <w:rPr>
           <w:rFonts w:ascii="Arial" w:cs="Arial" w:eastAsia="Arial" w:hAnsi="Arial"/>
+          <w:strike w:val="1"/>
         </w:rPr>
       </w:pPr>
       <w:r>
@@ -2585,15 +2800,17 @@
         <w:ind w:left="1440" w:hanging="360"/>
         <w:rPr>
           <w:rFonts w:ascii="Arial" w:cs="Arial" w:eastAsia="Arial" w:hAnsi="Arial"/>
+          <w:strike w:val="1"/>
           <w:sz w:val="34"/>
           <w:szCs w:val="34"/>
         </w:rPr>
       </w:pPr>
-      <w:bookmarkStart w:colFirst="0" w:colLast="0" w:name="_cqp2m85tpyz8" w:id="13"/>
+      <w:bookmarkStart w:colFirst="0" w:colLast="0" w:name="_rj0r5ji470sk" w:id="13"/>
       <w:bookmarkEnd w:id="13"/>
       <w:r>
         <w:rPr>
           <w:rFonts w:ascii="Arial" w:cs="Arial" w:eastAsia="Arial" w:hAnsi="Arial"/>
+          <w:strike w:val="1"/>
           <w:sz w:val="34"/>
           <w:szCs w:val="34"/>
           <w:rtl w:val="0"/>
@@ -2610,15 +2827,17 @@
         <w:ind w:left="1440" w:hanging="360"/>
         <w:rPr>
           <w:rFonts w:ascii="Arial" w:cs="Arial" w:eastAsia="Arial" w:hAnsi="Arial"/>
+          <w:strike w:val="1"/>
           <w:sz w:val="26"/>
           <w:szCs w:val="26"/>
         </w:rPr>
       </w:pPr>
-      <w:bookmarkStart w:colFirst="0" w:colLast="0" w:name="_kxv6qa7vs3z9" w:id="14"/>
+      <w:bookmarkStart w:colFirst="0" w:colLast="0" w:name="_tm81etgvneej" w:id="14"/>
       <w:bookmarkEnd w:id="14"/>
       <w:r>
         <w:rPr>
           <w:rFonts w:ascii="Arial" w:cs="Arial" w:eastAsia="Arial" w:hAnsi="Arial"/>
+          <w:strike w:val="1"/>
           <w:sz w:val="26"/>
           <w:szCs w:val="26"/>
           <w:rtl w:val="0"/>
@@ -2632,12 +2851,16 @@
         <w:rPr>
           <w:rFonts w:ascii="Arial" w:cs="Arial" w:eastAsia="Arial" w:hAnsi="Arial"/>
           <w:b w:val="1"/>
+          <w:bCs w:val="1"/>
+          <w:strike w:val="1"/>
         </w:rPr>
       </w:pPr>
       <w:r>
         <w:rPr>
           <w:rFonts w:ascii="Arial" w:cs="Arial" w:eastAsia="Arial" w:hAnsi="Arial"/>
           <w:b w:val="1"/>
+          <w:bCs w:val="1"/>
+          <w:strike w:val="1"/>
           <w:rtl w:val="0"/>
         </w:rPr>
         <w:t xml:space="preserve">Tasks</w:t>
@@ -2647,17 +2870,19 @@
       <w:pPr>
         <w:numPr>
           <w:ilvl w:val="0"/>
-          <w:numId w:val="16"/>
+          <w:numId w:val="8"/>
         </w:numPr>
         <w:spacing w:after="0" w:before="240" w:line="276" w:lineRule="auto"/>
         <w:ind w:left="720" w:hanging="360"/>
         <w:rPr>
           <w:rFonts w:ascii="Arial" w:cs="Arial" w:eastAsia="Arial" w:hAnsi="Arial"/>
-        </w:rPr>
-      </w:pPr>
-      <w:r>
-        <w:rPr>
-          <w:rFonts w:ascii="Arial" w:cs="Arial" w:eastAsia="Arial" w:hAnsi="Arial"/>
+          <w:strike w:val="1"/>
+        </w:rPr>
+      </w:pPr>
+      <w:r>
+        <w:rPr>
+          <w:rFonts w:ascii="Arial" w:cs="Arial" w:eastAsia="Arial" w:hAnsi="Arial"/>
+          <w:strike w:val="1"/>
           <w:rtl w:val="0"/>
         </w:rPr>
         <w:t xml:space="preserve">Apply ANOVA or alternative tests to detect variation across domains.</w:t>
@@ -2667,17 +2892,19 @@
       <w:pPr>
         <w:numPr>
           <w:ilvl w:val="0"/>
-          <w:numId w:val="16"/>
+          <w:numId w:val="8"/>
         </w:numPr>
         <w:spacing w:after="0" w:before="0" w:line="276" w:lineRule="auto"/>
         <w:ind w:left="720" w:hanging="360"/>
         <w:rPr>
           <w:rFonts w:ascii="Arial" w:cs="Arial" w:eastAsia="Arial" w:hAnsi="Arial"/>
-        </w:rPr>
-      </w:pPr>
-      <w:r>
-        <w:rPr>
-          <w:rFonts w:ascii="Arial" w:cs="Arial" w:eastAsia="Arial" w:hAnsi="Arial"/>
+          <w:strike w:val="1"/>
+        </w:rPr>
+      </w:pPr>
+      <w:r>
+        <w:rPr>
+          <w:rFonts w:ascii="Arial" w:cs="Arial" w:eastAsia="Arial" w:hAnsi="Arial"/>
+          <w:strike w:val="1"/>
           <w:rtl w:val="0"/>
         </w:rPr>
         <w:t xml:space="preserve">Calculate confidence intervals to measure inter-rater reliability.</w:t>
@@ -2687,17 +2914,19 @@
       <w:pPr>
         <w:numPr>
           <w:ilvl w:val="0"/>
-          <w:numId w:val="16"/>
+          <w:numId w:val="8"/>
         </w:numPr>
         <w:spacing w:after="240" w:before="0" w:line="276" w:lineRule="auto"/>
         <w:ind w:left="720" w:hanging="360"/>
         <w:rPr>
           <w:rFonts w:ascii="Arial" w:cs="Arial" w:eastAsia="Arial" w:hAnsi="Arial"/>
-        </w:rPr>
-      </w:pPr>
-      <w:r>
-        <w:rPr>
-          <w:rFonts w:ascii="Arial" w:cs="Arial" w:eastAsia="Arial" w:hAnsi="Arial"/>
+          <w:strike w:val="1"/>
+        </w:rPr>
+      </w:pPr>
+      <w:r>
+        <w:rPr>
+          <w:rFonts w:ascii="Arial" w:cs="Arial" w:eastAsia="Arial" w:hAnsi="Arial"/>
+          <w:strike w:val="1"/>
           <w:rtl w:val="0"/>
         </w:rPr>
         <w:t xml:space="preserve">Solicit domain experts’ input in at least three challenging fields.</w:t>
@@ -2709,12 +2938,16 @@
         <w:rPr>
           <w:rFonts w:ascii="Arial" w:cs="Arial" w:eastAsia="Arial" w:hAnsi="Arial"/>
           <w:b w:val="1"/>
+          <w:bCs w:val="1"/>
+          <w:strike w:val="1"/>
         </w:rPr>
       </w:pPr>
       <w:r>
         <w:rPr>
           <w:rFonts w:ascii="Arial" w:cs="Arial" w:eastAsia="Arial" w:hAnsi="Arial"/>
           <w:b w:val="1"/>
+          <w:bCs w:val="1"/>
+          <w:strike w:val="1"/>
           <w:rtl w:val="0"/>
         </w:rPr>
         <w:t xml:space="preserve">Milestones</w:t>
@@ -2724,17 +2957,19 @@
       <w:pPr>
         <w:numPr>
           <w:ilvl w:val="0"/>
-          <w:numId w:val="22"/>
+          <w:numId w:val="15"/>
         </w:numPr>
         <w:spacing w:after="0" w:before="240" w:line="276" w:lineRule="auto"/>
         <w:ind w:left="720" w:hanging="360"/>
         <w:rPr>
           <w:rFonts w:ascii="Arial" w:cs="Arial" w:eastAsia="Arial" w:hAnsi="Arial"/>
-        </w:rPr>
-      </w:pPr>
-      <w:r>
-        <w:rPr>
-          <w:rFonts w:ascii="Arial" w:cs="Arial" w:eastAsia="Arial" w:hAnsi="Arial"/>
+          <w:strike w:val="1"/>
+        </w:rPr>
+      </w:pPr>
+      <w:r>
+        <w:rPr>
+          <w:rFonts w:ascii="Arial" w:cs="Arial" w:eastAsia="Arial" w:hAnsi="Arial"/>
+          <w:strike w:val="1"/>
           <w:rtl w:val="0"/>
         </w:rPr>
         <w:t xml:space="preserve">Preliminary findings on which models excel in each field.</w:t>
@@ -2744,17 +2979,19 @@
       <w:pPr>
         <w:numPr>
           <w:ilvl w:val="0"/>
-          <w:numId w:val="22"/>
+          <w:numId w:val="15"/>
         </w:numPr>
         <w:spacing w:after="240" w:before="0" w:line="276" w:lineRule="auto"/>
         <w:ind w:left="720" w:hanging="360"/>
         <w:rPr>
           <w:rFonts w:ascii="Arial" w:cs="Arial" w:eastAsia="Arial" w:hAnsi="Arial"/>
-        </w:rPr>
-      </w:pPr>
-      <w:r>
-        <w:rPr>
-          <w:rFonts w:ascii="Arial" w:cs="Arial" w:eastAsia="Arial" w:hAnsi="Arial"/>
+          <w:strike w:val="1"/>
+        </w:rPr>
+      </w:pPr>
+      <w:r>
+        <w:rPr>
+          <w:rFonts w:ascii="Arial" w:cs="Arial" w:eastAsia="Arial" w:hAnsi="Arial"/>
+          <w:strike w:val="1"/>
           <w:rtl w:val="0"/>
         </w:rPr>
         <w:t xml:space="preserve">Integration of expert commentary.</w:t>
@@ -2766,6 +3003,7 @@
         <w:ind w:left="1440" w:hanging="360"/>
         <w:rPr>
           <w:rFonts w:ascii="Arial" w:cs="Arial" w:eastAsia="Arial" w:hAnsi="Arial"/>
+          <w:strike w:val="1"/>
         </w:rPr>
       </w:pPr>
       <w:r>
@@ -2788,15 +3026,17 @@
         <w:ind w:left="1440" w:hanging="360"/>
         <w:rPr>
           <w:rFonts w:ascii="Arial" w:cs="Arial" w:eastAsia="Arial" w:hAnsi="Arial"/>
+          <w:strike w:val="1"/>
           <w:sz w:val="26"/>
           <w:szCs w:val="26"/>
         </w:rPr>
       </w:pPr>
-      <w:bookmarkStart w:colFirst="0" w:colLast="0" w:name="_j6n7aqruu1qq" w:id="15"/>
+      <w:bookmarkStart w:colFirst="0" w:colLast="0" w:name="_3murqchviee2" w:id="15"/>
       <w:bookmarkEnd w:id="15"/>
       <w:r>
         <w:rPr>
           <w:rFonts w:ascii="Arial" w:cs="Arial" w:eastAsia="Arial" w:hAnsi="Arial"/>
+          <w:strike w:val="1"/>
           <w:sz w:val="26"/>
           <w:szCs w:val="26"/>
           <w:rtl w:val="0"/>
@@ -2810,12 +3050,16 @@
         <w:rPr>
           <w:rFonts w:ascii="Arial" w:cs="Arial" w:eastAsia="Arial" w:hAnsi="Arial"/>
           <w:b w:val="1"/>
+          <w:bCs w:val="1"/>
+          <w:strike w:val="1"/>
         </w:rPr>
       </w:pPr>
       <w:r>
         <w:rPr>
           <w:rFonts w:ascii="Arial" w:cs="Arial" w:eastAsia="Arial" w:hAnsi="Arial"/>
           <w:b w:val="1"/>
+          <w:bCs w:val="1"/>
+          <w:strike w:val="1"/>
           <w:rtl w:val="0"/>
         </w:rPr>
         <w:t xml:space="preserve">Tasks</w:t>
@@ -2825,17 +3069,19 @@
       <w:pPr>
         <w:numPr>
           <w:ilvl w:val="0"/>
-          <w:numId w:val="12"/>
+          <w:numId w:val="4"/>
         </w:numPr>
         <w:spacing w:after="0" w:before="240" w:line="276" w:lineRule="auto"/>
         <w:ind w:left="720" w:hanging="360"/>
         <w:rPr>
           <w:rFonts w:ascii="Arial" w:cs="Arial" w:eastAsia="Arial" w:hAnsi="Arial"/>
-        </w:rPr>
-      </w:pPr>
-      <w:r>
-        <w:rPr>
-          <w:rFonts w:ascii="Arial" w:cs="Arial" w:eastAsia="Arial" w:hAnsi="Arial"/>
+          <w:strike w:val="1"/>
+        </w:rPr>
+      </w:pPr>
+      <w:r>
+        <w:rPr>
+          <w:rFonts w:ascii="Arial" w:cs="Arial" w:eastAsia="Arial" w:hAnsi="Arial"/>
+          <w:strike w:val="1"/>
           <w:rtl w:val="0"/>
         </w:rPr>
         <w:t xml:space="preserve">Refine Chapter 4 with a thorough statistical breakdown.</w:t>
@@ -2845,17 +3091,19 @@
       <w:pPr>
         <w:numPr>
           <w:ilvl w:val="0"/>
-          <w:numId w:val="12"/>
+          <w:numId w:val="4"/>
         </w:numPr>
         <w:spacing w:after="0" w:before="0" w:line="276" w:lineRule="auto"/>
         <w:ind w:left="720" w:hanging="360"/>
         <w:rPr>
           <w:rFonts w:ascii="Arial" w:cs="Arial" w:eastAsia="Arial" w:hAnsi="Arial"/>
-        </w:rPr>
-      </w:pPr>
-      <w:r>
-        <w:rPr>
-          <w:rFonts w:ascii="Arial" w:cs="Arial" w:eastAsia="Arial" w:hAnsi="Arial"/>
+          <w:strike w:val="1"/>
+        </w:rPr>
+      </w:pPr>
+      <w:r>
+        <w:rPr>
+          <w:rFonts w:ascii="Arial" w:cs="Arial" w:eastAsia="Arial" w:hAnsi="Arial"/>
+          <w:strike w:val="1"/>
           <w:rtl w:val="0"/>
         </w:rPr>
         <w:t xml:space="preserve">Link the results to your conceptual framework to start bridging into the discussion portion (Chapter 5).</w:t>
@@ -2865,17 +3113,19 @@
       <w:pPr>
         <w:numPr>
           <w:ilvl w:val="0"/>
-          <w:numId w:val="12"/>
+          <w:numId w:val="4"/>
         </w:numPr>
         <w:spacing w:after="240" w:before="0" w:line="276" w:lineRule="auto"/>
         <w:ind w:left="720" w:hanging="360"/>
         <w:rPr>
           <w:rFonts w:ascii="Arial" w:cs="Arial" w:eastAsia="Arial" w:hAnsi="Arial"/>
-        </w:rPr>
-      </w:pPr>
-      <w:r>
-        <w:rPr>
-          <w:rFonts w:ascii="Arial" w:cs="Arial" w:eastAsia="Arial" w:hAnsi="Arial"/>
+          <w:strike w:val="1"/>
+        </w:rPr>
+      </w:pPr>
+      <w:r>
+        <w:rPr>
+          <w:rFonts w:ascii="Arial" w:cs="Arial" w:eastAsia="Arial" w:hAnsi="Arial"/>
+          <w:strike w:val="1"/>
           <w:rtl w:val="0"/>
         </w:rPr>
         <w:t xml:space="preserve">Cross-check results with prior research (Ngo et al., 2024; Cai et al., 2024).</w:t>
@@ -2887,12 +3137,16 @@
         <w:rPr>
           <w:rFonts w:ascii="Arial" w:cs="Arial" w:eastAsia="Arial" w:hAnsi="Arial"/>
           <w:b w:val="1"/>
+          <w:bCs w:val="1"/>
+          <w:strike w:val="1"/>
         </w:rPr>
       </w:pPr>
       <w:r>
         <w:rPr>
           <w:rFonts w:ascii="Arial" w:cs="Arial" w:eastAsia="Arial" w:hAnsi="Arial"/>
           <w:b w:val="1"/>
+          <w:bCs w:val="1"/>
+          <w:strike w:val="1"/>
           <w:rtl w:val="0"/>
         </w:rPr>
         <w:t xml:space="preserve">Milestones</w:t>
@@ -2902,17 +3156,19 @@
       <w:pPr>
         <w:numPr>
           <w:ilvl w:val="0"/>
-          <w:numId w:val="29"/>
+          <w:numId w:val="22"/>
         </w:numPr>
         <w:spacing w:after="0" w:before="240" w:line="276" w:lineRule="auto"/>
         <w:ind w:left="720" w:hanging="360"/>
         <w:rPr>
           <w:rFonts w:ascii="Arial" w:cs="Arial" w:eastAsia="Arial" w:hAnsi="Arial"/>
-        </w:rPr>
-      </w:pPr>
-      <w:r>
-        <w:rPr>
-          <w:rFonts w:ascii="Arial" w:cs="Arial" w:eastAsia="Arial" w:hAnsi="Arial"/>
+          <w:strike w:val="1"/>
+        </w:rPr>
+      </w:pPr>
+      <w:r>
+        <w:rPr>
+          <w:rFonts w:ascii="Arial" w:cs="Arial" w:eastAsia="Arial" w:hAnsi="Arial"/>
+          <w:strike w:val="1"/>
           <w:rtl w:val="0"/>
         </w:rPr>
         <w:t xml:space="preserve">Polished set of tables/figures illustrating how LLMs differ across fields.</w:t>
@@ -2922,17 +3178,19 @@
       <w:pPr>
         <w:numPr>
           <w:ilvl w:val="0"/>
-          <w:numId w:val="29"/>
+          <w:numId w:val="22"/>
         </w:numPr>
         <w:spacing w:after="240" w:before="0" w:line="276" w:lineRule="auto"/>
         <w:ind w:left="720" w:hanging="360"/>
         <w:rPr>
           <w:rFonts w:ascii="Arial" w:cs="Arial" w:eastAsia="Arial" w:hAnsi="Arial"/>
-        </w:rPr>
-      </w:pPr>
-      <w:r>
-        <w:rPr>
-          <w:rFonts w:ascii="Arial" w:cs="Arial" w:eastAsia="Arial" w:hAnsi="Arial"/>
+          <w:strike w:val="1"/>
+        </w:rPr>
+      </w:pPr>
+      <w:r>
+        <w:rPr>
+          <w:rFonts w:ascii="Arial" w:cs="Arial" w:eastAsia="Arial" w:hAnsi="Arial"/>
+          <w:strike w:val="1"/>
           <w:rtl w:val="0"/>
         </w:rPr>
         <w:t xml:space="preserve">Preliminary discussion paragraphs are in place.</w:t>
@@ -2944,6 +3202,7 @@
         <w:ind w:left="1440" w:hanging="360"/>
         <w:rPr>
           <w:rFonts w:ascii="Arial" w:cs="Arial" w:eastAsia="Arial" w:hAnsi="Arial"/>
+          <w:strike w:val="1"/>
         </w:rPr>
       </w:pPr>
       <w:r>
@@ -2966,15 +3225,17 @@
         <w:ind w:left="1440" w:hanging="360"/>
         <w:rPr>
           <w:rFonts w:ascii="Arial" w:cs="Arial" w:eastAsia="Arial" w:hAnsi="Arial"/>
+          <w:strike w:val="1"/>
           <w:sz w:val="26"/>
           <w:szCs w:val="26"/>
         </w:rPr>
       </w:pPr>
-      <w:bookmarkStart w:colFirst="0" w:colLast="0" w:name="_8m32plflnhsu" w:id="16"/>
+      <w:bookmarkStart w:colFirst="0" w:colLast="0" w:name="_jegks6f99yix" w:id="16"/>
       <w:bookmarkEnd w:id="16"/>
       <w:r>
         <w:rPr>
           <w:rFonts w:ascii="Arial" w:cs="Arial" w:eastAsia="Arial" w:hAnsi="Arial"/>
+          <w:strike w:val="1"/>
           <w:sz w:val="26"/>
           <w:szCs w:val="26"/>
           <w:rtl w:val="0"/>
@@ -2988,12 +3249,16 @@
         <w:rPr>
           <w:rFonts w:ascii="Arial" w:cs="Arial" w:eastAsia="Arial" w:hAnsi="Arial"/>
           <w:b w:val="1"/>
+          <w:bCs w:val="1"/>
+          <w:strike w:val="1"/>
         </w:rPr>
       </w:pPr>
       <w:r>
         <w:rPr>
           <w:rFonts w:ascii="Arial" w:cs="Arial" w:eastAsia="Arial" w:hAnsi="Arial"/>
           <w:b w:val="1"/>
+          <w:bCs w:val="1"/>
+          <w:strike w:val="1"/>
           <w:rtl w:val="0"/>
         </w:rPr>
         <w:t xml:space="preserve">Tasks</w:t>
@@ -3009,11 +3274,13 @@
         <w:ind w:left="720" w:hanging="360"/>
         <w:rPr>
           <w:rFonts w:ascii="Arial" w:cs="Arial" w:eastAsia="Arial" w:hAnsi="Arial"/>
-        </w:rPr>
-      </w:pPr>
-      <w:r>
-        <w:rPr>
-          <w:rFonts w:ascii="Arial" w:cs="Arial" w:eastAsia="Arial" w:hAnsi="Arial"/>
+          <w:strike w:val="1"/>
+        </w:rPr>
+      </w:pPr>
+      <w:r>
+        <w:rPr>
+          <w:rFonts w:ascii="Arial" w:cs="Arial" w:eastAsia="Arial" w:hAnsi="Arial"/>
+          <w:strike w:val="1"/>
           <w:rtl w:val="0"/>
         </w:rPr>
         <w:t xml:space="preserve">Draft Chapter 5 focusing on:</w:t>
@@ -3029,11 +3296,13 @@
         <w:ind w:left="1440" w:hanging="360"/>
         <w:rPr>
           <w:rFonts w:ascii="Arial" w:cs="Arial" w:eastAsia="Arial" w:hAnsi="Arial"/>
-        </w:rPr>
-      </w:pPr>
-      <w:r>
-        <w:rPr>
-          <w:rFonts w:ascii="Arial" w:cs="Arial" w:eastAsia="Arial" w:hAnsi="Arial"/>
+          <w:strike w:val="1"/>
+        </w:rPr>
+      </w:pPr>
+      <w:r>
+        <w:rPr>
+          <w:rFonts w:ascii="Arial" w:cs="Arial" w:eastAsia="Arial" w:hAnsi="Arial"/>
+          <w:strike w:val="1"/>
           <w:rtl w:val="0"/>
         </w:rPr>
         <w:t xml:space="preserve">Comparison to prior literature</w:t>
@@ -3049,11 +3318,13 @@
         <w:ind w:left="1440" w:hanging="360"/>
         <w:rPr>
           <w:rFonts w:ascii="Arial" w:cs="Arial" w:eastAsia="Arial" w:hAnsi="Arial"/>
-        </w:rPr>
-      </w:pPr>
-      <w:r>
-        <w:rPr>
-          <w:rFonts w:ascii="Arial" w:cs="Arial" w:eastAsia="Arial" w:hAnsi="Arial"/>
+          <w:strike w:val="1"/>
+        </w:rPr>
+      </w:pPr>
+      <w:r>
+        <w:rPr>
+          <w:rFonts w:ascii="Arial" w:cs="Arial" w:eastAsia="Arial" w:hAnsi="Arial"/>
+          <w:strike w:val="1"/>
           <w:rtl w:val="0"/>
         </w:rPr>
         <w:t xml:space="preserve">Practical applications</w:t>
@@ -3069,11 +3340,13 @@
         <w:ind w:left="1440" w:hanging="360"/>
         <w:rPr>
           <w:rFonts w:ascii="Arial" w:cs="Arial" w:eastAsia="Arial" w:hAnsi="Arial"/>
-        </w:rPr>
-      </w:pPr>
-      <w:r>
-        <w:rPr>
-          <w:rFonts w:ascii="Arial" w:cs="Arial" w:eastAsia="Arial" w:hAnsi="Arial"/>
+          <w:strike w:val="1"/>
+        </w:rPr>
+      </w:pPr>
+      <w:r>
+        <w:rPr>
+          <w:rFonts w:ascii="Arial" w:cs="Arial" w:eastAsia="Arial" w:hAnsi="Arial"/>
+          <w:strike w:val="1"/>
           <w:rtl w:val="0"/>
         </w:rPr>
         <w:t xml:space="preserve">Limitations and future research</w:t>
@@ -3089,11 +3362,13 @@
         <w:ind w:left="720" w:hanging="360"/>
         <w:rPr>
           <w:rFonts w:ascii="Arial" w:cs="Arial" w:eastAsia="Arial" w:hAnsi="Arial"/>
-        </w:rPr>
-      </w:pPr>
-      <w:r>
-        <w:rPr>
-          <w:rFonts w:ascii="Arial" w:cs="Arial" w:eastAsia="Arial" w:hAnsi="Arial"/>
+          <w:strike w:val="1"/>
+        </w:rPr>
+      </w:pPr>
+      <w:r>
+        <w:rPr>
+          <w:rFonts w:ascii="Arial" w:cs="Arial" w:eastAsia="Arial" w:hAnsi="Arial"/>
+          <w:strike w:val="1"/>
           <w:rtl w:val="0"/>
         </w:rPr>
         <w:t xml:space="preserve">Incorporate advanced statistical notes.</w:t>
@@ -3105,12 +3380,16 @@
         <w:rPr>
           <w:rFonts w:ascii="Arial" w:cs="Arial" w:eastAsia="Arial" w:hAnsi="Arial"/>
           <w:b w:val="1"/>
+          <w:bCs w:val="1"/>
+          <w:strike w:val="1"/>
         </w:rPr>
       </w:pPr>
       <w:r>
         <w:rPr>
           <w:rFonts w:ascii="Arial" w:cs="Arial" w:eastAsia="Arial" w:hAnsi="Arial"/>
           <w:b w:val="1"/>
+          <w:bCs w:val="1"/>
+          <w:strike w:val="1"/>
           <w:rtl w:val="0"/>
         </w:rPr>
         <w:t xml:space="preserve">Milestones</w:t>
@@ -3120,17 +3399,19 @@
       <w:pPr>
         <w:numPr>
           <w:ilvl w:val="0"/>
-          <w:numId w:val="37"/>
+          <w:numId w:val="31"/>
         </w:numPr>
         <w:spacing w:after="0" w:before="240" w:line="276" w:lineRule="auto"/>
         <w:ind w:left="720" w:hanging="360"/>
         <w:rPr>
           <w:rFonts w:ascii="Arial" w:cs="Arial" w:eastAsia="Arial" w:hAnsi="Arial"/>
-        </w:rPr>
-      </w:pPr>
-      <w:r>
-        <w:rPr>
-          <w:rFonts w:ascii="Arial" w:cs="Arial" w:eastAsia="Arial" w:hAnsi="Arial"/>
+          <w:strike w:val="1"/>
+        </w:rPr>
+      </w:pPr>
+      <w:r>
+        <w:rPr>
+          <w:rFonts w:ascii="Arial" w:cs="Arial" w:eastAsia="Arial" w:hAnsi="Arial"/>
+          <w:strike w:val="1"/>
           <w:rtl w:val="0"/>
         </w:rPr>
         <w:t xml:space="preserve">Substantial draft of Chapter 5.</w:t>
@@ -3140,17 +3421,19 @@
       <w:pPr>
         <w:numPr>
           <w:ilvl w:val="0"/>
-          <w:numId w:val="37"/>
+          <w:numId w:val="31"/>
         </w:numPr>
         <w:spacing w:after="240" w:before="0" w:line="276" w:lineRule="auto"/>
         <w:ind w:left="720" w:hanging="360"/>
         <w:rPr>
           <w:rFonts w:ascii="Arial" w:cs="Arial" w:eastAsia="Arial" w:hAnsi="Arial"/>
-        </w:rPr>
-      </w:pPr>
-      <w:r>
-        <w:rPr>
-          <w:rFonts w:ascii="Arial" w:cs="Arial" w:eastAsia="Arial" w:hAnsi="Arial"/>
+          <w:strike w:val="1"/>
+        </w:rPr>
+      </w:pPr>
+      <w:r>
+        <w:rPr>
+          <w:rFonts w:ascii="Arial" w:cs="Arial" w:eastAsia="Arial" w:hAnsi="Arial"/>
+          <w:strike w:val="1"/>
           <w:rtl w:val="0"/>
         </w:rPr>
         <w:t xml:space="preserve">Provide a clear demonstration of how your dissertation addresses the identified knowledge gap.</w:t>
@@ -3162,6 +3445,7 @@
         <w:ind w:left="1440" w:hanging="360"/>
         <w:rPr>
           <w:rFonts w:ascii="Arial" w:cs="Arial" w:eastAsia="Arial" w:hAnsi="Arial"/>
+          <w:strike w:val="1"/>
         </w:rPr>
       </w:pPr>
       <w:r>
@@ -3184,15 +3468,17 @@
         <w:ind w:left="1440" w:hanging="360"/>
         <w:rPr>
           <w:rFonts w:ascii="Arial" w:cs="Arial" w:eastAsia="Arial" w:hAnsi="Arial"/>
+          <w:strike w:val="1"/>
           <w:sz w:val="34"/>
           <w:szCs w:val="34"/>
         </w:rPr>
       </w:pPr>
-      <w:bookmarkStart w:colFirst="0" w:colLast="0" w:name="_f78j72cl01x" w:id="17"/>
+      <w:bookmarkStart w:colFirst="0" w:colLast="0" w:name="_8wvp3xcebywr" w:id="17"/>
       <w:bookmarkEnd w:id="17"/>
       <w:r>
         <w:rPr>
           <w:rFonts w:ascii="Arial" w:cs="Arial" w:eastAsia="Arial" w:hAnsi="Arial"/>
+          <w:strike w:val="1"/>
           <w:sz w:val="34"/>
           <w:szCs w:val="34"/>
           <w:rtl w:val="0"/>
@@ -3209,15 +3495,17 @@
         <w:ind w:left="1440" w:hanging="360"/>
         <w:rPr>
           <w:rFonts w:ascii="Arial" w:cs="Arial" w:eastAsia="Arial" w:hAnsi="Arial"/>
+          <w:strike w:val="1"/>
           <w:sz w:val="26"/>
           <w:szCs w:val="26"/>
         </w:rPr>
       </w:pPr>
-      <w:bookmarkStart w:colFirst="0" w:colLast="0" w:name="_15fjky7mo7s3" w:id="18"/>
+      <w:bookmarkStart w:colFirst="0" w:colLast="0" w:name="_5rf71hxq6kde" w:id="18"/>
       <w:bookmarkEnd w:id="18"/>
       <w:r>
         <w:rPr>
           <w:rFonts w:ascii="Arial" w:cs="Arial" w:eastAsia="Arial" w:hAnsi="Arial"/>
+          <w:strike w:val="1"/>
           <w:sz w:val="26"/>
           <w:szCs w:val="26"/>
           <w:rtl w:val="0"/>
@@ -3231,12 +3519,16 @@
         <w:rPr>
           <w:rFonts w:ascii="Arial" w:cs="Arial" w:eastAsia="Arial" w:hAnsi="Arial"/>
           <w:b w:val="1"/>
+          <w:bCs w:val="1"/>
+          <w:strike w:val="1"/>
         </w:rPr>
       </w:pPr>
       <w:r>
         <w:rPr>
           <w:rFonts w:ascii="Arial" w:cs="Arial" w:eastAsia="Arial" w:hAnsi="Arial"/>
           <w:b w:val="1"/>
+          <w:bCs w:val="1"/>
+          <w:strike w:val="1"/>
           <w:rtl w:val="0"/>
         </w:rPr>
         <w:t xml:space="preserve">Tasks</w:t>
@@ -3246,17 +3538,19 @@
       <w:pPr>
         <w:numPr>
           <w:ilvl w:val="0"/>
-          <w:numId w:val="34"/>
+          <w:numId w:val="28"/>
         </w:numPr>
         <w:spacing w:after="0" w:before="240" w:line="276" w:lineRule="auto"/>
         <w:ind w:left="720" w:hanging="360"/>
         <w:rPr>
           <w:rFonts w:ascii="Arial" w:cs="Arial" w:eastAsia="Arial" w:hAnsi="Arial"/>
-        </w:rPr>
-      </w:pPr>
-      <w:r>
-        <w:rPr>
-          <w:rFonts w:ascii="Arial" w:cs="Arial" w:eastAsia="Arial" w:hAnsi="Arial"/>
+          <w:strike w:val="1"/>
+        </w:rPr>
+      </w:pPr>
+      <w:r>
+        <w:rPr>
+          <w:rFonts w:ascii="Arial" w:cs="Arial" w:eastAsia="Arial" w:hAnsi="Arial"/>
+          <w:strike w:val="1"/>
           <w:rtl w:val="0"/>
         </w:rPr>
         <w:t xml:space="preserve">Combine Chapters 1–5 into one cohesive document.</w:t>
@@ -3266,17 +3560,19 @@
       <w:pPr>
         <w:numPr>
           <w:ilvl w:val="0"/>
-          <w:numId w:val="34"/>
+          <w:numId w:val="28"/>
         </w:numPr>
         <w:spacing w:after="0" w:before="0" w:line="276" w:lineRule="auto"/>
         <w:ind w:left="720" w:hanging="360"/>
         <w:rPr>
           <w:rFonts w:ascii="Arial" w:cs="Arial" w:eastAsia="Arial" w:hAnsi="Arial"/>
-        </w:rPr>
-      </w:pPr>
-      <w:r>
-        <w:rPr>
-          <w:rFonts w:ascii="Arial" w:cs="Arial" w:eastAsia="Arial" w:hAnsi="Arial"/>
+          <w:strike w:val="1"/>
+        </w:rPr>
+      </w:pPr>
+      <w:r>
+        <w:rPr>
+          <w:rFonts w:ascii="Arial" w:cs="Arial" w:eastAsia="Arial" w:hAnsi="Arial"/>
+          <w:strike w:val="1"/>
           <w:rtl w:val="0"/>
         </w:rPr>
         <w:t xml:space="preserve">Revisit definitions, assumptions, and delimitations to ensure internal consistency.</w:t>
@@ -3286,17 +3582,19 @@
       <w:pPr>
         <w:numPr>
           <w:ilvl w:val="0"/>
-          <w:numId w:val="34"/>
+          <w:numId w:val="28"/>
         </w:numPr>
         <w:spacing w:after="240" w:before="0" w:line="276" w:lineRule="auto"/>
         <w:ind w:left="720" w:hanging="360"/>
         <w:rPr>
           <w:rFonts w:ascii="Arial" w:cs="Arial" w:eastAsia="Arial" w:hAnsi="Arial"/>
-        </w:rPr>
-      </w:pPr>
-      <w:r>
-        <w:rPr>
-          <w:rFonts w:ascii="Arial" w:cs="Arial" w:eastAsia="Arial" w:hAnsi="Arial"/>
+          <w:strike w:val="1"/>
+        </w:rPr>
+      </w:pPr>
+      <w:r>
+        <w:rPr>
+          <w:rFonts w:ascii="Arial" w:cs="Arial" w:eastAsia="Arial" w:hAnsi="Arial"/>
+          <w:strike w:val="1"/>
           <w:rtl w:val="0"/>
         </w:rPr>
         <w:t xml:space="preserve">Ensure references are correctly cited.</w:t>
@@ -3308,12 +3606,16 @@
         <w:rPr>
           <w:rFonts w:ascii="Arial" w:cs="Arial" w:eastAsia="Arial" w:hAnsi="Arial"/>
           <w:b w:val="1"/>
+          <w:bCs w:val="1"/>
+          <w:strike w:val="1"/>
         </w:rPr>
       </w:pPr>
       <w:r>
         <w:rPr>
           <w:rFonts w:ascii="Arial" w:cs="Arial" w:eastAsia="Arial" w:hAnsi="Arial"/>
           <w:b w:val="1"/>
+          <w:bCs w:val="1"/>
+          <w:strike w:val="1"/>
           <w:rtl w:val="0"/>
         </w:rPr>
         <w:t xml:space="preserve">Milestones</w:t>
@@ -3323,17 +3625,19 @@
       <w:pPr>
         <w:numPr>
           <w:ilvl w:val="0"/>
-          <w:numId w:val="10"/>
+          <w:numId w:val="2"/>
         </w:numPr>
         <w:spacing w:after="0" w:before="240" w:line="276" w:lineRule="auto"/>
         <w:ind w:left="720" w:hanging="360"/>
         <w:rPr>
           <w:rFonts w:ascii="Arial" w:cs="Arial" w:eastAsia="Arial" w:hAnsi="Arial"/>
-        </w:rPr>
-      </w:pPr>
-      <w:r>
-        <w:rPr>
-          <w:rFonts w:ascii="Arial" w:cs="Arial" w:eastAsia="Arial" w:hAnsi="Arial"/>
+          <w:strike w:val="1"/>
+        </w:rPr>
+      </w:pPr>
+      <w:r>
+        <w:rPr>
+          <w:rFonts w:ascii="Arial" w:cs="Arial" w:eastAsia="Arial" w:hAnsi="Arial"/>
+          <w:strike w:val="1"/>
           <w:rtl w:val="0"/>
         </w:rPr>
         <w:t xml:space="preserve">Complete dissertation draft assembled.</w:t>
@@ -3343,17 +3647,19 @@
       <w:pPr>
         <w:numPr>
           <w:ilvl w:val="0"/>
-          <w:numId w:val="10"/>
+          <w:numId w:val="2"/>
         </w:numPr>
         <w:spacing w:after="240" w:before="0" w:line="276" w:lineRule="auto"/>
         <w:ind w:left="720" w:hanging="360"/>
         <w:rPr>
           <w:rFonts w:ascii="Arial" w:cs="Arial" w:eastAsia="Arial" w:hAnsi="Arial"/>
-        </w:rPr>
-      </w:pPr>
-      <w:r>
-        <w:rPr>
-          <w:rFonts w:ascii="Arial" w:cs="Arial" w:eastAsia="Arial" w:hAnsi="Arial"/>
+          <w:strike w:val="1"/>
+        </w:rPr>
+      </w:pPr>
+      <w:r>
+        <w:rPr>
+          <w:rFonts w:ascii="Arial" w:cs="Arial" w:eastAsia="Arial" w:hAnsi="Arial"/>
+          <w:strike w:val="1"/>
           <w:rtl w:val="0"/>
         </w:rPr>
         <w:t xml:space="preserve">Submit to the Chair for a round of revisions.</w:t>
@@ -3365,6 +3671,7 @@
         <w:ind w:left="1440" w:hanging="360"/>
         <w:rPr>
           <w:rFonts w:ascii="Arial" w:cs="Arial" w:eastAsia="Arial" w:hAnsi="Arial"/>
+          <w:strike w:val="1"/>
         </w:rPr>
       </w:pPr>
       <w:r>
@@ -3387,15 +3694,17 @@
         <w:ind w:left="1440" w:hanging="360"/>
         <w:rPr>
           <w:rFonts w:ascii="Arial" w:cs="Arial" w:eastAsia="Arial" w:hAnsi="Arial"/>
+          <w:strike w:val="1"/>
           <w:sz w:val="26"/>
           <w:szCs w:val="26"/>
         </w:rPr>
       </w:pPr>
-      <w:bookmarkStart w:colFirst="0" w:colLast="0" w:name="_32lx80acmb8z" w:id="19"/>
+      <w:bookmarkStart w:colFirst="0" w:colLast="0" w:name="_ddrtm7wtlrh3" w:id="19"/>
       <w:bookmarkEnd w:id="19"/>
       <w:r>
         <w:rPr>
           <w:rFonts w:ascii="Arial" w:cs="Arial" w:eastAsia="Arial" w:hAnsi="Arial"/>
+          <w:strike w:val="1"/>
           <w:sz w:val="26"/>
           <w:szCs w:val="26"/>
           <w:rtl w:val="0"/>
@@ -3409,12 +3718,16 @@
         <w:rPr>
           <w:rFonts w:ascii="Arial" w:cs="Arial" w:eastAsia="Arial" w:hAnsi="Arial"/>
           <w:b w:val="1"/>
+          <w:bCs w:val="1"/>
+          <w:strike w:val="1"/>
         </w:rPr>
       </w:pPr>
       <w:r>
         <w:rPr>
           <w:rFonts w:ascii="Arial" w:cs="Arial" w:eastAsia="Arial" w:hAnsi="Arial"/>
           <w:b w:val="1"/>
+          <w:bCs w:val="1"/>
+          <w:strike w:val="1"/>
           <w:rtl w:val="0"/>
         </w:rPr>
         <w:t xml:space="preserve">Tasks</w:t>
@@ -3424,17 +3737,19 @@
       <w:pPr>
         <w:numPr>
           <w:ilvl w:val="0"/>
-          <w:numId w:val="30"/>
+          <w:numId w:val="24"/>
         </w:numPr>
         <w:spacing w:after="0" w:before="240" w:line="276" w:lineRule="auto"/>
         <w:ind w:left="720" w:hanging="360"/>
         <w:rPr>
           <w:rFonts w:ascii="Arial" w:cs="Arial" w:eastAsia="Arial" w:hAnsi="Arial"/>
-        </w:rPr>
-      </w:pPr>
-      <w:r>
-        <w:rPr>
-          <w:rFonts w:ascii="Arial" w:cs="Arial" w:eastAsia="Arial" w:hAnsi="Arial"/>
+          <w:strike w:val="1"/>
+        </w:rPr>
+      </w:pPr>
+      <w:r>
+        <w:rPr>
+          <w:rFonts w:ascii="Arial" w:cs="Arial" w:eastAsia="Arial" w:hAnsi="Arial"/>
+          <w:strike w:val="1"/>
           <w:rtl w:val="0"/>
         </w:rPr>
         <w:t xml:space="preserve">Incorporate Chair and Committee feedback.</w:t>
@@ -3444,17 +3759,19 @@
       <w:pPr>
         <w:numPr>
           <w:ilvl w:val="0"/>
-          <w:numId w:val="30"/>
+          <w:numId w:val="24"/>
         </w:numPr>
         <w:spacing w:after="0" w:before="0" w:line="276" w:lineRule="auto"/>
         <w:ind w:left="720" w:hanging="360"/>
         <w:rPr>
           <w:rFonts w:ascii="Arial" w:cs="Arial" w:eastAsia="Arial" w:hAnsi="Arial"/>
-        </w:rPr>
-      </w:pPr>
-      <w:r>
-        <w:rPr>
-          <w:rFonts w:ascii="Arial" w:cs="Arial" w:eastAsia="Arial" w:hAnsi="Arial"/>
+          <w:strike w:val="1"/>
+        </w:rPr>
+      </w:pPr>
+      <w:r>
+        <w:rPr>
+          <w:rFonts w:ascii="Arial" w:cs="Arial" w:eastAsia="Arial" w:hAnsi="Arial"/>
+          <w:strike w:val="1"/>
           <w:rtl w:val="0"/>
         </w:rPr>
         <w:t xml:space="preserve">Make final improvements to methodology, results presentation, or references.</w:t>
@@ -3464,17 +3781,19 @@
       <w:pPr>
         <w:numPr>
           <w:ilvl w:val="0"/>
-          <w:numId w:val="30"/>
+          <w:numId w:val="24"/>
         </w:numPr>
         <w:spacing w:after="240" w:before="0" w:line="276" w:lineRule="auto"/>
         <w:ind w:left="720" w:hanging="360"/>
         <w:rPr>
           <w:rFonts w:ascii="Arial" w:cs="Arial" w:eastAsia="Arial" w:hAnsi="Arial"/>
-        </w:rPr>
-      </w:pPr>
-      <w:r>
-        <w:rPr>
-          <w:rFonts w:ascii="Arial" w:cs="Arial" w:eastAsia="Arial" w:hAnsi="Arial"/>
+          <w:strike w:val="1"/>
+        </w:rPr>
+      </w:pPr>
+      <w:r>
+        <w:rPr>
+          <w:rFonts w:ascii="Arial" w:cs="Arial" w:eastAsia="Arial" w:hAnsi="Arial"/>
+          <w:strike w:val="1"/>
           <w:rtl w:val="0"/>
         </w:rPr>
         <w:t xml:space="preserve">Prepare IRB closure documents if applicable.</w:t>
@@ -3486,12 +3805,16 @@
         <w:rPr>
           <w:rFonts w:ascii="Arial" w:cs="Arial" w:eastAsia="Arial" w:hAnsi="Arial"/>
           <w:b w:val="1"/>
+          <w:bCs w:val="1"/>
+          <w:strike w:val="1"/>
         </w:rPr>
       </w:pPr>
       <w:r>
         <w:rPr>
           <w:rFonts w:ascii="Arial" w:cs="Arial" w:eastAsia="Arial" w:hAnsi="Arial"/>
           <w:b w:val="1"/>
+          <w:bCs w:val="1"/>
+          <w:strike w:val="1"/>
           <w:rtl w:val="0"/>
         </w:rPr>
         <w:t xml:space="preserve">Milestones</w:t>
@@ -3501,17 +3824,19 @@
       <w:pPr>
         <w:numPr>
           <w:ilvl w:val="0"/>
-          <w:numId w:val="11"/>
+          <w:numId w:val="3"/>
         </w:numPr>
         <w:spacing w:after="0" w:before="240" w:line="276" w:lineRule="auto"/>
         <w:ind w:left="720" w:hanging="360"/>
         <w:rPr>
           <w:rFonts w:ascii="Arial" w:cs="Arial" w:eastAsia="Arial" w:hAnsi="Arial"/>
-        </w:rPr>
-      </w:pPr>
-      <w:r>
-        <w:rPr>
-          <w:rFonts w:ascii="Arial" w:cs="Arial" w:eastAsia="Arial" w:hAnsi="Arial"/>
+          <w:strike w:val="1"/>
+        </w:rPr>
+      </w:pPr>
+      <w:r>
+        <w:rPr>
+          <w:rFonts w:ascii="Arial" w:cs="Arial" w:eastAsia="Arial" w:hAnsi="Arial"/>
+          <w:strike w:val="1"/>
           <w:rtl w:val="0"/>
         </w:rPr>
         <w:t xml:space="preserve">Committee sign-off on the near-final dissertation.</w:t>
@@ -3521,7 +3846,7 @@
       <w:pPr>
         <w:numPr>
           <w:ilvl w:val="0"/>
-          <w:numId w:val="11"/>
+          <w:numId w:val="3"/>
         </w:numPr>
         <w:spacing w:after="240" w:before="0" w:line="276" w:lineRule="auto"/>
         <w:ind w:left="720" w:hanging="360"/>
@@ -3532,9 +3857,17 @@
       <w:r>
         <w:rPr>
           <w:rFonts w:ascii="Arial" w:cs="Arial" w:eastAsia="Arial" w:hAnsi="Arial"/>
-          <w:rtl w:val="0"/>
-        </w:rPr>
-        <w:t xml:space="preserve">Approval to schedule the final defense.</w:t>
+          <w:strike w:val="1"/>
+          <w:rtl w:val="0"/>
+        </w:rPr>
+        <w:t xml:space="preserve">Approval to schedule the final defens</w:t>
+      </w:r>
+      <w:r>
+        <w:rPr>
+          <w:rFonts w:ascii="Arial" w:cs="Arial" w:eastAsia="Arial" w:hAnsi="Arial"/>
+          <w:rtl w:val="0"/>
+        </w:rPr>
+        <w:t xml:space="preserve">e.</w:t>
       </w:r>
     </w:p>
     <w:p>
@@ -3569,7 +3902,7 @@
           <w:szCs w:val="26"/>
         </w:rPr>
       </w:pPr>
-      <w:bookmarkStart w:colFirst="0" w:colLast="0" w:name="_kjgvmhybket0" w:id="20"/>
+      <w:bookmarkStart w:colFirst="0" w:colLast="0" w:name="_bdxwcektb9ct" w:id="20"/>
       <w:bookmarkEnd w:id="20"/>
       <w:r>
         <w:rPr>
@@ -3587,12 +3920,14 @@
         <w:rPr>
           <w:rFonts w:ascii="Arial" w:cs="Arial" w:eastAsia="Arial" w:hAnsi="Arial"/>
           <w:b w:val="1"/>
+          <w:bCs w:val="1"/>
         </w:rPr>
       </w:pPr>
       <w:r>
         <w:rPr>
           <w:rFonts w:ascii="Arial" w:cs="Arial" w:eastAsia="Arial" w:hAnsi="Arial"/>
           <w:b w:val="1"/>
+          <w:bCs w:val="1"/>
           <w:rtl w:val="0"/>
         </w:rPr>
         <w:t xml:space="preserve">Tasks</w:t>
@@ -3602,7 +3937,7 @@
       <w:pPr>
         <w:numPr>
           <w:ilvl w:val="0"/>
-          <w:numId w:val="28"/>
+          <w:numId w:val="21"/>
         </w:numPr>
         <w:spacing w:after="0" w:before="240" w:line="276" w:lineRule="auto"/>
         <w:ind w:left="720" w:hanging="360"/>
@@ -3622,7 +3957,7 @@
       <w:pPr>
         <w:numPr>
           <w:ilvl w:val="0"/>
-          <w:numId w:val="28"/>
+          <w:numId w:val="21"/>
         </w:numPr>
         <w:spacing w:after="0" w:before="0" w:line="276" w:lineRule="auto"/>
         <w:ind w:left="720" w:hanging="360"/>
@@ -3642,7 +3977,7 @@
       <w:pPr>
         <w:numPr>
           <w:ilvl w:val="0"/>
-          <w:numId w:val="28"/>
+          <w:numId w:val="21"/>
         </w:numPr>
         <w:spacing w:after="0" w:before="0" w:line="276" w:lineRule="auto"/>
         <w:ind w:left="720" w:hanging="360"/>
@@ -3662,7 +3997,7 @@
       <w:pPr>
         <w:numPr>
           <w:ilvl w:val="0"/>
-          <w:numId w:val="28"/>
+          <w:numId w:val="21"/>
         </w:numPr>
         <w:spacing w:after="240" w:before="0" w:line="276" w:lineRule="auto"/>
         <w:ind w:left="720" w:hanging="360"/>
@@ -3684,12 +4019,14 @@
         <w:rPr>
           <w:rFonts w:ascii="Arial" w:cs="Arial" w:eastAsia="Arial" w:hAnsi="Arial"/>
           <w:b w:val="1"/>
+          <w:bCs w:val="1"/>
         </w:rPr>
       </w:pPr>
       <w:r>
         <w:rPr>
           <w:rFonts w:ascii="Arial" w:cs="Arial" w:eastAsia="Arial" w:hAnsi="Arial"/>
           <w:b w:val="1"/>
+          <w:bCs w:val="1"/>
           <w:rtl w:val="0"/>
         </w:rPr>
         <w:t xml:space="preserve">Milestones</w:t>
@@ -3699,7 +4036,7 @@
       <w:pPr>
         <w:numPr>
           <w:ilvl w:val="0"/>
-          <w:numId w:val="17"/>
+          <w:numId w:val="9"/>
         </w:numPr>
         <w:spacing w:after="0" w:before="240" w:line="276" w:lineRule="auto"/>
         <w:ind w:left="720" w:hanging="360"/>
@@ -3719,7 +4056,7 @@
       <w:pPr>
         <w:numPr>
           <w:ilvl w:val="0"/>
-          <w:numId w:val="17"/>
+          <w:numId w:val="9"/>
         </w:numPr>
         <w:spacing w:after="240" w:before="0" w:line="276" w:lineRule="auto"/>
         <w:ind w:left="720" w:hanging="360"/>
@@ -3768,7 +4105,7 @@
           <w:szCs w:val="34"/>
         </w:rPr>
       </w:pPr>
-      <w:bookmarkStart w:colFirst="0" w:colLast="0" w:name="_78pfttaj8mu7" w:id="21"/>
+      <w:bookmarkStart w:colFirst="0" w:colLast="0" w:name="_2f6sfanz808o" w:id="21"/>
       <w:bookmarkEnd w:id="21"/>
       <w:r>
         <w:rPr>
@@ -3784,7 +4121,7 @@
       <w:pPr>
         <w:numPr>
           <w:ilvl w:val="0"/>
-          <w:numId w:val="14"/>
+          <w:numId w:val="6"/>
         </w:numPr>
         <w:spacing w:after="0" w:before="240" w:line="276" w:lineRule="auto"/>
         <w:ind w:left="720" w:hanging="360"/>
@@ -3796,6 +4133,7 @@
         <w:rPr>
           <w:rFonts w:ascii="Arial" w:cs="Arial" w:eastAsia="Arial" w:hAnsi="Arial"/>
           <w:b w:val="1"/>
+          <w:bCs w:val="1"/>
           <w:rtl w:val="0"/>
         </w:rPr>
         <w:t xml:space="preserve">Weekly or Bi-Weekly Check-Ins</w:t>
@@ -3813,7 +4151,7 @@
       <w:pPr>
         <w:numPr>
           <w:ilvl w:val="0"/>
-          <w:numId w:val="14"/>
+          <w:numId w:val="6"/>
         </w:numPr>
         <w:spacing w:after="0" w:before="0" w:line="276" w:lineRule="auto"/>
         <w:ind w:left="720" w:hanging="360"/>
@@ -3825,6 +4163,7 @@
         <w:rPr>
           <w:rFonts w:ascii="Arial" w:cs="Arial" w:eastAsia="Arial" w:hAnsi="Arial"/>
           <w:b w:val="1"/>
+          <w:bCs w:val="1"/>
           <w:rtl w:val="0"/>
         </w:rPr>
         <w:t xml:space="preserve">Reference Management</w:t>
@@ -3842,7 +4181,7 @@
       <w:pPr>
         <w:numPr>
           <w:ilvl w:val="0"/>
-          <w:numId w:val="14"/>
+          <w:numId w:val="6"/>
         </w:numPr>
         <w:spacing w:after="0" w:before="0" w:line="276" w:lineRule="auto"/>
         <w:ind w:left="720" w:hanging="360"/>
@@ -3854,6 +4193,7 @@
         <w:rPr>
           <w:rFonts w:ascii="Arial" w:cs="Arial" w:eastAsia="Arial" w:hAnsi="Arial"/>
           <w:b w:val="1"/>
+          <w:bCs w:val="1"/>
           <w:rtl w:val="0"/>
         </w:rPr>
         <w:t xml:space="preserve">Ongoing Literature Review</w:t>
@@ -3871,7 +4211,7 @@
       <w:pPr>
         <w:numPr>
           <w:ilvl w:val="0"/>
-          <w:numId w:val="14"/>
+          <w:numId w:val="6"/>
         </w:numPr>
         <w:spacing w:after="0" w:before="0" w:line="276" w:lineRule="auto"/>
         <w:ind w:left="720" w:hanging="360"/>
@@ -3883,6 +4223,7 @@
         <w:rPr>
           <w:rFonts w:ascii="Arial" w:cs="Arial" w:eastAsia="Arial" w:hAnsi="Arial"/>
           <w:b w:val="1"/>
+          <w:bCs w:val="1"/>
           <w:rtl w:val="0"/>
         </w:rPr>
         <w:t xml:space="preserve">Document Iteration</w:t>
@@ -3900,7 +4241,7 @@
       <w:pPr>
         <w:numPr>
           <w:ilvl w:val="0"/>
-          <w:numId w:val="14"/>
+          <w:numId w:val="6"/>
         </w:numPr>
         <w:spacing w:after="240" w:before="0" w:line="276" w:lineRule="auto"/>
         <w:ind w:left="720" w:hanging="360"/>
@@ -3912,6 +4253,7 @@
         <w:rPr>
           <w:rFonts w:ascii="Arial" w:cs="Arial" w:eastAsia="Arial" w:hAnsi="Arial"/>
           <w:b w:val="1"/>
+          <w:bCs w:val="1"/>
           <w:rtl w:val="0"/>
         </w:rPr>
         <w:t xml:space="preserve">Backup and Version Control</w:t>
@@ -3963,12 +4305,12 @@
             <wp:anchor allowOverlap="1" behindDoc="0" distB="0" distT="0" distL="114300" distR="114300" hidden="0" layoutInCell="1" locked="0" relativeHeight="0" simplePos="0">
               <wp:simplePos x="0" y="0"/>
               <wp:positionH relativeFrom="column">
-                <wp:posOffset>-647698</wp:posOffset>
+                <wp:posOffset>-660397</wp:posOffset>
               </wp:positionH>
               <wp:positionV relativeFrom="paragraph">
-                <wp:posOffset>101600</wp:posOffset>
+                <wp:posOffset>88900</wp:posOffset>
               </wp:positionV>
-              <wp:extent cx="8172674" cy="76200"/>
+              <wp:extent cx="8198074" cy="101600"/>
               <wp:effectExtent b="0" l="0" r="0" t="0"/>
               <wp:wrapNone/>
               <wp:docPr id="1" name=""/>
@@ -4009,12 +4351,12 @@
             <wp:anchor allowOverlap="1" behindDoc="0" distB="0" distT="0" distL="114300" distR="114300" hidden="0" layoutInCell="1" locked="0" relativeHeight="0" simplePos="0">
               <wp:simplePos x="0" y="0"/>
               <wp:positionH relativeFrom="column">
-                <wp:posOffset>-647698</wp:posOffset>
+                <wp:posOffset>-660397</wp:posOffset>
               </wp:positionH>
               <wp:positionV relativeFrom="paragraph">
-                <wp:posOffset>101600</wp:posOffset>
+                <wp:posOffset>88900</wp:posOffset>
               </wp:positionV>
-              <wp:extent cx="8172674" cy="76200"/>
+              <wp:extent cx="8198074" cy="101600"/>
               <wp:effectExtent b="0" l="0" r="0" t="0"/>
               <wp:wrapNone/>
               <wp:docPr id="1" name="image2.png"/>
@@ -4035,7 +4377,7 @@
                     <pic:spPr>
                       <a:xfrm>
                         <a:off x="0" y="0"/>
-                        <a:ext cx="8172674" cy="76200"/>
+                        <a:ext cx="8198074" cy="101600"/>
                       </a:xfrm>
                       <a:prstGeom prst="rect"/>
                       <a:ln/>
@@ -4062,6 +4404,7 @@
       <w:rPr>
         <w:rFonts w:ascii="Roboto Light" w:cs="Roboto Light" w:eastAsia="Roboto Light" w:hAnsi="Roboto Light"/>
         <w:b w:val="1"/>
+        <w:bCs w:val="1"/>
         <w:sz w:val="24"/>
         <w:szCs w:val="24"/>
         <w:rtl w:val="0"/>
@@ -4081,6 +4424,7 @@
       <w:rPr>
         <w:rFonts w:ascii="Roboto Light" w:cs="Roboto Light" w:eastAsia="Roboto Light" w:hAnsi="Roboto Light"/>
         <w:b w:val="1"/>
+        <w:bCs w:val="1"/>
         <w:sz w:val="24"/>
         <w:szCs w:val="24"/>
         <w:rtl w:val="0"/>
@@ -4100,6 +4444,7 @@
       <w:rPr>
         <w:rFonts w:ascii="Roboto Light" w:cs="Roboto Light" w:eastAsia="Roboto Light" w:hAnsi="Roboto Light"/>
         <w:b w:val="1"/>
+        <w:bCs w:val="1"/>
         <w:color w:val="000000"/>
         <w:sz w:val="24"/>
         <w:szCs w:val="24"/>
@@ -4142,7 +4487,9 @@
       <w:rPr>
         <w:rFonts w:ascii="Calibri" w:cs="Calibri" w:eastAsia="Calibri" w:hAnsi="Calibri"/>
         <w:b w:val="0"/>
+        <w:bCs w:val="0"/>
         <w:i w:val="0"/>
+        <w:iCs w:val="0"/>
         <w:smallCaps w:val="0"/>
         <w:strike w:val="0"/>
         <w:color w:val="000000"/>
@@ -4187,7 +4534,9 @@
       <w:rPr>
         <w:rFonts w:ascii="Calibri" w:cs="Calibri" w:eastAsia="Calibri" w:hAnsi="Calibri"/>
         <w:b w:val="0"/>
+        <w:bCs w:val="0"/>
         <w:i w:val="0"/>
+        <w:iCs w:val="0"/>
         <w:smallCaps w:val="0"/>
         <w:strike w:val="0"/>
         <w:color w:val="000000"/>
@@ -4232,7 +4581,9 @@
       <w:rPr>
         <w:rFonts w:ascii="Calibri" w:cs="Calibri" w:eastAsia="Calibri" w:hAnsi="Calibri"/>
         <w:b w:val="0"/>
+        <w:bCs w:val="0"/>
         <w:i w:val="0"/>
+        <w:iCs w:val="0"/>
         <w:smallCaps w:val="0"/>
         <w:strike w:val="0"/>
         <w:color w:val="000000"/>
@@ -4253,10 +4604,10 @@
         <wp:anchor allowOverlap="1" behindDoc="0" distB="0" distT="0" distL="114300" distR="114300" hidden="0" layoutInCell="1" locked="0" relativeHeight="0" simplePos="0">
           <wp:simplePos x="0" y="0"/>
           <wp:positionH relativeFrom="column">
-            <wp:posOffset>-467357</wp:posOffset>
+            <wp:posOffset>-467356</wp:posOffset>
           </wp:positionH>
           <wp:positionV relativeFrom="paragraph">
-            <wp:posOffset>-457196</wp:posOffset>
+            <wp:posOffset>-457195</wp:posOffset>
           </wp:positionV>
           <wp:extent cx="6858000" cy="1043940"/>
           <wp:effectExtent b="0" l="0" r="0" t="0"/>
@@ -4319,7 +4670,9 @@
       <w:rPr>
         <w:rFonts w:ascii="Calibri" w:cs="Calibri" w:eastAsia="Calibri" w:hAnsi="Calibri"/>
         <w:b w:val="0"/>
+        <w:bCs w:val="0"/>
         <w:i w:val="0"/>
+        <w:iCs w:val="0"/>
         <w:smallCaps w:val="0"/>
         <w:strike w:val="0"/>
         <w:color w:val="000000"/>
@@ -4364,7 +4717,9 @@
       <w:rPr>
         <w:rFonts w:ascii="Calibri" w:cs="Calibri" w:eastAsia="Calibri" w:hAnsi="Calibri"/>
         <w:b w:val="0"/>
+        <w:bCs w:val="0"/>
         <w:i w:val="0"/>
+        <w:iCs w:val="0"/>
         <w:smallCaps w:val="0"/>
         <w:strike w:val="0"/>
         <w:color w:val="000000"/>
@@ -8726,6 +9081,7 @@
     </w:pPr>
     <w:rPr>
       <w:b w:val="1"/>
+      <w:bCs w:val="1"/>
       <w:sz w:val="48"/>
       <w:szCs w:val="48"/>
     </w:rPr>
@@ -8742,6 +9098,7 @@
     </w:pPr>
     <w:rPr>
       <w:b w:val="1"/>
+      <w:bCs w:val="1"/>
       <w:sz w:val="36"/>
       <w:szCs w:val="36"/>
     </w:rPr>
@@ -8758,6 +9115,7 @@
     </w:pPr>
     <w:rPr>
       <w:b w:val="1"/>
+      <w:bCs w:val="1"/>
       <w:sz w:val="28"/>
       <w:szCs w:val="28"/>
     </w:rPr>
@@ -8774,6 +9132,7 @@
     </w:pPr>
     <w:rPr>
       <w:b w:val="1"/>
+      <w:bCs w:val="1"/>
       <w:sz w:val="24"/>
       <w:szCs w:val="24"/>
     </w:rPr>
@@ -8790,6 +9149,7 @@
     </w:pPr>
     <w:rPr>
       <w:b w:val="1"/>
+      <w:bCs w:val="1"/>
       <w:sz w:val="22"/>
       <w:szCs w:val="22"/>
     </w:rPr>
@@ -8806,6 +9166,7 @@
     </w:pPr>
     <w:rPr>
       <w:b w:val="1"/>
+      <w:bCs w:val="1"/>
       <w:sz w:val="20"/>
       <w:szCs w:val="20"/>
     </w:rPr>
@@ -8822,6 +9183,7 @@
     </w:pPr>
     <w:rPr>
       <w:b w:val="1"/>
+      <w:bCs w:val="1"/>
       <w:sz w:val="72"/>
       <w:szCs w:val="72"/>
     </w:rPr>
@@ -8839,6 +9201,7 @@
     <w:rPr>
       <w:rFonts w:ascii="Georgia" w:cs="Georgia" w:eastAsia="Georgia" w:hAnsi="Georgia"/>
       <w:i w:val="1"/>
+      <w:iCs w:val="1"/>
       <w:color w:val="666666"/>
       <w:sz w:val="48"/>
       <w:szCs w:val="48"/>

</xml_diff>